<commit_message>
CP0529-400 Added Base table with 3 extra fields to add blue and themable fields.
</commit_message>
<xml_diff>
--- a/src/Layers/W1/BaseApp/Sales/History/StandardSalesReturnRcptBody.docx
+++ b/src/Layers/W1/BaseApp/Sales/History/StandardSalesReturnRcptBody.docx
@@ -7,12 +7,12 @@
         <w:tblStyle w:val="TableGrid"/>
         <w:tblW w:w="4995" w:type="pct"/>
         <w:tblBorders>
-          <w:top w:val="none" w:color="auto" w:sz="0" w:space="0"/>
-          <w:left w:val="none" w:color="auto" w:sz="0" w:space="0"/>
-          <w:bottom w:val="none" w:color="auto" w:sz="0" w:space="0"/>
-          <w:right w:val="none" w:color="auto" w:sz="0" w:space="0"/>
-          <w:insideH w:val="none" w:color="auto" w:sz="0" w:space="0"/>
-          <w:insideV w:val="none" w:color="auto" w:sz="0" w:space="0"/>
+          <w:top w:val="none" w:sz="0" w:space="0" w:color="auto"/>
+          <w:left w:val="none" w:sz="0" w:space="0" w:color="auto"/>
+          <w:bottom w:val="none" w:sz="0" w:space="0" w:color="auto"/>
+          <w:right w:val="none" w:sz="0" w:space="0" w:color="auto"/>
+          <w:insideH w:val="none" w:sz="0" w:space="0" w:color="auto"/>
+          <w:insideV w:val="none" w:sz="0" w:space="0" w:color="auto"/>
         </w:tblBorders>
         <w:tblCellMar>
           <w:left w:w="0" w:type="dxa"/>
@@ -47,9 +47,9 @@
             <w:placeholder>
               <w:docPart w:val="A5CCA9EA280943A7AF98D93CAA336D88"/>
             </w:placeholder>
+            <w:dataBinding w:prefixMappings="xmlns:ns0='urn:microsoft-dynamics-nav/reports/Standard_Sales_Return_Rcpt/1309/'" w:xpath="/ns0:NavWordReportXmlPart[1]/ns0:Header[1]/ns0:CustomerAddress1[1]" w:storeItemID="{ED582AB7-D2FD-40DB-AA33-A9E5E0B8B111}"/>
             <w15:color w:val="808080"/>
             <w:text/>
-            <w:dataBinding w:prefixMappings="xmlns:ns0='urn:microsoft-dynamics-nav/reports/Standard_Sales_Return_Rcpt/1309/'" w:xpath="/ns0:NavWordReportXmlPart[1]/ns0:Header[1]/ns0:CustomerAddress1[1]"/>
           </w:sdtPr>
           <w:sdtContent>
             <w:tc>
@@ -119,9 +119,9 @@
             <w:placeholder>
               <w:docPart w:val="B05F60C5123A4A8D87FB9F7471EE543C"/>
             </w:placeholder>
+            <w:dataBinding w:prefixMappings="xmlns:ns0='urn:microsoft-dynamics-nav/reports/Standard_Sales_Return_Rcpt/1309/'" w:xpath="/ns0:NavWordReportXmlPart[1]/ns0:Header[1]/ns0:CompanyAddress1[1]" w:storeItemID="{ED582AB7-D2FD-40DB-AA33-A9E5E0B8B111}"/>
             <w15:color w:val="808080"/>
             <w:text/>
-            <w:dataBinding w:prefixMappings="xmlns:ns0='urn:microsoft-dynamics-nav/reports/Standard_Sales_Return_Rcpt/1309/'" w:xpath="/ns0:NavWordReportXmlPart[1]/ns0:Header[1]/ns0:CompanyAddress1[1]"/>
           </w:sdtPr>
           <w:sdtContent>
             <w:tc>
@@ -177,9 +177,9 @@
             <w:placeholder>
               <w:docPart w:val="A5CCA9EA280943A7AF98D93CAA336D88"/>
             </w:placeholder>
+            <w:dataBinding w:prefixMappings="xmlns:ns0='urn:microsoft-dynamics-nav/reports/Standard_Sales_Return_Rcpt/1309/'" w:xpath="/ns0:NavWordReportXmlPart[1]/ns0:Header[1]/ns0:CustomerAddress2[1]" w:storeItemID="{ED582AB7-D2FD-40DB-AA33-A9E5E0B8B111}"/>
             <w15:color w:val="808080"/>
             <w:text/>
-            <w:dataBinding w:prefixMappings="xmlns:ns0='urn:microsoft-dynamics-nav/reports/Standard_Sales_Return_Rcpt/1309/'" w:xpath="/ns0:NavWordReportXmlPart[1]/ns0:Header[1]/ns0:CustomerAddress2[1]"/>
           </w:sdtPr>
           <w:sdtContent>
             <w:tc>
@@ -189,14 +189,14 @@
               <w:p>
                 <w:pPr>
                   <w:rPr>
-                    <w:rFonts w:cs="Segoe UI Semibold" w:asciiTheme="minorHAnsi" w:hAnsiTheme="minorHAnsi"/>
+                    <w:rFonts w:asciiTheme="minorHAnsi" w:hAnsiTheme="minorHAnsi" w:cs="Segoe UI Semibold"/>
                     <w:sz w:val="22"/>
                     <w:szCs w:val="22"/>
                   </w:rPr>
                 </w:pPr>
                 <w:r>
                   <w:rPr>
-                    <w:rFonts w:cs="Segoe UI Semibold" w:asciiTheme="minorHAnsi" w:hAnsiTheme="minorHAnsi"/>
+                    <w:rFonts w:asciiTheme="minorHAnsi" w:hAnsiTheme="minorHAnsi" w:cs="Segoe UI Semibold"/>
                     <w:sz w:val="22"/>
                     <w:szCs w:val="22"/>
                   </w:rPr>
@@ -213,7 +213,7 @@
           <w:p>
             <w:pPr>
               <w:rPr>
-                <w:rFonts w:cs="Segoe UI Semibold" w:asciiTheme="minorHAnsi" w:hAnsiTheme="minorHAnsi"/>
+                <w:rFonts w:asciiTheme="minorHAnsi" w:hAnsiTheme="minorHAnsi" w:cs="Segoe UI Semibold"/>
                 <w:sz w:val="22"/>
                 <w:szCs w:val="22"/>
               </w:rPr>
@@ -233,9 +233,9 @@
             <w:placeholder>
               <w:docPart w:val="5491E74068B446CA912FE990CF1DC93A"/>
             </w:placeholder>
+            <w:dataBinding w:prefixMappings="xmlns:ns0='urn:microsoft-dynamics-nav/reports/Standard_Sales_Return_Rcpt/1309/'" w:xpath="/ns0:NavWordReportXmlPart[1]/ns0:Header[1]/ns0:CompanyAddress2[1]" w:storeItemID="{ED582AB7-D2FD-40DB-AA33-A9E5E0B8B111}"/>
             <w15:color w:val="808080"/>
             <w:text/>
-            <w:dataBinding w:prefixMappings="xmlns:ns0='urn:microsoft-dynamics-nav/reports/Standard_Sales_Return_Rcpt/1309/'" w:xpath="/ns0:NavWordReportXmlPart[1]/ns0:Header[1]/ns0:CompanyAddress2[1]"/>
           </w:sdtPr>
           <w:sdtContent>
             <w:tc>
@@ -253,7 +253,7 @@
                 </w:pPr>
                 <w:r>
                   <w:rPr>
-                    <w:rFonts w:cs="Segoe UI Semibold" w:asciiTheme="minorHAnsi" w:hAnsiTheme="minorHAnsi"/>
+                    <w:rFonts w:asciiTheme="minorHAnsi" w:hAnsiTheme="minorHAnsi" w:cs="Segoe UI Semibold"/>
                     <w:sz w:val="22"/>
                     <w:szCs w:val="22"/>
                   </w:rPr>
@@ -281,9 +281,9 @@
             <w:placeholder>
               <w:docPart w:val="A5CCA9EA280943A7AF98D93CAA336D88"/>
             </w:placeholder>
+            <w:dataBinding w:prefixMappings="xmlns:ns0='urn:microsoft-dynamics-nav/reports/Standard_Sales_Return_Rcpt/1309/'" w:xpath="/ns0:NavWordReportXmlPart[1]/ns0:Header[1]/ns0:CustomerAddress3[1]" w:storeItemID="{ED582AB7-D2FD-40DB-AA33-A9E5E0B8B111}"/>
             <w15:color w:val="808080"/>
             <w:text/>
-            <w:dataBinding w:prefixMappings="xmlns:ns0='urn:microsoft-dynamics-nav/reports/Standard_Sales_Return_Rcpt/1309/'" w:xpath="/ns0:NavWordReportXmlPart[1]/ns0:Header[1]/ns0:CustomerAddress3[1]"/>
           </w:sdtPr>
           <w:sdtContent>
             <w:tc>
@@ -293,14 +293,14 @@
               <w:p>
                 <w:pPr>
                   <w:rPr>
-                    <w:rFonts w:cs="Segoe UI Semibold" w:asciiTheme="minorHAnsi" w:hAnsiTheme="minorHAnsi"/>
+                    <w:rFonts w:asciiTheme="minorHAnsi" w:hAnsiTheme="minorHAnsi" w:cs="Segoe UI Semibold"/>
                     <w:sz w:val="22"/>
                     <w:szCs w:val="22"/>
                   </w:rPr>
                 </w:pPr>
                 <w:r>
                   <w:rPr>
-                    <w:rFonts w:cs="Segoe UI Semibold" w:asciiTheme="minorHAnsi" w:hAnsiTheme="minorHAnsi"/>
+                    <w:rFonts w:asciiTheme="minorHAnsi" w:hAnsiTheme="minorHAnsi" w:cs="Segoe UI Semibold"/>
                     <w:sz w:val="22"/>
                     <w:szCs w:val="22"/>
                   </w:rPr>
@@ -317,7 +317,7 @@
           <w:p>
             <w:pPr>
               <w:rPr>
-                <w:rFonts w:cs="Segoe UI Semibold" w:asciiTheme="minorHAnsi" w:hAnsiTheme="minorHAnsi"/>
+                <w:rFonts w:asciiTheme="minorHAnsi" w:hAnsiTheme="minorHAnsi" w:cs="Segoe UI Semibold"/>
                 <w:sz w:val="22"/>
                 <w:szCs w:val="22"/>
               </w:rPr>
@@ -337,9 +337,9 @@
             <w:placeholder>
               <w:docPart w:val="1537B1D575B14366B0122D833F6B3436"/>
             </w:placeholder>
+            <w:dataBinding w:prefixMappings="xmlns:ns0='urn:microsoft-dynamics-nav/reports/Standard_Sales_Return_Rcpt/1309/'" w:xpath="/ns0:NavWordReportXmlPart[1]/ns0:Header[1]/ns0:CompanyAddress3[1]" w:storeItemID="{ED582AB7-D2FD-40DB-AA33-A9E5E0B8B111}"/>
             <w15:color w:val="808080"/>
             <w:text/>
-            <w:dataBinding w:prefixMappings="xmlns:ns0='urn:microsoft-dynamics-nav/reports/Standard_Sales_Return_Rcpt/1309/'" w:xpath="/ns0:NavWordReportXmlPart[1]/ns0:Header[1]/ns0:CompanyAddress3[1]"/>
           </w:sdtPr>
           <w:sdtContent>
             <w:tc>
@@ -356,7 +356,7 @@
                 </w:pPr>
                 <w:r>
                   <w:rPr>
-                    <w:rFonts w:cs="Segoe UI Semibold" w:asciiTheme="minorHAnsi" w:hAnsiTheme="minorHAnsi"/>
+                    <w:rFonts w:asciiTheme="minorHAnsi" w:hAnsiTheme="minorHAnsi" w:cs="Segoe UI Semibold"/>
                     <w:sz w:val="22"/>
                     <w:szCs w:val="22"/>
                   </w:rPr>
@@ -384,9 +384,9 @@
             <w:placeholder>
               <w:docPart w:val="A5CCA9EA280943A7AF98D93CAA336D88"/>
             </w:placeholder>
+            <w:dataBinding w:prefixMappings="xmlns:ns0='urn:microsoft-dynamics-nav/reports/Standard_Sales_Return_Rcpt/1309/'" w:xpath="/ns0:NavWordReportXmlPart[1]/ns0:Header[1]/ns0:CustomerAddress4[1]" w:storeItemID="{ED582AB7-D2FD-40DB-AA33-A9E5E0B8B111}"/>
             <w15:color w:val="808080"/>
             <w:text/>
-            <w:dataBinding w:prefixMappings="xmlns:ns0='urn:microsoft-dynamics-nav/reports/Standard_Sales_Return_Rcpt/1309/'" w:xpath="/ns0:NavWordReportXmlPart[1]/ns0:Header[1]/ns0:CustomerAddress4[1]"/>
           </w:sdtPr>
           <w:sdtContent>
             <w:tc>
@@ -396,14 +396,14 @@
               <w:p>
                 <w:pPr>
                   <w:rPr>
-                    <w:rFonts w:cs="Segoe UI Semibold" w:asciiTheme="minorHAnsi" w:hAnsiTheme="minorHAnsi"/>
+                    <w:rFonts w:asciiTheme="minorHAnsi" w:hAnsiTheme="minorHAnsi" w:cs="Segoe UI Semibold"/>
                     <w:sz w:val="22"/>
                     <w:szCs w:val="22"/>
                   </w:rPr>
                 </w:pPr>
                 <w:r>
                   <w:rPr>
-                    <w:rFonts w:cs="Segoe UI Semibold" w:asciiTheme="minorHAnsi" w:hAnsiTheme="minorHAnsi"/>
+                    <w:rFonts w:asciiTheme="minorHAnsi" w:hAnsiTheme="minorHAnsi" w:cs="Segoe UI Semibold"/>
                     <w:sz w:val="22"/>
                     <w:szCs w:val="22"/>
                   </w:rPr>
@@ -420,7 +420,7 @@
           <w:p>
             <w:pPr>
               <w:rPr>
-                <w:rFonts w:cs="Segoe UI Semibold" w:asciiTheme="minorHAnsi" w:hAnsiTheme="minorHAnsi"/>
+                <w:rFonts w:asciiTheme="minorHAnsi" w:hAnsiTheme="minorHAnsi" w:cs="Segoe UI Semibold"/>
                 <w:sz w:val="22"/>
                 <w:szCs w:val="22"/>
               </w:rPr>
@@ -440,9 +440,9 @@
             <w:placeholder>
               <w:docPart w:val="E734C9F76FDD44528AAE4D8911A1DEC3"/>
             </w:placeholder>
+            <w:dataBinding w:prefixMappings="xmlns:ns0='urn:microsoft-dynamics-nav/reports/Standard_Sales_Return_Rcpt/1309/'" w:xpath="/ns0:NavWordReportXmlPart[1]/ns0:Header[1]/ns0:CompanyAddress4[1]" w:storeItemID="{ED582AB7-D2FD-40DB-AA33-A9E5E0B8B111}"/>
             <w15:color w:val="808080"/>
             <w:text/>
-            <w:dataBinding w:prefixMappings="xmlns:ns0='urn:microsoft-dynamics-nav/reports/Standard_Sales_Return_Rcpt/1309/'" w:xpath="/ns0:NavWordReportXmlPart[1]/ns0:Header[1]/ns0:CompanyAddress4[1]"/>
           </w:sdtPr>
           <w:sdtContent>
             <w:tc>
@@ -459,7 +459,7 @@
                 </w:pPr>
                 <w:r>
                   <w:rPr>
-                    <w:rFonts w:cs="Segoe UI Semibold" w:asciiTheme="minorHAnsi" w:hAnsiTheme="minorHAnsi"/>
+                    <w:rFonts w:asciiTheme="minorHAnsi" w:hAnsiTheme="minorHAnsi" w:cs="Segoe UI Semibold"/>
                     <w:sz w:val="22"/>
                     <w:szCs w:val="22"/>
                   </w:rPr>
@@ -487,9 +487,9 @@
             <w:placeholder>
               <w:docPart w:val="A5CCA9EA280943A7AF98D93CAA336D88"/>
             </w:placeholder>
+            <w:dataBinding w:prefixMappings="xmlns:ns0='urn:microsoft-dynamics-nav/reports/Standard_Sales_Return_Rcpt/1309/'" w:xpath="/ns0:NavWordReportXmlPart[1]/ns0:Header[1]/ns0:CustomerAddress5[1]" w:storeItemID="{ED582AB7-D2FD-40DB-AA33-A9E5E0B8B111}"/>
             <w15:color w:val="808080"/>
             <w:text/>
-            <w:dataBinding w:prefixMappings="xmlns:ns0='urn:microsoft-dynamics-nav/reports/Standard_Sales_Return_Rcpt/1309/'" w:xpath="/ns0:NavWordReportXmlPart[1]/ns0:Header[1]/ns0:CustomerAddress5[1]"/>
           </w:sdtPr>
           <w:sdtContent>
             <w:tc>
@@ -499,14 +499,14 @@
               <w:p>
                 <w:pPr>
                   <w:rPr>
-                    <w:rFonts w:cs="Segoe UI Semibold" w:asciiTheme="minorHAnsi" w:hAnsiTheme="minorHAnsi"/>
+                    <w:rFonts w:asciiTheme="minorHAnsi" w:hAnsiTheme="minorHAnsi" w:cs="Segoe UI Semibold"/>
                     <w:sz w:val="22"/>
                     <w:szCs w:val="22"/>
                   </w:rPr>
                 </w:pPr>
                 <w:r>
                   <w:rPr>
-                    <w:rFonts w:cs="Segoe UI Semibold" w:asciiTheme="minorHAnsi" w:hAnsiTheme="minorHAnsi"/>
+                    <w:rFonts w:asciiTheme="minorHAnsi" w:hAnsiTheme="minorHAnsi" w:cs="Segoe UI Semibold"/>
                     <w:sz w:val="22"/>
                     <w:szCs w:val="22"/>
                   </w:rPr>
@@ -523,7 +523,7 @@
           <w:p>
             <w:pPr>
               <w:rPr>
-                <w:rFonts w:cs="Segoe UI Semibold" w:asciiTheme="minorHAnsi" w:hAnsiTheme="minorHAnsi"/>
+                <w:rFonts w:asciiTheme="minorHAnsi" w:hAnsiTheme="minorHAnsi" w:cs="Segoe UI Semibold"/>
                 <w:sz w:val="22"/>
                 <w:szCs w:val="22"/>
               </w:rPr>
@@ -543,9 +543,9 @@
             <w:placeholder>
               <w:docPart w:val="D9D5C514A0754449BF8A9084BDC303FF"/>
             </w:placeholder>
+            <w:dataBinding w:prefixMappings="xmlns:ns0='urn:microsoft-dynamics-nav/reports/Standard_Sales_Return_Rcpt/1309/'" w:xpath="/ns0:NavWordReportXmlPart[1]/ns0:Header[1]/ns0:CompanyAddress5[1]" w:storeItemID="{ED582AB7-D2FD-40DB-AA33-A9E5E0B8B111}"/>
             <w15:color w:val="808080"/>
             <w:text/>
-            <w:dataBinding w:prefixMappings="xmlns:ns0='urn:microsoft-dynamics-nav/reports/Standard_Sales_Return_Rcpt/1309/'" w:xpath="/ns0:NavWordReportXmlPart[1]/ns0:Header[1]/ns0:CompanyAddress5[1]"/>
           </w:sdtPr>
           <w:sdtContent>
             <w:tc>
@@ -562,7 +562,7 @@
                 </w:pPr>
                 <w:r>
                   <w:rPr>
-                    <w:rFonts w:cs="Segoe UI Semibold" w:asciiTheme="minorHAnsi" w:hAnsiTheme="minorHAnsi"/>
+                    <w:rFonts w:asciiTheme="minorHAnsi" w:hAnsiTheme="minorHAnsi" w:cs="Segoe UI Semibold"/>
                     <w:sz w:val="22"/>
                     <w:szCs w:val="22"/>
                   </w:rPr>
@@ -590,9 +590,9 @@
             <w:placeholder>
               <w:docPart w:val="A5CCA9EA280943A7AF98D93CAA336D88"/>
             </w:placeholder>
+            <w:dataBinding w:prefixMappings="xmlns:ns0='urn:microsoft-dynamics-nav/reports/Standard_Sales_Return_Rcpt/1309/'" w:xpath="/ns0:NavWordReportXmlPart[1]/ns0:Header[1]/ns0:CustomerAddress6[1]" w:storeItemID="{ED582AB7-D2FD-40DB-AA33-A9E5E0B8B111}"/>
             <w15:color w:val="808080"/>
             <w:text/>
-            <w:dataBinding w:prefixMappings="xmlns:ns0='urn:microsoft-dynamics-nav/reports/Standard_Sales_Return_Rcpt/1309/'" w:xpath="/ns0:NavWordReportXmlPart[1]/ns0:Header[1]/ns0:CustomerAddress6[1]"/>
           </w:sdtPr>
           <w:sdtContent>
             <w:tc>
@@ -602,14 +602,14 @@
               <w:p>
                 <w:pPr>
                   <w:rPr>
-                    <w:rFonts w:cs="Segoe UI Semibold" w:asciiTheme="minorHAnsi" w:hAnsiTheme="minorHAnsi"/>
+                    <w:rFonts w:asciiTheme="minorHAnsi" w:hAnsiTheme="minorHAnsi" w:cs="Segoe UI Semibold"/>
                     <w:sz w:val="22"/>
                     <w:szCs w:val="22"/>
                   </w:rPr>
                 </w:pPr>
                 <w:r>
                   <w:rPr>
-                    <w:rFonts w:cs="Segoe UI Semibold" w:asciiTheme="minorHAnsi" w:hAnsiTheme="minorHAnsi"/>
+                    <w:rFonts w:asciiTheme="minorHAnsi" w:hAnsiTheme="minorHAnsi" w:cs="Segoe UI Semibold"/>
                     <w:sz w:val="22"/>
                     <w:szCs w:val="22"/>
                   </w:rPr>
@@ -626,7 +626,7 @@
           <w:p>
             <w:pPr>
               <w:rPr>
-                <w:rFonts w:cs="Segoe UI Semibold" w:asciiTheme="minorHAnsi" w:hAnsiTheme="minorHAnsi"/>
+                <w:rFonts w:asciiTheme="minorHAnsi" w:hAnsiTheme="minorHAnsi" w:cs="Segoe UI Semibold"/>
                 <w:sz w:val="22"/>
                 <w:szCs w:val="22"/>
               </w:rPr>
@@ -646,9 +646,9 @@
             <w:placeholder>
               <w:docPart w:val="02F4851BD11D4313A7B77E4C6B0895A1"/>
             </w:placeholder>
+            <w:dataBinding w:prefixMappings="xmlns:ns0='urn:microsoft-dynamics-nav/reports/Standard_Sales_Return_Rcpt/1309/'" w:xpath="/ns0:NavWordReportXmlPart[1]/ns0:Header[1]/ns0:CompanyAddress6[1]" w:storeItemID="{ED582AB7-D2FD-40DB-AA33-A9E5E0B8B111}"/>
             <w15:color w:val="808080"/>
             <w:text/>
-            <w:dataBinding w:prefixMappings="xmlns:ns0='urn:microsoft-dynamics-nav/reports/Standard_Sales_Return_Rcpt/1309/'" w:xpath="/ns0:NavWordReportXmlPart[1]/ns0:Header[1]/ns0:CompanyAddress6[1]"/>
           </w:sdtPr>
           <w:sdtContent>
             <w:tc>
@@ -665,7 +665,7 @@
                 </w:pPr>
                 <w:r>
                   <w:rPr>
-                    <w:rFonts w:cs="Segoe UI Semibold" w:asciiTheme="minorHAnsi" w:hAnsiTheme="minorHAnsi"/>
+                    <w:rFonts w:asciiTheme="minorHAnsi" w:hAnsiTheme="minorHAnsi" w:cs="Segoe UI Semibold"/>
                     <w:sz w:val="22"/>
                     <w:szCs w:val="22"/>
                   </w:rPr>
@@ -693,9 +693,9 @@
             <w:placeholder>
               <w:docPart w:val="A5CCA9EA280943A7AF98D93CAA336D88"/>
             </w:placeholder>
+            <w:dataBinding w:prefixMappings="xmlns:ns0='urn:microsoft-dynamics-nav/reports/Standard_Sales_Return_Rcpt/1309/'" w:xpath="/ns0:NavWordReportXmlPart[1]/ns0:Header[1]/ns0:CustomerAddress7[1]" w:storeItemID="{ED582AB7-D2FD-40DB-AA33-A9E5E0B8B111}"/>
             <w15:color w:val="808080"/>
             <w:text/>
-            <w:dataBinding w:prefixMappings="xmlns:ns0='urn:microsoft-dynamics-nav/reports/Standard_Sales_Return_Rcpt/1309/'" w:xpath="/ns0:NavWordReportXmlPart[1]/ns0:Header[1]/ns0:CustomerAddress7[1]"/>
           </w:sdtPr>
           <w:sdtContent>
             <w:tc>
@@ -705,14 +705,14 @@
               <w:p>
                 <w:pPr>
                   <w:rPr>
-                    <w:rFonts w:cs="Segoe UI Semibold" w:asciiTheme="minorHAnsi" w:hAnsiTheme="minorHAnsi"/>
+                    <w:rFonts w:asciiTheme="minorHAnsi" w:hAnsiTheme="minorHAnsi" w:cs="Segoe UI Semibold"/>
                     <w:sz w:val="22"/>
                     <w:szCs w:val="22"/>
                   </w:rPr>
                 </w:pPr>
                 <w:r>
                   <w:rPr>
-                    <w:rFonts w:cs="Segoe UI Semibold" w:asciiTheme="minorHAnsi" w:hAnsiTheme="minorHAnsi"/>
+                    <w:rFonts w:asciiTheme="minorHAnsi" w:hAnsiTheme="minorHAnsi" w:cs="Segoe UI Semibold"/>
                     <w:sz w:val="22"/>
                     <w:szCs w:val="22"/>
                   </w:rPr>
@@ -729,7 +729,7 @@
           <w:p>
             <w:pPr>
               <w:rPr>
-                <w:rFonts w:cs="Segoe UI Semibold" w:asciiTheme="minorHAnsi" w:hAnsiTheme="minorHAnsi"/>
+                <w:rFonts w:asciiTheme="minorHAnsi" w:hAnsiTheme="minorHAnsi" w:cs="Segoe UI Semibold"/>
                 <w:sz w:val="22"/>
                 <w:szCs w:val="22"/>
               </w:rPr>
@@ -749,9 +749,9 @@
             <w:placeholder>
               <w:docPart w:val="C90F0B2D6CC4479DAD0C985BDC5BE816"/>
             </w:placeholder>
+            <w:dataBinding w:prefixMappings="xmlns:ns0='urn:microsoft-dynamics-nav/reports/Standard_Sales_Return_Rcpt/1309/'" w:xpath="/ns0:NavWordReportXmlPart[1]/ns0:Header[1]/ns0:CompanyLegalOffice_Lbl[1]" w:storeItemID="{ED582AB7-D2FD-40DB-AA33-A9E5E0B8B111}"/>
             <w15:color w:val="808080"/>
             <w:text/>
-            <w:dataBinding w:prefixMappings="xmlns:ns0='urn:microsoft-dynamics-nav/reports/Standard_Sales_Return_Rcpt/1309/'" w:xpath="/ns0:NavWordReportXmlPart[1]/ns0:Header[1]/ns0:CompanyLegalOffice_Lbl[1]"/>
           </w:sdtPr>
           <w:sdtContent>
             <w:tc>
@@ -769,7 +769,7 @@
                 <w:proofErr w:type="spellStart"/>
                 <w:r>
                   <w:rPr>
-                    <w:rFonts w:cs="Segoe UI Semibold" w:asciiTheme="minorHAnsi" w:hAnsiTheme="minorHAnsi"/>
+                    <w:rFonts w:asciiTheme="minorHAnsi" w:hAnsiTheme="minorHAnsi" w:cs="Segoe UI Semibold"/>
                     <w:sz w:val="22"/>
                     <w:szCs w:val="22"/>
                   </w:rPr>
@@ -798,9 +798,9 @@
             <w:placeholder>
               <w:docPart w:val="54F1B892766D4CBAA1A94FBCDF8CDFA9"/>
             </w:placeholder>
+            <w:dataBinding w:prefixMappings="xmlns:ns0='urn:microsoft-dynamics-nav/reports/Standard_Sales_Return_Rcpt/1309/'" w:xpath="/ns0:NavWordReportXmlPart[1]/ns0:Header[1]/ns0:CustomerAddress8[1]" w:storeItemID="{ED582AB7-D2FD-40DB-AA33-A9E5E0B8B111}"/>
             <w15:color w:val="808080"/>
             <w:text/>
-            <w:dataBinding w:prefixMappings="xmlns:ns0='urn:microsoft-dynamics-nav/reports/Standard_Sales_Return_Rcpt/1309/'" w:xpath="/ns0:NavWordReportXmlPart[1]/ns0:Header[1]/ns0:CustomerAddress8[1]"/>
           </w:sdtPr>
           <w:sdtContent>
             <w:tc>
@@ -810,14 +810,14 @@
               <w:p>
                 <w:pPr>
                   <w:rPr>
-                    <w:rFonts w:cs="Segoe UI Semibold" w:asciiTheme="minorHAnsi" w:hAnsiTheme="minorHAnsi"/>
+                    <w:rFonts w:asciiTheme="minorHAnsi" w:hAnsiTheme="minorHAnsi" w:cs="Segoe UI Semibold"/>
                     <w:sz w:val="22"/>
                     <w:szCs w:val="22"/>
                   </w:rPr>
                 </w:pPr>
                 <w:r>
                   <w:rPr>
-                    <w:rFonts w:cs="Segoe UI Semibold" w:asciiTheme="minorHAnsi" w:hAnsiTheme="minorHAnsi"/>
+                    <w:rFonts w:asciiTheme="minorHAnsi" w:hAnsiTheme="minorHAnsi" w:cs="Segoe UI Semibold"/>
                     <w:sz w:val="22"/>
                     <w:szCs w:val="22"/>
                   </w:rPr>
@@ -834,7 +834,7 @@
           <w:p>
             <w:pPr>
               <w:rPr>
-                <w:rFonts w:cs="Segoe UI Semibold" w:asciiTheme="minorHAnsi" w:hAnsiTheme="minorHAnsi"/>
+                <w:rFonts w:asciiTheme="minorHAnsi" w:hAnsiTheme="minorHAnsi" w:cs="Segoe UI Semibold"/>
                 <w:sz w:val="22"/>
                 <w:szCs w:val="22"/>
               </w:rPr>
@@ -854,9 +854,9 @@
             <w:placeholder>
               <w:docPart w:val="A4264A50AAAE4779B2B06CA1201025DF"/>
             </w:placeholder>
+            <w:dataBinding w:prefixMappings="xmlns:ns0='urn:microsoft-dynamics-nav/reports/Standard_Sales_Return_Rcpt/1309/'" w:xpath="/ns0:NavWordReportXmlPart[1]/ns0:Header[1]/ns0:CompanyLegalOffice[1]" w:storeItemID="{ED582AB7-D2FD-40DB-AA33-A9E5E0B8B111}"/>
             <w15:color w:val="808080"/>
             <w:text/>
-            <w:dataBinding w:prefixMappings="xmlns:ns0='urn:microsoft-dynamics-nav/reports/Standard_Sales_Return_Rcpt/1309/'" w:xpath="/ns0:NavWordReportXmlPart[1]/ns0:Header[1]/ns0:CompanyLegalOffice[1]"/>
           </w:sdtPr>
           <w:sdtContent>
             <w:tc>
@@ -874,7 +874,7 @@
                 <w:proofErr w:type="spellStart"/>
                 <w:r>
                   <w:rPr>
-                    <w:rFonts w:cs="Segoe UI Semibold" w:asciiTheme="minorHAnsi" w:hAnsiTheme="minorHAnsi"/>
+                    <w:rFonts w:asciiTheme="minorHAnsi" w:hAnsiTheme="minorHAnsi" w:cs="Segoe UI Semibold"/>
                     <w:sz w:val="22"/>
                     <w:szCs w:val="22"/>
                   </w:rPr>
@@ -889,9 +889,245 @@
     </w:tbl>
     <w:p>
       <w:pPr>
+        <w:spacing w:after="0"/>
         <w:rPr>
           <w:sz w:val="22"/>
           <w:szCs w:val="22"/>
+          <w:lang w:val="da-DK"/>
+        </w:rPr>
+      </w:pPr>
+    </w:p>
+    <w:tbl>
+      <w:tblPr>
+        <w:tblStyle w:val="TableGrid"/>
+        <w:tblW w:w="0" w:type="auto"/>
+        <w:tblBorders>
+          <w:top w:val="none" w:sz="0" w:space="0" w:color="auto"/>
+          <w:left w:val="none" w:sz="0" w:space="0" w:color="auto"/>
+          <w:bottom w:val="none" w:sz="0" w:space="0" w:color="auto"/>
+          <w:right w:val="none" w:sz="0" w:space="0" w:color="auto"/>
+          <w:insideH w:val="none" w:sz="0" w:space="0" w:color="auto"/>
+          <w:insideV w:val="none" w:sz="0" w:space="0" w:color="auto"/>
+        </w:tblBorders>
+        <w:tblLook w:val="04A0" w:firstRow="1" w:lastRow="0" w:firstColumn="1" w:lastColumn="0" w:noHBand="0" w:noVBand="1"/>
+      </w:tblPr>
+      <w:tblGrid>
+        <w:gridCol w:w="2407"/>
+        <w:gridCol w:w="2407"/>
+        <w:gridCol w:w="2407"/>
+        <w:gridCol w:w="2407"/>
+      </w:tblGrid>
+      <w:tr>
+        <w:trPr>
+          <w:cnfStyle w:val="100000000000" w:firstRow="1" w:lastRow="0" w:firstColumn="0" w:lastColumn="0" w:oddVBand="0" w:evenVBand="0" w:oddHBand="0" w:evenHBand="0" w:firstRowFirstColumn="0" w:firstRowLastColumn="0" w:lastRowFirstColumn="0" w:lastRowLastColumn="0"/>
+        </w:trPr>
+        <w:sdt>
+          <w:sdtPr>
+            <w:alias w:val="#Nav: /Header/DocumentDate_Lbl"/>
+            <w:tag w:val="#Nav: Standard_Sales_Return_Rcpt/1309"/>
+            <w:id w:val="2113554108"/>
+            <w:placeholder>
+              <w:docPart w:val="7E7516C79D5341478F216D6174B1F287"/>
+            </w:placeholder>
+            <w:dataBinding w:prefixMappings="xmlns:ns0='urn:microsoft-dynamics-nav/reports/Standard_Sales_Return_Rcpt/1309/'" w:xpath="/ns0:NavWordReportXmlPart[1]/ns0:Header[1]/ns0:DocumentDate_Lbl[1]" w:storeItemID="{ED582AB7-D2FD-40DB-AA33-A9E5E0B8B111}"/>
+            <w:text/>
+          </w:sdtPr>
+          <w:sdtContent>
+            <w:tc>
+              <w:tcPr>
+                <w:tcW w:w="2407" w:type="dxa"/>
+              </w:tcPr>
+              <w:p>
+                <w:pPr>
+                  <w:pStyle w:val="BCLabel"/>
+                </w:pPr>
+                <w:proofErr w:type="spellStart"/>
+                <w:r>
+                  <w:t>DocumentDate_Lbl</w:t>
+                </w:r>
+                <w:proofErr w:type="spellEnd"/>
+              </w:p>
+            </w:tc>
+          </w:sdtContent>
+        </w:sdt>
+        <w:sdt>
+          <w:sdtPr>
+            <w:alias w:val="#Nav: /Header/ShipmentDate_Lbl"/>
+            <w:tag w:val="#Nav: Standard_Sales_Return_Rcpt/1309"/>
+            <w:id w:val="-1677344497"/>
+            <w:placeholder>
+              <w:docPart w:val="7E7516C79D5341478F216D6174B1F287"/>
+            </w:placeholder>
+            <w:dataBinding w:prefixMappings="xmlns:ns0='urn:microsoft-dynamics-nav/reports/Standard_Sales_Return_Rcpt/1309/'" w:xpath="/ns0:NavWordReportXmlPart[1]/ns0:Header[1]/ns0:ShipmentDate_Lbl[1]" w:storeItemID="{ED582AB7-D2FD-40DB-AA33-A9E5E0B8B111}"/>
+            <w:text/>
+          </w:sdtPr>
+          <w:sdtContent>
+            <w:tc>
+              <w:tcPr>
+                <w:tcW w:w="2407" w:type="dxa"/>
+              </w:tcPr>
+              <w:p>
+                <w:pPr>
+                  <w:pStyle w:val="BCLabel"/>
+                </w:pPr>
+                <w:proofErr w:type="spellStart"/>
+                <w:r>
+                  <w:t>ShipmentDate_Lbl</w:t>
+                </w:r>
+                <w:proofErr w:type="spellEnd"/>
+              </w:p>
+            </w:tc>
+          </w:sdtContent>
+        </w:sdt>
+        <w:sdt>
+          <w:sdtPr>
+            <w:alias w:val="#Nav: /Header/ReturnOrderNo_Lbl"/>
+            <w:tag w:val="#Nav: Standard_Sales_Return_Rcpt/1309"/>
+            <w:id w:val="-812403983"/>
+            <w:placeholder>
+              <w:docPart w:val="7E7516C79D5341478F216D6174B1F287"/>
+            </w:placeholder>
+            <w:dataBinding w:prefixMappings="xmlns:ns0='urn:microsoft-dynamics-nav/reports/Standard_Sales_Return_Rcpt/1309/'" w:xpath="/ns0:NavWordReportXmlPart[1]/ns0:Header[1]/ns0:ReturnOrderNo_Lbl[1]" w:storeItemID="{ED582AB7-D2FD-40DB-AA33-A9E5E0B8B111}"/>
+            <w:text/>
+          </w:sdtPr>
+          <w:sdtContent>
+            <w:tc>
+              <w:tcPr>
+                <w:tcW w:w="2407" w:type="dxa"/>
+              </w:tcPr>
+              <w:p>
+                <w:pPr>
+                  <w:pStyle w:val="BCLabel"/>
+                </w:pPr>
+                <w:proofErr w:type="spellStart"/>
+                <w:r>
+                  <w:t>ReturnOrderNo_Lbl</w:t>
+                </w:r>
+                <w:proofErr w:type="spellEnd"/>
+              </w:p>
+            </w:tc>
+          </w:sdtContent>
+        </w:sdt>
+        <w:tc>
+          <w:tcPr>
+            <w:tcW w:w="2407" w:type="dxa"/>
+          </w:tcPr>
+          <w:p>
+            <w:pPr>
+              <w:contextualSpacing/>
+              <w:rPr>
+                <w:rFonts w:cstheme="minorHAnsi"/>
+                <w:bCs/>
+                <w:color w:val="0070C0"/>
+                <w:sz w:val="20"/>
+                <w:szCs w:val="20"/>
+              </w:rPr>
+            </w:pPr>
+          </w:p>
+        </w:tc>
+      </w:tr>
+      <w:tr>
+        <w:sdt>
+          <w:sdtPr>
+            <w:alias w:val="#Nav: /Header/DocumentDate"/>
+            <w:tag w:val="#Nav: Standard_Sales_Return_Rcpt/1309"/>
+            <w:id w:val="44579264"/>
+            <w:placeholder>
+              <w:docPart w:val="BA85FC81193C4E5580B1EE7AA4D2582C"/>
+            </w:placeholder>
+            <w:dataBinding w:prefixMappings="xmlns:ns0='urn:microsoft-dynamics-nav/reports/Standard_Sales_Return_Rcpt/1309/'" w:xpath="/ns0:NavWordReportXmlPart[1]/ns0:Header[1]/ns0:DocumentDate[1]" w:storeItemID="{ED582AB7-D2FD-40DB-AA33-A9E5E0B8B111}"/>
+            <w:text/>
+          </w:sdtPr>
+          <w:sdtContent>
+            <w:tc>
+              <w:tcPr>
+                <w:tcW w:w="2407" w:type="dxa"/>
+              </w:tcPr>
+              <w:p>
+                <w:proofErr w:type="spellStart"/>
+                <w:r>
+                  <w:t>DocumentDate</w:t>
+                </w:r>
+                <w:proofErr w:type="spellEnd"/>
+              </w:p>
+            </w:tc>
+          </w:sdtContent>
+        </w:sdt>
+        <w:sdt>
+          <w:sdtPr>
+            <w:alias w:val="#Nav: /Header/ShipmentDate"/>
+            <w:tag w:val="#Nav: Standard_Sales_Return_Rcpt/1309"/>
+            <w:id w:val="-1850176223"/>
+            <w:placeholder>
+              <w:docPart w:val="BA85FC81193C4E5580B1EE7AA4D2582C"/>
+            </w:placeholder>
+            <w:dataBinding w:prefixMappings="xmlns:ns0='urn:microsoft-dynamics-nav/reports/Standard_Sales_Return_Rcpt/1309/'" w:xpath="/ns0:NavWordReportXmlPart[1]/ns0:Header[1]/ns0:ShipmentDate[1]" w:storeItemID="{ED582AB7-D2FD-40DB-AA33-A9E5E0B8B111}"/>
+            <w:text/>
+          </w:sdtPr>
+          <w:sdtContent>
+            <w:tc>
+              <w:tcPr>
+                <w:tcW w:w="2407" w:type="dxa"/>
+              </w:tcPr>
+              <w:p>
+                <w:proofErr w:type="spellStart"/>
+                <w:r>
+                  <w:t>ShipmentDate</w:t>
+                </w:r>
+                <w:proofErr w:type="spellEnd"/>
+              </w:p>
+            </w:tc>
+          </w:sdtContent>
+        </w:sdt>
+        <w:sdt>
+          <w:sdtPr>
+            <w:alias w:val="#Nav: /Header/ReturnOrderNo"/>
+            <w:tag w:val="#Nav: Standard_Sales_Return_Rcpt/1309"/>
+            <w:id w:val="477657649"/>
+            <w:placeholder>
+              <w:docPart w:val="BA85FC81193C4E5580B1EE7AA4D2582C"/>
+            </w:placeholder>
+            <w:dataBinding w:prefixMappings="xmlns:ns0='urn:microsoft-dynamics-nav/reports/Standard_Sales_Return_Rcpt/1309/'" w:xpath="/ns0:NavWordReportXmlPart[1]/ns0:Header[1]/ns0:ReturnOrderNo[1]" w:storeItemID="{ED582AB7-D2FD-40DB-AA33-A9E5E0B8B111}"/>
+            <w:text/>
+          </w:sdtPr>
+          <w:sdtContent>
+            <w:tc>
+              <w:tcPr>
+                <w:tcW w:w="2407" w:type="dxa"/>
+              </w:tcPr>
+              <w:p>
+                <w:proofErr w:type="spellStart"/>
+                <w:r>
+                  <w:t>ReturnOrderNo</w:t>
+                </w:r>
+                <w:proofErr w:type="spellEnd"/>
+              </w:p>
+            </w:tc>
+          </w:sdtContent>
+        </w:sdt>
+        <w:tc>
+          <w:tcPr>
+            <w:tcW w:w="2407" w:type="dxa"/>
+          </w:tcPr>
+          <w:p>
+            <w:pPr>
+              <w:rPr>
+                <w:rFonts w:cstheme="minorHAnsi"/>
+                <w:sz w:val="20"/>
+                <w:szCs w:val="20"/>
+              </w:rPr>
+            </w:pPr>
+          </w:p>
+        </w:tc>
+      </w:tr>
+    </w:tbl>
+    <w:p>
+      <w:pPr>
+        <w:spacing w:after="0"/>
+        <w:rPr>
+          <w:sz w:val="22"/>
+          <w:szCs w:val="22"/>
+          <w:lang w:val="da-DK"/>
         </w:rPr>
       </w:pPr>
     </w:p>
@@ -919,13 +1155,13 @@
             <w:cnfStyle w:val="001000000000" w:firstRow="0" w:lastRow="0" w:firstColumn="1" w:lastColumn="0" w:oddVBand="0" w:evenVBand="0" w:oddHBand="0" w:evenHBand="0" w:firstRowFirstColumn="0" w:firstRowLastColumn="0" w:lastRowFirstColumn="0" w:lastRowLastColumn="0"/>
             <w:tcW w:w="1267" w:type="dxa"/>
             <w:tcBorders>
-              <w:bottom w:val="single" w:color="auto" w:sz="4" w:space="0"/>
+              <w:bottom w:val="single" w:sz="4" w:space="0" w:color="auto"/>
             </w:tcBorders>
           </w:tcPr>
           <w:sdt>
             <w:sdtPr>
               <w:rPr>
-                <w:rFonts w:ascii="Segoe UI Semibold" w:hAnsi="Segoe UI Semibold" w:cs="Segoe UI Semibold" w:eastAsiaTheme="minorHAnsi"/>
+                <w:rFonts w:ascii="Segoe UI Semibold" w:eastAsiaTheme="minorHAnsi" w:hAnsi="Segoe UI Semibold" w:cs="Segoe UI Semibold"/>
                 <w:sz w:val="22"/>
                 <w:szCs w:val="22"/>
               </w:rPr>
@@ -935,7 +1171,7 @@
               <w:placeholder>
                 <w:docPart w:val="2A78D6C9BBF941E4BA91DE12829C11F6"/>
               </w:placeholder>
-              <w:dataBinding w:prefixMappings="xmlns:ns0='urn:microsoft-dynamics-nav/reports/Standard_Sales_Return_Rcpt/1309/'" w:xpath="/ns0:NavWordReportXmlPart[1]/ns0:Header[1]/ns0:Line[1]/ns0:ItemNo_Line_Lbl[1]" w:storeItemID="{00000000-0000-0000-0000-000000000000}"/>
+              <w:dataBinding w:prefixMappings="xmlns:ns0='urn:microsoft-dynamics-nav/reports/Standard_Sales_Return_Rcpt/1309/'" w:xpath="/ns0:NavWordReportXmlPart[1]/ns0:Header[1]/ns0:Line[1]/ns0:ItemNo_Line_Lbl[1]" w:storeItemID="{ED582AB7-D2FD-40DB-AA33-A9E5E0B8B111}"/>
               <w15:color w:val="808080"/>
               <w:text/>
             </w:sdtPr>
@@ -944,7 +1180,7 @@
                 <w:pPr>
                   <w:pStyle w:val="Heading2"/>
                   <w:rPr>
-                    <w:rFonts w:ascii="Segoe UI Semibold" w:hAnsi="Segoe UI Semibold" w:cs="Segoe UI Semibold" w:eastAsiaTheme="minorHAnsi"/>
+                    <w:rFonts w:ascii="Segoe UI Semibold" w:eastAsiaTheme="minorHAnsi" w:hAnsi="Segoe UI Semibold" w:cs="Segoe UI Semibold"/>
                     <w:sz w:val="22"/>
                     <w:szCs w:val="22"/>
                   </w:rPr>
@@ -952,7 +1188,7 @@
                 <w:proofErr w:type="spellStart"/>
                 <w:r>
                   <w:rPr>
-                    <w:rFonts w:ascii="Segoe UI Semibold" w:hAnsi="Segoe UI Semibold" w:cs="Segoe UI Semibold" w:eastAsiaTheme="minorHAnsi"/>
+                    <w:rFonts w:ascii="Segoe UI Semibold" w:eastAsiaTheme="minorHAnsi" w:hAnsi="Segoe UI Semibold" w:cs="Segoe UI Semibold"/>
                     <w:sz w:val="22"/>
                     <w:szCs w:val="22"/>
                   </w:rPr>
@@ -976,7 +1212,7 @@
             <w:placeholder>
               <w:docPart w:val="82AEDEAA29FF48A7B684CB81502FC8AD"/>
             </w:placeholder>
-            <w:dataBinding w:prefixMappings="xmlns:ns0='urn:microsoft-dynamics-nav/reports/Standard_Sales_Return_Rcpt/1309/'" w:xpath="/ns0:NavWordReportXmlPart[1]/ns0:Header[1]/ns0:Line[1]/ns0:Description_Line_Lbl[1]" w:storeItemID="{00000000-0000-0000-0000-000000000000}"/>
+            <w:dataBinding w:prefixMappings="xmlns:ns0='urn:microsoft-dynamics-nav/reports/Standard_Sales_Return_Rcpt/1309/'" w:xpath="/ns0:NavWordReportXmlPart[1]/ns0:Header[1]/ns0:Line[1]/ns0:Description_Line_Lbl[1]" w:storeItemID="{ED582AB7-D2FD-40DB-AA33-A9E5E0B8B111}"/>
             <w15:color w:val="808080"/>
             <w:text/>
           </w:sdtPr>
@@ -985,7 +1221,7 @@
               <w:tcPr>
                 <w:tcW w:w="5616" w:type="dxa"/>
                 <w:tcBorders>
-                  <w:bottom w:val="single" w:color="auto" w:sz="4" w:space="0"/>
+                  <w:bottom w:val="single" w:sz="4" w:space="0" w:color="auto"/>
                 </w:tcBorders>
               </w:tcPr>
               <w:p>
@@ -1025,7 +1261,7 @@
             <w:placeholder>
               <w:docPart w:val="2EE06D389B24401BAEBAE6B821C813B8"/>
             </w:placeholder>
-            <w:dataBinding w:prefixMappings="xmlns:ns0='urn:microsoft-dynamics-nav/reports/Standard_Sales_Return_Rcpt/1309/'" w:xpath="/ns0:NavWordReportXmlPart[1]/ns0:Header[1]/ns0:Line[1]/ns0:Quantity_Line_Lbl[1]" w:storeItemID="{00000000-0000-0000-0000-000000000000}"/>
+            <w:dataBinding w:prefixMappings="xmlns:ns0='urn:microsoft-dynamics-nav/reports/Standard_Sales_Return_Rcpt/1309/'" w:xpath="/ns0:NavWordReportXmlPart[1]/ns0:Header[1]/ns0:Line[1]/ns0:Quantity_Line_Lbl[1]" w:storeItemID="{ED582AB7-D2FD-40DB-AA33-A9E5E0B8B111}"/>
             <w15:color w:val="808080"/>
             <w:text/>
           </w:sdtPr>
@@ -1034,7 +1270,7 @@
               <w:tcPr>
                 <w:tcW w:w="1483" w:type="dxa"/>
                 <w:tcBorders>
-                  <w:bottom w:val="single" w:color="auto" w:sz="4" w:space="0"/>
+                  <w:bottom w:val="single" w:sz="4" w:space="0" w:color="auto"/>
                 </w:tcBorders>
               </w:tcPr>
               <w:p>
@@ -1075,16 +1311,16 @@
             <w:placeholder>
               <w:docPart w:val="10CC8D26D19C45E8829BCD899C5B869B"/>
             </w:placeholder>
+            <w:dataBinding w:prefixMappings="xmlns:ns0='urn:microsoft-dynamics-nav/reports/Standard_Sales_Return_Rcpt/1309/'" w:xpath="/ns0:NavWordReportXmlPart[1]/ns0:Header[1]/ns0:Line[1]/ns0:UnitOfMeasure_Lbl[1]" w:storeItemID="{ED582AB7-D2FD-40DB-AA33-A9E5E0B8B111}"/>
             <w15:color w:val="808080"/>
             <w:text/>
-            <w:dataBinding w:prefixMappings="xmlns:ns0='urn:microsoft-dynamics-nav/reports/Standard_Sales_Return_Rcpt/1309/'" w:xpath="/ns0:NavWordReportXmlPart[1]/ns0:Header[1]/ns0:Line[1]/ns0:UnitOfMeasure_Lbl[1]"/>
           </w:sdtPr>
           <w:sdtContent>
             <w:tc>
               <w:tcPr>
                 <w:tcW w:w="2146" w:type="dxa"/>
                 <w:tcBorders>
-                  <w:bottom w:val="single" w:color="auto" w:sz="4" w:space="0"/>
+                  <w:bottom w:val="single" w:sz="4" w:space="0" w:color="auto"/>
                 </w:tcBorders>
               </w:tcPr>
               <w:p>
@@ -1115,14 +1351,14 @@
       <w:tr>
         <w:trPr>
           <w:cnfStyle w:val="000000100000" w:firstRow="0" w:lastRow="0" w:firstColumn="0" w:lastColumn="0" w:oddVBand="0" w:evenVBand="0" w:oddHBand="1" w:evenHBand="0" w:firstRowFirstColumn="0" w:firstRowLastColumn="0" w:lastRowFirstColumn="0" w:lastRowLastColumn="0"/>
-          <w:trHeight w:val="245" w:hRule="exact"/>
+          <w:trHeight w:hRule="exact" w:val="245"/>
         </w:trPr>
         <w:tc>
           <w:tcPr>
             <w:cnfStyle w:val="001000000000" w:firstRow="0" w:lastRow="0" w:firstColumn="1" w:lastColumn="0" w:oddVBand="0" w:evenVBand="0" w:oddHBand="0" w:evenHBand="0" w:firstRowFirstColumn="0" w:firstRowLastColumn="0" w:lastRowFirstColumn="0" w:lastRowLastColumn="0"/>
             <w:tcW w:w="1267" w:type="dxa"/>
             <w:tcBorders>
-              <w:top w:val="single" w:color="auto" w:sz="4" w:space="0"/>
+              <w:top w:val="single" w:sz="4" w:space="0" w:color="auto"/>
             </w:tcBorders>
           </w:tcPr>
           <w:p>
@@ -1141,7 +1377,7 @@
           <w:tcPr>
             <w:tcW w:w="5616" w:type="dxa"/>
             <w:tcBorders>
-              <w:top w:val="single" w:color="auto" w:sz="4" w:space="0"/>
+              <w:top w:val="single" w:sz="4" w:space="0" w:color="auto"/>
             </w:tcBorders>
           </w:tcPr>
           <w:p>
@@ -1162,7 +1398,7 @@
           <w:tcPr>
             <w:tcW w:w="1483" w:type="dxa"/>
             <w:tcBorders>
-              <w:top w:val="single" w:color="auto" w:sz="4" w:space="0"/>
+              <w:top w:val="single" w:sz="4" w:space="0" w:color="auto"/>
             </w:tcBorders>
           </w:tcPr>
           <w:p>
@@ -1183,7 +1419,7 @@
           <w:tcPr>
             <w:tcW w:w="2146" w:type="dxa"/>
             <w:tcBorders>
-              <w:top w:val="single" w:color="auto" w:sz="4" w:space="0"/>
+              <w:top w:val="single" w:sz="4" w:space="0" w:color="auto"/>
             </w:tcBorders>
           </w:tcPr>
           <w:p>
@@ -1204,7 +1440,7 @@
       <w:sdt>
         <w:sdtPr>
           <w:rPr>
-            <w:rFonts w:cs="Arial" w:asciiTheme="minorHAnsi" w:hAnsiTheme="minorHAnsi" w:eastAsiaTheme="minorEastAsia"/>
+            <w:rFonts w:asciiTheme="minorHAnsi" w:eastAsiaTheme="minorEastAsia" w:hAnsiTheme="minorHAnsi" w:cs="Arial"/>
             <w:bCs w:val="0"/>
             <w:kern w:val="2"/>
             <w:sz w:val="22"/>
@@ -1222,9 +1458,9 @@
         </w:sdtPr>
         <w:sdtEndPr>
           <w:rPr>
-            <w:rFonts w:ascii="Segoe UI" w:hAnsi="Segoe UI" w:eastAsia="Aptos" w:cstheme="minorBidi"/>
+            <w:rFonts w:ascii="Segoe UI" w:eastAsia="Aptos" w:hAnsi="Segoe UI" w:cstheme="minorBidi"/>
             <w:kern w:val="0"/>
-            <w:lang w:val="en-DK" w:eastAsia="en-DK"/>
+            <w:lang/>
             <w14:ligatures w14:val="none"/>
           </w:rPr>
         </w:sdtEndPr>
@@ -1237,7 +1473,7 @@
             <w:sdt>
               <w:sdtPr>
                 <w:rPr>
-                  <w:rFonts w:cs="Arial" w:asciiTheme="minorHAnsi" w:hAnsiTheme="minorHAnsi" w:eastAsiaTheme="minorEastAsia"/>
+                  <w:rFonts w:asciiTheme="minorHAnsi" w:eastAsiaTheme="minorEastAsia" w:hAnsiTheme="minorHAnsi" w:cs="Arial"/>
                   <w:bCs w:val="0"/>
                   <w:kern w:val="2"/>
                   <w:sz w:val="22"/>
@@ -1251,14 +1487,13 @@
                 <w:placeholder>
                   <w:docPart w:val="EF95D91A52C44D8EAFAA81F032025888"/>
                 </w:placeholder>
-                <w:dataBinding w:prefixMappings="xmlns:ns0='urn:microsoft-dynamics-nav/reports/Standard_Sales_Return_Rcpt/1309/'" w:xpath="/ns0:NavWordReportXmlPart[1]/ns0:Header[1]/ns0:Line[1]/ns0:ItemNo_Line[1]" w:storeItemID="{00000000-0000-0000-0000-000000000000}"/>
+                <w:dataBinding w:prefixMappings="xmlns:ns0='urn:microsoft-dynamics-nav/reports/Standard_Sales_Return_Rcpt/1309/'" w:xpath="/ns0:NavWordReportXmlPart[1]/ns0:Header[1]/ns0:Line[1]/ns0:ItemNo_Line[1]" w:storeItemID="{ED582AB7-D2FD-40DB-AA33-A9E5E0B8B111}"/>
                 <w15:color w:val="808080"/>
                 <w:text/>
               </w:sdtPr>
               <w:sdtEndPr>
                 <w:rPr>
-                  <w:rFonts w:ascii="Segoe UI" w:hAnsi="Segoe UI" w:eastAsia="Aptos"/>
-                  <w:bCs/>
+                  <w:rFonts w:ascii="Segoe UI" w:eastAsia="Aptos" w:hAnsi="Segoe UI"/>
                   <w:kern w:val="0"/>
                   <w14:ligatures w14:val="none"/>
                 </w:rPr>
@@ -1273,7 +1508,7 @@
                   <w:p>
                     <w:pPr>
                       <w:rPr>
-                        <w:rFonts w:cs="Arial" w:asciiTheme="minorHAnsi" w:hAnsiTheme="minorHAnsi"/>
+                        <w:rFonts w:asciiTheme="minorHAnsi" w:hAnsiTheme="minorHAnsi" w:cs="Arial"/>
                         <w:sz w:val="22"/>
                         <w:szCs w:val="22"/>
                         <w:lang w:val="en-US" w:eastAsia="en-US"/>
@@ -1282,7 +1517,7 @@
                     <w:proofErr w:type="spellStart"/>
                     <w:r>
                       <w:rPr>
-                        <w:rFonts w:cs="Arial" w:asciiTheme="minorHAnsi" w:hAnsiTheme="minorHAnsi"/>
+                        <w:rFonts w:asciiTheme="minorHAnsi" w:hAnsiTheme="minorHAnsi" w:cs="Arial"/>
                         <w:sz w:val="22"/>
                         <w:szCs w:val="22"/>
                         <w:lang w:val="en-US" w:eastAsia="en-US"/>
@@ -1308,7 +1543,7 @@
                 <w:placeholder>
                   <w:docPart w:val="2786F3CA62A64460AAA422BE357B30D1"/>
                 </w:placeholder>
-                <w:dataBinding w:prefixMappings="xmlns:ns0='urn:microsoft-dynamics-nav/reports/Standard_Sales_Return_Rcpt/1309/'" w:xpath="/ns0:NavWordReportXmlPart[1]/ns0:Header[1]/ns0:Line[1]/ns0:Description_Line[1]" w:storeItemID="{00000000-0000-0000-0000-000000000000}"/>
+                <w:dataBinding w:prefixMappings="xmlns:ns0='urn:microsoft-dynamics-nav/reports/Standard_Sales_Return_Rcpt/1309/'" w:xpath="/ns0:NavWordReportXmlPart[1]/ns0:Header[1]/ns0:Line[1]/ns0:Description_Line[1]" w:storeItemID="{ED582AB7-D2FD-40DB-AA33-A9E5E0B8B111}"/>
                 <w15:color w:val="808080"/>
                 <w:text/>
               </w:sdtPr>
@@ -1322,23 +1557,21 @@
                     <w:pPr>
                       <w:cnfStyle w:val="000000010000" w:firstRow="0" w:lastRow="0" w:firstColumn="0" w:lastColumn="0" w:oddVBand="0" w:evenVBand="0" w:oddHBand="0" w:evenHBand="1" w:firstRowFirstColumn="0" w:firstRowLastColumn="0" w:lastRowFirstColumn="0" w:lastRowLastColumn="0"/>
                       <w:rPr>
-                        <w:rFonts w:cs="Arial" w:asciiTheme="minorHAnsi" w:hAnsiTheme="minorHAnsi"/>
+                        <w:rFonts w:asciiTheme="minorHAnsi" w:hAnsiTheme="minorHAnsi" w:cs="Arial"/>
                         <w:sz w:val="22"/>
                         <w:szCs w:val="22"/>
                         <w:lang w:eastAsia="en-US"/>
                       </w:rPr>
                     </w:pPr>
-                    <w:proofErr w:type="spellStart"/>
                     <w:r>
                       <w:rPr>
-                        <w:rFonts w:cs="Arial" w:asciiTheme="minorHAnsi" w:hAnsiTheme="minorHAnsi"/>
+                        <w:rFonts w:asciiTheme="minorHAnsi" w:hAnsiTheme="minorHAnsi" w:cs="Arial"/>
                         <w:sz w:val="22"/>
                         <w:szCs w:val="22"/>
                         <w:lang w:eastAsia="en-US"/>
                       </w:rPr>
                       <w:t>Description_Line</w:t>
                     </w:r>
-                    <w:proofErr w:type="spellEnd"/>
                   </w:p>
                 </w:tc>
               </w:sdtContent>
@@ -1357,7 +1590,7 @@
                 <w:placeholder>
                   <w:docPart w:val="432055EC4E7D4D7788B26F0061492079"/>
                 </w:placeholder>
-                <w:dataBinding w:prefixMappings="xmlns:ns0='urn:microsoft-dynamics-nav/reports/Standard_Sales_Return_Rcpt/1309/'" w:xpath="/ns0:NavWordReportXmlPart[1]/ns0:Header[1]/ns0:Line[1]/ns0:Quantity_Line[1]" w:storeItemID="{00000000-0000-0000-0000-000000000000}"/>
+                <w:dataBinding w:prefixMappings="xmlns:ns0='urn:microsoft-dynamics-nav/reports/Standard_Sales_Return_Rcpt/1309/'" w:xpath="/ns0:NavWordReportXmlPart[1]/ns0:Header[1]/ns0:Line[1]/ns0:Quantity_Line[1]" w:storeItemID="{ED582AB7-D2FD-40DB-AA33-A9E5E0B8B111}"/>
                 <w15:color w:val="808080"/>
                 <w:text/>
               </w:sdtPr>
@@ -1372,7 +1605,7 @@
                       <w:jc w:val="right"/>
                       <w:cnfStyle w:val="000000010000" w:firstRow="0" w:lastRow="0" w:firstColumn="0" w:lastColumn="0" w:oddVBand="0" w:evenVBand="0" w:oddHBand="0" w:evenHBand="1" w:firstRowFirstColumn="0" w:firstRowLastColumn="0" w:lastRowFirstColumn="0" w:lastRowLastColumn="0"/>
                       <w:rPr>
-                        <w:rFonts w:cs="Arial" w:asciiTheme="minorHAnsi" w:hAnsiTheme="minorHAnsi"/>
+                        <w:rFonts w:asciiTheme="minorHAnsi" w:hAnsiTheme="minorHAnsi" w:cs="Arial"/>
                         <w:sz w:val="22"/>
                         <w:szCs w:val="22"/>
                         <w:lang w:val="en-US" w:eastAsia="en-US"/>
@@ -1381,7 +1614,7 @@
                     <w:proofErr w:type="spellStart"/>
                     <w:r>
                       <w:rPr>
-                        <w:rFonts w:cs="Arial" w:asciiTheme="minorHAnsi" w:hAnsiTheme="minorHAnsi"/>
+                        <w:rFonts w:asciiTheme="minorHAnsi" w:hAnsiTheme="minorHAnsi" w:cs="Arial"/>
                         <w:sz w:val="22"/>
                         <w:szCs w:val="22"/>
                         <w:lang w:val="en-US" w:eastAsia="en-US"/>
@@ -1405,9 +1638,9 @@
                 <w:placeholder>
                   <w:docPart w:val="DE8466DC32D0444CA9C8ABF0D828A899"/>
                 </w:placeholder>
+                <w:dataBinding w:prefixMappings="xmlns:ns0='urn:microsoft-dynamics-nav/reports/Standard_Sales_Return_Rcpt/1309/'" w:xpath="/ns0:NavWordReportXmlPart[1]/ns0:Header[1]/ns0:Line[1]/ns0:UnitOfMeasure[1]" w:storeItemID="{ED582AB7-D2FD-40DB-AA33-A9E5E0B8B111}"/>
                 <w15:color w:val="808080"/>
                 <w:text/>
-                <w:dataBinding w:prefixMappings="xmlns:ns0='urn:microsoft-dynamics-nav/reports/Standard_Sales_Return_Rcpt/1309/'" w:xpath="/ns0:NavWordReportXmlPart[1]/ns0:Header[1]/ns0:Line[1]/ns0:UnitOfMeasure[1]"/>
               </w:sdtPr>
               <w:sdtContent>
                 <w:tc>
@@ -1424,7 +1657,6 @@
                         <w:szCs w:val="22"/>
                       </w:rPr>
                     </w:pPr>
-                    <w:proofErr w:type="spellStart"/>
                     <w:r>
                       <w:rPr>
                         <w:rFonts w:asciiTheme="minorHAnsi" w:hAnsiTheme="minorHAnsi"/>
@@ -1433,7 +1665,6 @@
                       </w:rPr>
                       <w:t>UnitOfMeasure</w:t>
                     </w:r>
-                    <w:proofErr w:type="spellEnd"/>
                   </w:p>
                 </w:tc>
               </w:sdtContent>
@@ -1489,7 +1720,7 @@
         <w:kern w:val="2"/>
         <w:sz w:val="24"/>
         <w:szCs w:val="24"/>
-        <w:lang w:val="en-DK" w:eastAsia="en-DK" w:bidi="ar-SA"/>
+        <w:lang w:bidi="ar-SA"/>
         <w14:ligatures w14:val="standardContextual"/>
       </w:rPr>
     </w:rPrDefault>
@@ -1996,7 +2227,6 @@
       <w:kern w:val="0"/>
       <w:sz w:val="20"/>
       <w:szCs w:val="20"/>
-      <w:lang w:val="en-DK" w:eastAsia="en-DK"/>
       <w14:ligatures w14:val="none"/>
     </w:rPr>
     <w:tblPr/>
@@ -2188,6 +2418,32 @@
     <w:rPr>
       <w:color w:val="666666"/>
     </w:rPr>
+  </w:style>
+  <w:style w:type="paragraph" w:customStyle="1" w:styleId="BCLabel">
+    <w:name w:val="BC Label"/>
+    <w:basedOn w:val="NoSpacing"/>
+    <w:next w:val="Normal"/>
+    <w:uiPriority w:val="2"/>
+    <w:qFormat/>
+    <w:rsid w:val="00BC6E48"/>
+    <w:pPr>
+      <w:keepNext/>
+    </w:pPr>
+    <w:rPr>
+      <w:rFonts w:asciiTheme="majorHAnsi" w:eastAsiaTheme="majorEastAsia" w:hAnsiTheme="majorHAnsi" w:cstheme="majorBidi"/>
+      <w:color w:val="000000" w:themeColor="text1"/>
+      <w:sz w:val="16"/>
+      <w:lang w:val="en-US" w:eastAsia="en-US"/>
+    </w:rPr>
+  </w:style>
+  <w:style w:type="paragraph" w:styleId="NoSpacing">
+    <w:name w:val="No Spacing"/>
+    <w:uiPriority w:val="1"/>
+    <w:qFormat/>
+    <w:rsid w:val="00BC6E48"/>
+    <w:pPr>
+      <w:spacing w:after="0" w:line="240" w:lineRule="auto"/>
+    </w:pPr>
   </w:style>
 </w:styles>
 </file>
@@ -2746,6 +3002,64 @@
         </w:p>
       </w:docPartBody>
     </w:docPart>
+    <w:docPart>
+      <w:docPartPr>
+        <w:name w:val="7E7516C79D5341478F216D6174B1F287"/>
+        <w:category>
+          <w:name w:val="General"/>
+          <w:gallery w:val="placeholder"/>
+        </w:category>
+        <w:types>
+          <w:type w:val="bbPlcHdr"/>
+        </w:types>
+        <w:behaviors>
+          <w:behavior w:val="content"/>
+        </w:behaviors>
+        <w:guid w:val="{FDF70451-7380-41F7-854C-E3177BE99086}"/>
+      </w:docPartPr>
+      <w:docPartBody>
+        <w:p>
+          <w:pPr>
+            <w:pStyle w:val="7E7516C79D5341478F216D6174B1F287"/>
+          </w:pPr>
+          <w:r>
+            <w:rPr>
+              <w:rStyle w:val="PlaceholderText"/>
+            </w:rPr>
+            <w:t>Место для ввода текста.</w:t>
+          </w:r>
+        </w:p>
+      </w:docPartBody>
+    </w:docPart>
+    <w:docPart>
+      <w:docPartPr>
+        <w:name w:val="BA85FC81193C4E5580B1EE7AA4D2582C"/>
+        <w:category>
+          <w:name w:val="General"/>
+          <w:gallery w:val="placeholder"/>
+        </w:category>
+        <w:types>
+          <w:type w:val="bbPlcHdr"/>
+        </w:types>
+        <w:behaviors>
+          <w:behavior w:val="content"/>
+        </w:behaviors>
+        <w:guid w:val="{00CF3A58-573C-4F09-AC88-FCA854A75D43}"/>
+      </w:docPartPr>
+      <w:docPartBody>
+        <w:p>
+          <w:pPr>
+            <w:pStyle w:val="BA85FC81193C4E5580B1EE7AA4D2582C"/>
+          </w:pPr>
+          <w:r>
+            <w:rPr>
+              <w:rStyle w:val="PlaceholderText"/>
+            </w:rPr>
+            <w:t>Место для ввода текста.</w:t>
+          </w:r>
+        </w:p>
+      </w:docPartBody>
+    </w:docPart>
   </w:docParts>
 </w:glossaryDocument>
 </file>
@@ -2820,7 +3134,10 @@
     <w:rsidRoot w:val="00124DE6"/>
     <w:rsid w:val="00124DE6"/>
     <w:rsid w:val="00912E37"/>
+    <w:rsid w:val="00981B3C"/>
+    <w:rsid w:val="009F2439"/>
     <w:rsid w:val="00A407C3"/>
+    <w:rsid w:val="00C419C6"/>
     <w:rsid w:val="00DF7177"/>
   </w:rsids>
   <m:mathPr>
@@ -2836,9 +3153,9 @@
     <m:intLim m:val="subSup"/>
     <m:naryLim m:val="undOvr"/>
   </m:mathPr>
-  <w:themeFontLang w:val="en-DK"/>
+  <w:themeFontLang/>
   <w:clrSchemeMapping w:bg1="light1" w:t1="dark1" w:bg2="light2" w:t2="dark2" w:accent1="accent1" w:accent2="accent2" w:accent3="accent3" w:accent4="accent4" w:accent5="accent5" w:accent6="accent6" w:hyperlink="hyperlink" w:followedHyperlink="followedHyperlink"/>
-  <w:decimalSymbol w:val=","/>
+  <w:decimalSymbol w:val="."/>
   <w:listSeparator w:val=","/>
   <w15:chartTrackingRefBased/>
 </w:settings>
@@ -2853,7 +3170,7 @@
         <w:kern w:val="2"/>
         <w:sz w:val="24"/>
         <w:szCs w:val="24"/>
-        <w:lang w:val="en-DK" w:eastAsia="en-DK" w:bidi="ar-SA"/>
+        <w:lang w:bidi="ar-SA"/>
         <w14:ligatures w14:val="standardContextual"/>
       </w:rPr>
     </w:rPrDefault>
@@ -3277,9 +3594,9 @@
     <w:basedOn w:val="DefaultParagraphFont"/>
     <w:uiPriority w:val="99"/>
     <w:semiHidden/>
-    <w:rsid w:val="00124DE6"/>
+    <w:rsid w:val="00981B3C"/>
     <w:rPr>
-      <w:color w:val="666666"/>
+      <w:color w:val="808080"/>
     </w:rPr>
   </w:style>
   <w:style w:type="paragraph" w:customStyle="1" w:styleId="A5CCA9EA280943A7AF98D93CAA336D88">
@@ -3358,9 +3675,33 @@
     <w:name w:val="DE8466DC32D0444CA9C8ABF0D828A899"/>
     <w:rsid w:val="00124DE6"/>
   </w:style>
-  <w:style w:type="paragraph" w:customStyle="1" w:styleId="F5B61F0A0BF249C5A0A4635B2ECF937E">
-    <w:name w:val="F5B61F0A0BF249C5A0A4635B2ECF937E"/>
-    <w:rsid w:val="00124DE6"/>
+  <w:style w:type="paragraph" w:customStyle="1" w:styleId="A78B01308F6A4A3381B2AAF680467BCA">
+    <w:name w:val="A78B01308F6A4A3381B2AAF680467BCA"/>
+    <w:rsid w:val="00981B3C"/>
+    <w:rPr>
+      <w:lang w:val="en-US" w:eastAsia="en-US"/>
+    </w:rPr>
+  </w:style>
+  <w:style w:type="paragraph" w:customStyle="1" w:styleId="2F88D6F93B5C4D64BB9FF4CF1757454A">
+    <w:name w:val="2F88D6F93B5C4D64BB9FF4CF1757454A"/>
+    <w:rsid w:val="00981B3C"/>
+    <w:rPr>
+      <w:lang w:val="en-US" w:eastAsia="en-US"/>
+    </w:rPr>
+  </w:style>
+  <w:style w:type="paragraph" w:customStyle="1" w:styleId="7E7516C79D5341478F216D6174B1F287">
+    <w:name w:val="7E7516C79D5341478F216D6174B1F287"/>
+    <w:rsid w:val="00981B3C"/>
+    <w:rPr>
+      <w:lang w:val="en-US" w:eastAsia="en-US"/>
+    </w:rPr>
+  </w:style>
+  <w:style w:type="paragraph" w:customStyle="1" w:styleId="BA85FC81193C4E5580B1EE7AA4D2582C">
+    <w:name w:val="BA85FC81193C4E5580B1EE7AA4D2582C"/>
+    <w:rsid w:val="00981B3C"/>
+    <w:rPr>
+      <w:lang w:val="en-US" w:eastAsia="en-US"/>
+    </w:rPr>
   </w:style>
 </w:styles>
 </file>
@@ -3707,9 +4048,7 @@
 </we:webextension>
 </file>
 
-<file path=customXml/item3.xml>��< ? x m l   v e r s i o n = " 1 . 0 "   e n c o d i n g = " u t f - 1 6 " ? > - 
- < N a v W o r d R e p o r t X m l P a r t   x m l n s = " u r n : m i c r o s o f t - d y n a m i c s - n a v / r e p o r t s / S t a n d a r d _ S a l e s _ R e t u r n _ R c p t / 1 3 0 9 / " > +<file path=customXml/item1.xml>��< ? x m l   v e r s i o n = " 1 . 0 "   e n c o d i n g = " u t f - 1 6 " ? > < N a v W o r d R e p o r t X m l P a r t   x m l n s = " u r n : m i c r o s o f t - d y n a m i c s - b u s i n e s s c e n t r a l / i n t e r n a l / e x t e n d e d / r e p o r t s / S t a n d a r d _ S a l e s _ R e t u r n _ R c p t / 1 3 0 9 / " >   
      < B C R e p o r t I n f o r m a t i o n >   
@@ -3853,307 +4192,515 @@
  
      < / B C R e p o r t I n f o r m a t i o n >   
-     < H e a d e r > - 
-         < B i l l e d T o _ L b l > B i l l e d T o _ L b l < / B i l l e d T o _ L b l > - 
-         < B i l l t o A d d r e s s C a p t i o n > B i l l t o A d d r e s s C a p t i o n < / B i l l t o A d d r e s s C a p t i o n > - 
-         < B i l l T o C o n t a c t E m a i l > B i l l T o C o n t a c t E m a i l < / B i l l T o C o n t a c t E m a i l > - 
-         < B i l l T o C o n t a c t E m a i l L b l > B i l l T o C o n t a c t E m a i l L b l < / B i l l T o C o n t a c t E m a i l L b l > - 
-         < B i l l T o C o n t a c t M o b i l e P h o n e N o > B i l l T o C o n t a c t M o b i l e P h o n e N o < / B i l l T o C o n t a c t M o b i l e P h o n e N o > - 
-         < B i l l T o C o n t a c t M o b i l e P h o n e N o L b l > B i l l T o C o n t a c t M o b i l e P h o n e N o L b l < / B i l l T o C o n t a c t M o b i l e P h o n e N o L b l > - 
-         < B i l l T o C o n t a c t P h o n e N o > B i l l T o C o n t a c t P h o n e N o < / B i l l T o C o n t a c t P h o n e N o > - 
-         < B i l l T o C o n t a c t P h o n e N o L b l > B i l l T o C o n t a c t P h o n e N o L b l < / B i l l T o C o n t a c t P h o n e N o L b l > - 
-         < B i l l t o C u s t o m e r N o _ L b l > B i l l t o C u s t o m e r N o _ L b l < / B i l l t o C u s t o m e r N o _ L b l > - 
-         < B i l l t o C u s t u m e r N o > B i l l t o C u s t u m e r N o < / B i l l t o C u s t u m e r N o > - 
-         < C o m p a n y A d d r e s s 1 > C o m p a n y A d d r e s s 1 < / C o m p a n y A d d r e s s 1 > - 
-         < C o m p a n y A d d r e s s 2 > C o m p a n y A d d r e s s 2 < / C o m p a n y A d d r e s s 2 > - 
-         < C o m p a n y A d d r e s s 3 > C o m p a n y A d d r e s s 3 < / C o m p a n y A d d r e s s 3 > - 
-         < C o m p a n y A d d r e s s 4 > C o m p a n y A d d r e s s 4 < / C o m p a n y A d d r e s s 4 > - 
-         < C o m p a n y A d d r e s s 5 > C o m p a n y A d d r e s s 5 < / C o m p a n y A d d r e s s 5 > - 
-         < C o m p a n y A d d r e s s 6 > C o m p a n y A d d r e s s 6 < / C o m p a n y A d d r e s s 6 > - 
-         < C o m p a n y A d d r e s s 7 > C o m p a n y A d d r e s s 7 < / C o m p a n y A d d r e s s 7 > - 
-         < C o m p a n y A d d r e s s 8 > C o m p a n y A d d r e s s 8 < / C o m p a n y A d d r e s s 8 > - 
-         < C o m p a n y B a n k A c c o u n t N o > C o m p a n y B a n k A c c o u n t N o < / C o m p a n y B a n k A c c o u n t N o > - 
-         < C o m p a n y B a n k A c c o u n t N o _ L b l > C o m p a n y B a n k A c c o u n t N o _ L b l < / C o m p a n y B a n k A c c o u n t N o _ L b l > - 
-         < C o m p a n y B a n k B r a n c h N o > C o m p a n y B a n k B r a n c h N o < / C o m p a n y B a n k B r a n c h N o > - 
-         < C o m p a n y B a n k B r a n c h N o _ L b l > C o m p a n y B a n k B r a n c h N o _ L b l < / C o m p a n y B a n k B r a n c h N o _ L b l > - 
-         < C o m p a n y B a n k N a m e > C o m p a n y B a n k N a m e < / C o m p a n y B a n k N a m e > - 
-         < C o m p a n y B a n k N a m e _ L b l > C o m p a n y B a n k N a m e _ L b l < / C o m p a n y B a n k N a m e _ L b l > - 
-         < C o m p a n y C u s t o m G i r o > C o m p a n y C u s t o m G i r o < / C o m p a n y C u s t o m G i r o > - 
-         < C o m p a n y C u s t o m G i r o _ L b l > C o m p a n y C u s t o m G i r o _ L b l < / C o m p a n y C u s t o m G i r o _ L b l > - 
-         < C o m p a n y E M a i l > C o m p a n y E M a i l < / C o m p a n y E M a i l > - 
-         < C o m p a n y G i r o N o > C o m p a n y G i r o N o < / C o m p a n y G i r o N o > - 
-         < C o m p a n y G i r o N o _ L b l > C o m p a n y G i r o N o _ L b l < / C o m p a n y G i r o N o _ L b l > - 
-         < C o m p a n y H o m e P a g e > C o m p a n y H o m e P a g e < / C o m p a n y H o m e P a g e > - 
-         < C o m p a n y I B A N > C o m p a n y I B A N < / C o m p a n y I B A N > - 
-         < C o m p a n y I B A N _ L b l > C o m p a n y I B A N _ L b l < / C o m p a n y I B A N _ L b l > - 
-         < C o m p a n y L e g a l O f f i c e > C o m p a n y L e g a l O f f i c e < / C o m p a n y L e g a l O f f i c e > - 
-         < C o m p a n y L e g a l O f f i c e _ L b l > C o m p a n y L e g a l O f f i c e _ L b l < / C o m p a n y L e g a l O f f i c e _ L b l > - 
-         < C o m p a n y L e g a l S t a t e m e n t > C o m p a n y L e g a l S t a t e m e n t < / C o m p a n y L e g a l S t a t e m e n t > - 
-         < C o m p a n y L o g o P o s i t i o n > C o m p a n y L o g o P o s i t i o n < / C o m p a n y L o g o P o s i t i o n > - 
-         < C o m p a n y P h o n e N o > C o m p a n y P h o n e N o < / C o m p a n y P h o n e N o > - 
-         < C o m p a n y P h o n e N o _ L b l > C o m p a n y P h o n e N o _ L b l < / C o m p a n y P h o n e N o _ L b l > - 
-         < C o m p a n y P i c t u r e   / > - 
-         < C o m p a n y R e g i s t r a t i o n N u m b e r > C o m p a n y R e g i s t r a t i o n N u m b e r < / C o m p a n y R e g i s t r a t i o n N u m b e r > - 
-         < C o m p a n y R e g i s t r a t i o n N u m b e r _ L b l > C o m p a n y R e g i s t r a t i o n N u m b e r _ L b l < / C o m p a n y R e g i s t r a t i o n N u m b e r _ L b l > - 
-         < C o m p a n y S W I F T > C o m p a n y S W I F T < / C o m p a n y S W I F T > - 
-         < C o m p a n y S W I F T _ L b l > C o m p a n y S W I F T _ L b l < / C o m p a n y S W I F T _ L b l > - 
-         < C o m p a n y V A T R e g i s t r a t i o n N o > C o m p a n y V A T R e g i s t r a t i o n N o < / C o m p a n y V A T R e g i s t r a t i o n N o > - 
-         < C o m p a n y V A T R e g i s t r a t i o n N o _ L b l > C o m p a n y V A T R e g i s t r a t i o n N o _ L b l < / C o m p a n y V A T R e g i s t r a t i o n N o _ L b l > - 
-         < C o m p a n y V A T R e g N o > C o m p a n y V A T R e g N o < / C o m p a n y V A T R e g N o > - 
-         < C o m p a n y V A T R e g N o _ L b l > C o m p a n y V A T R e g N o _ L b l < / C o m p a n y V A T R e g N o _ L b l > - 
-         < C o n t a c t _ L b l > C o n t a c t _ L b l < / C o n t a c t _ L b l > - 
-         < C o p y _ L b l > C o p y _ L b l < / C o p y _ L b l > - 
-         < C u s t o m e r A d d r e s s 1 > C u s t o m e r A d d r e s s 1 < / C u s t o m e r A d d r e s s 1 > - 
-         < C u s t o m e r A d d r e s s 2 > C u s t o m e r A d d r e s s 2 < / C u s t o m e r A d d r e s s 2 > - 
-         < C u s t o m e r A d d r e s s 3 > C u s t o m e r A d d r e s s 3 < / C u s t o m e r A d d r e s s 3 > - 
-         < C u s t o m e r A d d r e s s 4 > C u s t o m e r A d d r e s s 4 < / C u s t o m e r A d d r e s s 4 > - 
-         < C u s t o m e r A d d r e s s 5 > C u s t o m e r A d d r e s s 5 < / C u s t o m e r A d d r e s s 5 > - 
-         < C u s t o m e r A d d r e s s 6 > C u s t o m e r A d d r e s s 6 < / C u s t o m e r A d d r e s s 6 > - 
-         < C u s t o m e r A d d r e s s 7 > C u s t o m e r A d d r e s s 7 < / C u s t o m e r A d d r e s s 7 > - 
-         < C u s t o m e r A d d r e s s 8 > C u s t o m e r A d d r e s s 8 < / C u s t o m e r A d d r e s s 8 > - 
-         < C u s t o m e r P o s t a l B a r C o d e > C u s t o m e r P o s t a l B a r C o d e < / C u s t o m e r P o s t a l B a r C o d e > - 
-         < D o c u m e n t D a t e > D o c u m e n t D a t e < / D o c u m e n t D a t e > - 
-         < D o c u m e n t D a t e _ L b l > D o c u m e n t D a t e _ L b l < / D o c u m e n t D a t e _ L b l > - 
-         < D o c u m e n t N o > D o c u m e n t N o < / D o c u m e n t N o > - 
-         < D o c u m e n t N o _ L b l > D o c u m e n t N o _ L b l < / D o c u m e n t N o _ L b l > - 
-         < D o c u m e n t T i t l e _ L b l > D o c u m e n t T i t l e _ L b l < / D o c u m e n t T i t l e _ L b l > - 
-         < D u e D a t e > D u e D a t e < / D u e D a t e > - 
-         < D u e D a t e _ L b l > D u e D a t e _ L b l < / D u e D a t e _ L b l > - 
-         < E M a i l _ H e a d e r _ L b l > E M a i l _ H e a d e r _ L b l < / E M a i l _ H e a d e r _ L b l > - 
-         < E x t e r n a l D o c u m e n t N o > E x t e r n a l D o c u m e n t N o < / E x t e r n a l D o c u m e n t N o > - 
-         < E x t e r n a l D o c u m e n t N o _ L b l > E x t e r n a l D o c u m e n t N o _ L b l < / E x t e r n a l D o c u m e n t N o _ L b l > - 
-         < F r o m _ L b l > F r o m _ L b l < / F r o m _ L b l > - 
-         < G l o b a l L o c a t i o n N u m b e r > G l o b a l L o c a t i o n N u m b e r < / G l o b a l L o c a t i o n N u m b e r > - 
-         < G l o b a l L o c a t i o n N u m b e r _ L b l > G l o b a l L o c a t i o n N u m b e r _ L b l < / G l o b a l L o c a t i o n N u m b e r _ L b l > - 
-         < H o m e P a g e _ H e a d e r _ L b l > H o m e P a g e _ H e a d e r _ L b l < / H o m e P a g e _ H e a d e r _ L b l > - 
-         < L e g a l E n t i t y T y p e > L e g a l E n t i t y T y p e < / L e g a l E n t i t y T y p e > - 
-         < L e g a l E n t i t y T y p e _ L b l > L e g a l E n t i t y T y p e _ L b l < / L e g a l E n t i t y T y p e _ L b l > - 
-         < P a c k a g e T r a c k i n g N o > P a c k a g e T r a c k i n g N o < / P a c k a g e T r a c k i n g N o > - 
-         < P a c k a g e T r a c k i n g N o _ L b l > P a c k a g e T r a c k i n g N o _ L b l < / P a c k a g e T r a c k i n g N o _ L b l > - 
-         < P a g e _ L b l > P a g e _ L b l < / P a g e _ L b l > - 
-         < P r i c e s I n c l u d i n g V A T > P r i c e s I n c l u d i n g V A T < / P r i c e s I n c l u d i n g V A T > - 
-         < P r i c e s I n c l u d i n g V A T Y e s N o > P r i c e s I n c l u d i n g V A T Y e s N o < / P r i c e s I n c l u d i n g V A T Y e s N o > - 
-         < P r i c e s I n c l u d i n g V A T _ L b l > P r i c e s I n c l u d i n g V A T _ L b l < / P r i c e s I n c l u d i n g V A T _ L b l > - 
-         < Q u e s t i o n s _ L b l > Q u e s t i o n s _ L b l < / Q u e s t i o n s _ L b l > - 
-         < R e t u r n O r d e r N o > R e t u r n O r d e r N o < / R e t u r n O r d e r N o > - 
-         < R e t u r n O r d e r N o _ L b l > R e t u r n O r d e r N o _ L b l < / R e t u r n O r d e r N o _ L b l > - 
-         < R e t u r n R e c e i p t _ L b l > R e t u r n R e c e i p t _ L b l < / R e t u r n R e c e i p t _ L b l > - 
-         < S a l e s P e r s o n B l a n k _ L b l > S a l e s P e r s o n B l a n k _ L b l < / S a l e s P e r s o n B l a n k _ L b l > - 
-         < S a l e s P e r s o n N a m e > S a l e s P e r s o n N a m e < / S a l e s P e r s o n N a m e > - 
-         < S a l e s P e r s o n _ L b l > S a l e s P e r s o n _ L b l < / S a l e s P e r s o n _ L b l > - 
-         < S e l l T o C o n t a c t E m a i l > S e l l T o C o n t a c t E m a i l < / S e l l T o C o n t a c t E m a i l > - 
-         < S e l l T o C o n t a c t E m a i l L b l > S e l l T o C o n t a c t E m a i l L b l < / S e l l T o C o n t a c t E m a i l L b l > - 
-         < S e l l T o C o n t a c t M o b i l e P h o n e N o > S e l l T o C o n t a c t M o b i l e P h o n e N o < / S e l l T o C o n t a c t M o b i l e P h o n e N o > - 
-         < S e l l T o C o n t a c t M o b i l e P h o n e N o L b l > S e l l T o C o n t a c t M o b i l e P h o n e N o L b l < / S e l l T o C o n t a c t M o b i l e P h o n e N o L b l > - 
-         < S e l l T o C o n t a c t P h o n e N o > S e l l T o C o n t a c t P h o n e N o < / S e l l T o C o n t a c t P h o n e N o > - 
-         < S e l l T o C o n t a c t P h o n e N o L b l > S e l l T o C o n t a c t P h o n e N o L b l < / S e l l T o C o n t a c t P h o n e N o L b l > - 
-         < S e l l t o C u s t o m e r N o > S e l l t o C u s t o m e r N o < / S e l l t o C u s t o m e r N o > - 
-         < S e l l t o C u s t o m e r N o _ L b l > S e l l t o C u s t o m e r N o _ L b l < / S e l l t o C u s t o m e r N o _ L b l > - 
-         < S h i p m e n t D a t e > S h i p m e n t D a t e < / S h i p m e n t D a t e > - 
-         < S h i p m e n t D a t e _ L b l > S h i p m e n t D a t e _ L b l < / S h i p m e n t D a t e _ L b l > - 
-         < S h i p m e n t M e t h o d D e s c r i p t i o n > S h i p m e n t M e t h o d D e s c r i p t i o n < / S h i p m e n t M e t h o d D e s c r i p t i o n > - 
-         < S h i p m e n t M e t h o d D e s c r i p t i o n _ L b l > S h i p m e n t M e t h o d D e s c r i p t i o n _ L b l < / S h i p m e n t M e t h o d D e s c r i p t i o n _ L b l > - 
-         < S h i p p i n g A g e n t C o d e > S h i p p i n g A g e n t C o d e < / S h i p p i n g A g e n t C o d e > - 
-         < S h i p p i n g A g e n t C o d e _ L b l > S h i p p i n g A g e n t C o d e _ L b l < / S h i p p i n g A g e n t C o d e _ L b l > - 
-         < S h i p T o A d d r e s s 1 > S h i p T o A d d r e s s 1 < / S h i p T o A d d r e s s 1 > - 
-         < S h i p T o A d d r e s s 2 > S h i p T o A d d r e s s 2 < / S h i p T o A d d r e s s 2 > - 
-         < S h i p T o A d d r e s s 3 > S h i p T o A d d r e s s 3 < / S h i p T o A d d r e s s 3 > - 
-         < S h i p T o A d d r e s s 4 > S h i p T o A d d r e s s 4 < / S h i p T o A d d r e s s 4 > - 
-         < S h i p T o A d d r e s s 5 > S h i p T o A d d r e s s 5 < / S h i p T o A d d r e s s 5 > - 
-         < S h i p T o A d d r e s s 6 > S h i p T o A d d r e s s 6 < / S h i p T o A d d r e s s 6 > - 
-         < S h i p T o A d d r e s s 7 > S h i p T o A d d r e s s 7 < / S h i p T o A d d r e s s 7 > - 
-         < S h i p T o A d d r e s s 8 > S h i p T o A d d r e s s 8 < / S h i p T o A d d r e s s 8 > - 
-         < S h i p T o A d d r e s s _ L b l > S h i p T o A d d r e s s _ L b l < / S h i p T o A d d r e s s _ L b l > - 
-         < S h i p T o P h o n e N o > S h i p T o P h o n e N o < / S h i p T o P h o n e N o > - 
-         < S h o w C u s t A d d r e s s > S h o w C u s t A d d r e s s < / S h o w C u s t A d d r e s s > - 
-         < S u b t o t a l _ L b l > S u b t o t a l _ L b l < / S u b t o t a l _ L b l > - 
-         < T h a n k s _ L b l > T h a n k s _ L b l < / T h a n k s _ L b l > - 
-         < T o t a l _ L b l > T o t a l _ L b l < / T o t a l _ L b l > - 
-         < V A T R e g i s t r a t i o n N o > V A T R e g i s t r a t i o n N o < / V A T R e g i s t r a t i o n N o > - 
-         < V A T R e g i s t r a t i o n N o _ L b l > V A T R e g i s t r a t i o n N o _ L b l < / V A T R e g i s t r a t i o n N o _ L b l > - 
-         < Y o u r D o c u m e n t T i t l e _ L b l > Y o u r D o c u m e n t T i t l e _ L b l < / Y o u r D o c u m e n t T i t l e _ L b l > - 
-         < Y o u r R e f e r e n c e > Y o u r R e f e r e n c e < / Y o u r R e f e r e n c e > - 
-         < Y o u r R e f e r e n c e _ L b l > Y o u r R e f e r e n c e _ L b l < / Y o u r R e f e r e n c e _ L b l > - 
-         < L i n e > - 
-             < D e s c r i p t i o n _ L i n e > D e s c r i p t i o n _ L i n e < / D e s c r i p t i o n _ L i n e > - 
-             < D e s c r i p t i o n _ L i n e _ L b l > D e s c r i p t i o n _ L i n e _ L b l < / D e s c r i p t i o n _ L i n e _ L b l > - 
-             < I t e m N o _ L i n e > I t e m N o _ L i n e < / I t e m N o _ L i n e > - 
-             < I t e m N o _ L i n e _ L b l > I t e m N o _ L i n e _ L b l < / I t e m N o _ L i n e _ L b l > - 
-             < I t e m R e f e r e n c e N o _ L i n e > I t e m R e f e r e n c e N o _ L i n e < / I t e m R e f e r e n c e N o _ L i n e > - 
-             < I t e m R e f e r e n c e N o _ L i n e _ L b l > I t e m R e f e r e n c e N o _ L i n e _ L b l < / I t e m R e f e r e n c e N o _ L i n e _ L b l > - 
-             < L i n e N o _ L i n e > L i n e N o _ L i n e < / L i n e N o _ L i n e > - 
-             < Q t y _ L b l > Q t y _ L b l < / Q t y _ L b l > - 
-             < Q u a n t i t y _ L i n e > Q u a n t i t y _ L i n e < / Q u a n t i t y _ L i n e > - 
-             < Q u a n t i t y _ L i n e _ L b l > Q u a n t i t y _ L i n e _ L b l < / Q u a n t i t y _ L i n e _ L b l > - 
-             < S h i p m e n t D a t e _ L i n e > S h i p m e n t D a t e _ L i n e < / S h i p m e n t D a t e _ L i n e > - 
-             < S h i p m e n t D a t e _ L i n e _ L b l > S h i p m e n t D a t e _ L i n e _ L b l < / S h i p m e n t D a t e _ L i n e _ L b l > - 
-             < T y p e _ L i n e > T y p e _ L i n e < / T y p e _ L i n e > - 
-             < U n i t O f M e a s u r e > U n i t O f M e a s u r e < / U n i t O f M e a s u r e > - 
-             < U n i t O f M e a s u r e _ L b l > U n i t O f M e a s u r e _ L b l < / U n i t O f M e a s u r e _ L b l > - 
-             < U n i t _ L b l > U n i t _ L b l < / U n i t _ L b l > +     < T o o l t i p s > + 
+         < T o o l t i p   c o l u m n = " C o m p a n y H o m e P a g e "   E l e m e n t I d = " 1 9 8 9 1 8 8 7 0 " > + 
+             < T o o l t i p T e x t   l a n g = " e n - U S " > S p e c i f i e s   y o u r   c o m p a n y ' s   w e b   s i t e . < / T o o l t i p T e x t > + 
+         < / T o o l t i p > + 
+         < T o o l t i p   c o l u m n = " C o m p a n y E M a i l "   E l e m e n t I d = " 1 6 7 7 0 7 4 0 5 8 " > + 
+             < T o o l t i p T e x t   l a n g = " e n - U S " > S p e c i f i e s   t h e   c o m p a n y ' s   e m a i l   a d d r e s s . < / T o o l t i p T e x t > + 
+         < / T o o l t i p > + 
+         < T o o l t i p   c o l u m n = " C o m p a n y P i c t u r e "   E l e m e n t I d = " 1 3 9 7 4 1 1 0 7 4 " > + 
+             < T o o l t i p T e x t   l a n g = " e n - U S " > S p e c i f i e s   t h e   p i c t u r e   t h a t   h a s   b e e n   s e t   u p   f o r   t h e   c o m p a n y ,   s u c h   a s   a   c o m p a n y   l o g o . < / T o o l t i p T e x t > + 
+         < / T o o l t i p > + 
+         < T o o l t i p   c o l u m n = " C o m p a n y P h o n e N o "   E l e m e n t I d = " 2 5 0 4 4 0 6 5 5 " > + 
+             < T o o l t i p T e x t   l a n g = " e n - U S " > S p e c i f i e s   t h e   c o m p a n y ' s   t e l e p h o n e   n u m b e r . < / T o o l t i p T e x t > + 
+         < / T o o l t i p > + 
+         < T o o l t i p   c o l u m n = " C o m p a n y G i r o N o "   E l e m e n t I d = " 1 3 6 0 1 9 6 3 2 0 " > + 
+             < T o o l t i p T e x t   l a n g = " e n - U S " > S p e c i f i e s   t h e   c o m p a n y ' s   g i r o   n u m b e r . < / T o o l t i p T e x t > + 
+         < / T o o l t i p > + 
+         < T o o l t i p   c o l u m n = " C o m p a n y B a n k N a m e "   E l e m e n t I d = " 1 5 3 4 9 0 5 6 0 5 " > + 
+             < T o o l t i p T e x t   l a n g = " e n - U S " > S p e c i f i e s   t h e   n a m e   o f   t h e   b a n k   t h e   c o m p a n y   u s e s . < / T o o l t i p T e x t > + 
+         < / T o o l t i p > + 
+         < T o o l t i p   c o l u m n = " C o m p a n y B a n k B r a n c h N o "   E l e m e n t I d = " 7 9 3 1 3 3 0 5 7 " > + 
+             < T o o l t i p T e x t   l a n g = " e n - U S " > S p e c i f i e s   t h e   b a n k ' s   b r a n c h   n u m b e r . < / T o o l t i p T e x t > + 
+         < / T o o l t i p > + 
+         < T o o l t i p   c o l u m n = " C o m p a n y B a n k A c c o u n t N o "   E l e m e n t I d = " 3 0 1 4 0 2 0 4 " > + 
+             < T o o l t i p T e x t   l a n g = " e n - U S " > S p e c i f i e s   t h e   c o m p a n y ' s   b a n k   a c c o u n t   n u m b e r . < / T o o l t i p T e x t > + 
+         < / T o o l t i p > + 
+         < T o o l t i p   c o l u m n = " C o m p a n y I B A N "   E l e m e n t I d = " 9 0 6 5 4 9 1 8 2 " > + 
+             < T o o l t i p T e x t   l a n g = " e n - U S " > S p e c i f i e s   t h e   i n t e r n a t i o n a l   b a n k   a c c o u n t   n u m b e r   o f   y o u r   p r i m a r y   b a n k   a c c o u n t . < / T o o l t i p T e x t > + 
+         < / T o o l t i p > + 
+         < T o o l t i p   c o l u m n = " C o m p a n y S W I F T "   E l e m e n t I d = " 6 6 8 2 5 0 2 4 5 " > + 
+             < T o o l t i p T e x t   l a n g = " e n - U S " > S p e c i f i e s   t h e   S W I F T   c o d e   ( i n t e r n a t i o n a l   b a n k   i d e n t i f i e r   c o d e )   o f   y o u r   p r i m a r y   b a n k . < / T o o l t i p T e x t > + 
+         < / T o o l t i p > + 
+         < T o o l t i p   c o l u m n = " S h i p m e n t M e t h o d D e s c r i p t i o n "   E l e m e n t I d = " 2 0 5 9 4 0 3 2 6 0 " > + 
+             < T o o l t i p T e x t   l a n g = " e n - U S " > S p e c i f i e s   a   d e s c r i p t i o n   o f   t h e   s h i p m e n t   m e t h o d . < / T o o l t i p T e x t > + 
+         < / T o o l t i p > + 
+         < T o o l t i p   c o l u m n = " S h i p T o P h o n e N o "   E l e m e n t I d = " 3 6 9 7 0 2 2 5 5 " > + 
+             < T o o l t i p T e x t   l a n g = " e n - U S " > S p e c i f i e s   t h e   t e l e p h o n e   n u m b e r   o f   t h e   c o m p a n y ' s   s h i p p i n g   a d d r e s s . < / T o o l t i p T e x t > + 
+         < / T o o l t i p > + 
+         < T o o l t i p   c o l u m n = " S e l l T o C o n t a c t P h o n e N o "   E l e m e n t I d = " 1 6 1 3 8 2 2 4 8 3 " > + 
+             < T o o l t i p T e x t   l a n g = " e n - U S " > S p e c i f i e s   t h e   c o n t a c t ' s   p h o n e   n u m b e r . < / T o o l t i p T e x t > + 
+         < / T o o l t i p > + 
+         < T o o l t i p   c o l u m n = " S e l l T o C o n t a c t M o b i l e P h o n e N o "   E l e m e n t I d = " 1 8 4 3 5 8 7 4 7 " > + 
+             < T o o l t i p T e x t   l a n g = " e n - U S " > S p e c i f i e s   t h e   c o n t a c t ' s   m o b i l e   t e l e p h o n e   n u m b e r . < / T o o l t i p T e x t > + 
+         < / T o o l t i p > + 
+         < T o o l t i p   c o l u m n = " S e l l T o C o n t a c t E m a i l "   E l e m e n t I d = " 2 6 2 8 2 4 5 6 4 " > + 
+             < T o o l t i p T e x t   l a n g = " e n - U S " > S p e c i f i e s   t h e   e m a i l   a d d r e s s   o f   t h e   c o n t a c t . < / T o o l t i p T e x t > + 
+         < / T o o l t i p > + 
+         < T o o l t i p   c o l u m n = " B i l l T o C o n t a c t P h o n e N o "   E l e m e n t I d = " 3 6 2 4 7 7 4 8 8 " > + 
+             < T o o l t i p T e x t   l a n g = " e n - U S " > S p e c i f i e s   t h e   c o n t a c t ' s   p h o n e   n u m b e r . < / T o o l t i p T e x t > + 
+         < / T o o l t i p > + 
+         < T o o l t i p   c o l u m n = " B i l l T o C o n t a c t M o b i l e P h o n e N o "   E l e m e n t I d = " 2 4 8 4 8 8 6 9 6 " > + 
+             < T o o l t i p T e x t   l a n g = " e n - U S " > S p e c i f i e s   t h e   c o n t a c t ' s   m o b i l e   t e l e p h o n e   n u m b e r . < / T o o l t i p T e x t > + 
+         < / T o o l t i p > + 
+         < T o o l t i p   c o l u m n = " B i l l T o C o n t a c t E m a i l "   E l e m e n t I d = " 3 3 5 8 2 7 8 9 5 " > + 
+             < T o o l t i p T e x t   l a n g = " e n - U S " > S p e c i f i e s   t h e   e m a i l   a d d r e s s   o f   t h e   c o n t a c t . < / T o o l t i p T e x t > + 
+         < / T o o l t i p > + 
+         < T o o l t i p   c o l u m n = " B i l l t o C u s t u m e r N o "   E l e m e n t I d = " 2 8 0 4 7 3 0 5 8 " > + 
+             < T o o l t i p T e x t   l a n g = " e n - U S " > S p e c i f i e s   t h e   n u m b e r   o f   t h e   c u s t o m e r   t h a t   y o u   s e n d   o r   s e n t   t h e   c r e d i t   m e m o   t o . < / T o o l t i p T e x t > + 
+         < / T o o l t i p > + 
+         < T o o l t i p   c o l u m n = " D o c u m e n t N o "   E l e m e n t I d = " 9 7 0 3 5 0 5 3 9 " > + 
+             < T o o l t i p T e x t   l a n g = " e n - U S " > S p e c i f i e s   t h e   n u m b e r   o f   t h e   i n v o l v e d   e n t r y   o r   r e c o r d ,   a c c o r d i n g   t o   t h e   s p e c i f i e d   n u m b e r   s e r i e s . < / T o o l t i p T e x t > + 
+         < / T o o l t i p > + 
+         < T o o l t i p   c o l u m n = " R e t u r n O r d e r N o "   E l e m e n t I d = " 1 2 6 6 4 2 8 7 1 2 " > + 
+             < T o o l t i p T e x t   l a n g = " e n - U S " > S p e c i f i e s   t h e   n u m b e r   o f   t h e   r e t u r n   o r d e r   t h a t   w i l l   p o s t   a   r e t u r n   r e c e i p t . < / T o o l t i p T e x t > + 
+         < / T o o l t i p > + 
+         < T o o l t i p   c o l u m n = " S a l e s P e r s o n N a m e "   E l e m e n t I d = " 8 7 1 4 9 2 9 8 3 " > + 
+             < T o o l t i p T e x t   l a n g = " e n - U S " > S p e c i f i e s   t h e   n a m e   o f   t h e   s a l e s p e r s o n   o r   p u r c h a s e r . < / T o o l t i p T e x t > + 
+         < / T o o l t i p > + 
+         < T o o l t i p   c o l u m n = " S e l l t o C u s t o m e r N o "   E l e m e n t I d = " 2 0 5 0 6 4 7 3 4 9 " > + 
+             < T o o l t i p T e x t   l a n g = " e n - U S " > S p e c i f i e s   t h e   n u m b e r   o f   t h e   c u s t o m e r   w h o   r e t u r n e d   t h e   p r o d u c t s . < / T o o l t i p T e x t > + 
+         < / T o o l t i p > + 
+         < T o o l t i p   c o l u m n = " P a c k a g e T r a c k i n g N o "   E l e m e n t I d = " 1 2 4 4 8 2 6 1 5 9 " > + 
+             < T o o l t i p T e x t   l a n g = " e n - U S " > S p e c i f i e s   t h e   s h i p p i n g   a g e n t ' s   p a c k a g e   n u m b e r . < / T o o l t i p T e x t > + 
+         < / T o o l t i p > + 
+         < T o o l t i p   c o l u m n = " S h i p p i n g A g e n t C o d e "   E l e m e n t I d = " 1 6 7 0 1 5 5 2 6 9 " > + 
+             < T o o l t i p T e x t   l a n g = " e n - U S " > S p e c i f i e s   w h i c h   s h i p p i n g   a g e n t   i s   u s e d   t o   t r a n s p o r t   t h e   i t e m s   o n   t h e   s a l e s   d o c u m e n t   t o   t h e   c u s t o m e r . < / T o o l t i p T e x t > + 
+         < / T o o l t i p > + 
+         < T o o l t i p   c o l u m n = " E x t e r n a l D o c u m e n t N o "   E l e m e n t I d = " 7 3 3 9 5 3 9 6 6 " > + 
+             < T o o l t i p T e x t   l a n g = " e n - U S " > S p e c i f i e s   a   d o c u m e n t   n u m b e r   t h a t   r e f e r s   t o   t h e   c u s t o m e r ' s   o r   v e n d o r ' s   n u m b e r i n g   s y s t e m . < / T o o l t i p T e x t > + 
+         < / T o o l t i p > + 
+         < T o o l t i p   c o l u m n = " D e s c r i p t i o n _ L i n e "   E l e m e n t I d = " 1 4 0 6 8 2 2 3 1 0 " > + 
+             < T o o l t i p T e x t   l a n g = " e n - U S " > S p e c i f i e s   e i t h e r   t h e   n a m e   o f   o r   t h e   d e s c r i p t i o n   o f   t h e   i t e m ,   g e n e r a l   l e d g e r   a c c o u n t   o r   i t e m   c h a r g e . < / T o o l t i p T e x t > + 
+         < / T o o l t i p > + 
+         < T o o l t i p   c o l u m n = " I t e m N o _ L i n e "   E l e m e n t I d = " 1 9 1 0 2 9 6 2 8 8 " > + 
+             < T o o l t i p T e x t   l a n g = " e n - U S " > S p e c i f i e s   t h e   n u m b e r   o f   t h e   i n v o l v e d   e n t r y   o r   r e c o r d ,   a c c o r d i n g   t o   t h e   s p e c i f i e d   n u m b e r   s e r i e s . < / T o o l t i p T e x t > + 
+         < / T o o l t i p > + 
+         < T o o l t i p   c o l u m n = " I t e m R e f e r e n c e N o _ L i n e "   E l e m e n t I d = " 9 2 7 2 3 5 7 " > + 
+             < T o o l t i p T e x t   l a n g = " e n - U S " > S p e c i f i e s   t h e   r e f e r e n c e d   i t e m   n u m b e r . < / T o o l t i p T e x t > + 
+         < / T o o l t i p > + 
+         < T o o l t i p   c o l u m n = " U n i t O f M e a s u r e "   E l e m e n t I d = " 1 8 0 8 2 2 8 0 1 8 " > + 
+             < T o o l t i p T e x t   l a n g = " e n - U S " > S p e c i f i e s   t h e   n a m e   o f   t h e   i t e m   o r   r e s o u r c e ' s   u n i t   o f   m e a s u r e ,   s u c h   a s   p i e c e   o r   h o u r . < / T o o l t i p T e x t > + 
+         < / T o o l t i p > + 
+         < T o o l t i p   c o l u m n = " L e f t H e a d e r N a m e "   E l e m e n t I d = " 4 3 7 4 2 2 1 8 2 " > + 
+             < T o o l t i p T e x t   l a n g = " e n - U S " > S p e c i f i e s   t h e   n a m e . < / T o o l t i p T e x t > + 
+         < / T o o l t i p > + 
+         < T o o l t i p   c o l u m n = " L e f t H e a d e r V a l u e "   E l e m e n t I d = " 2 4 2 1 2 6 3 1 0 " > + 
+             < T o o l t i p T e x t   l a n g = " e n - U S " > S p e c i f i e s   t h e   v a l u e . < / T o o l t i p T e x t > + 
+         < / T o o l t i p > + 
+         < T o o l t i p   c o l u m n = " R i g h t H e a d e r N a m e "   E l e m e n t I d = " 8 9 8 2 8 7 5 7 " > + 
+             < T o o l t i p T e x t   l a n g = " e n - U S " > S p e c i f i e s   t h e   n a m e . < / T o o l t i p T e x t > + 
+         < / T o o l t i p > + 
+         < T o o l t i p   c o l u m n = " R i g h t H e a d e r V a l u e "   E l e m e n t I d = " 7 0 6 9 3 8 5 5 9 " > + 
+             < T o o l t i p T e x t   l a n g = " e n - U S " > S p e c i f i e s   t h e   v a l u e . < / T o o l t i p T e x t > + 
+         < / T o o l t i p > + 
+     < / T o o l t i p s > + 
+     < H e a d e r   E l e m e n t T y p e = " D a t a I t e m "   E l e m e n t I d = " 1 2 4 0 3 7 3 8 8 6 " > + 
+         < B i l l e d T o _ L b l   E l e m e n t T y p e = " C o l u m n "   E l e m e n t I d = " 1 7 4 5 4 4 9 0 7 9 "   D a t a T y p e = " L a b e l " > B i l l e d T o _ L b l < / B i l l e d T o _ L b l > + 
+         < B i l l t o A d d r e s s C a p t i o n   E l e m e n t T y p e = " C o l u m n "   E l e m e n t I d = " 8 7 9 5 9 7 4 9 "   D a t a T y p e = " L a b e l " > B i l l t o A d d r e s s C a p t i o n < / B i l l t o A d d r e s s C a p t i o n > + 
+         < B i l l T o C o n t a c t E m a i l   E l e m e n t T y p e = " C o l u m n "   E l e m e n t I d = " 3 3 5 8 2 7 8 9 5 "   D a t a T y p e = " T e x t " > B i l l T o C o n t a c t E m a i l < / B i l l T o C o n t a c t E m a i l > + 
+         < B i l l T o C o n t a c t E m a i l L b l   E l e m e n t T y p e = " C o l u m n "   E l e m e n t I d = " 2 9 6 4 7 8 3 6 5 "   D a t a T y p e = " L a b e l " > B i l l T o C o n t a c t E m a i l L b l < / B i l l T o C o n t a c t E m a i l L b l > + 
+         < B i l l T o C o n t a c t M o b i l e P h o n e N o   E l e m e n t T y p e = " C o l u m n "   E l e m e n t I d = " 2 4 8 4 8 8 6 9 6 "   D a t a T y p e = " T e x t " > B i l l T o C o n t a c t M o b i l e P h o n e N o < / B i l l T o C o n t a c t M o b i l e P h o n e N o > + 
+         < B i l l T o C o n t a c t M o b i l e P h o n e N o L b l   E l e m e n t T y p e = " C o l u m n "   E l e m e n t I d = " 2 7 6 3 1 1 3 3 8 "   D a t a T y p e = " L a b e l " > B i l l T o C o n t a c t M o b i l e P h o n e N o L b l < / B i l l T o C o n t a c t M o b i l e P h o n e N o L b l > + 
+         < B i l l T o C o n t a c t P h o n e N o   E l e m e n t T y p e = " C o l u m n "   E l e m e n t I d = " 3 6 2 4 7 7 4 8 8 "   D a t a T y p e = " T e x t " > B i l l T o C o n t a c t P h o n e N o < / B i l l T o C o n t a c t P h o n e N o > + 
+         < B i l l T o C o n t a c t P h o n e N o L b l   E l e m e n t T y p e = " C o l u m n "   E l e m e n t I d = " 2 1 2 3 3 4 5 9 6 6 "   D a t a T y p e = " L a b e l " > B i l l T o C o n t a c t P h o n e N o L b l < / B i l l T o C o n t a c t P h o n e N o L b l > + 
+         < B i l l t o C u s t o m e r N o _ L b l   E l e m e n t T y p e = " C o l u m n "   E l e m e n t I d = " 3 6 9 3 0 7 8 1 3 "   D a t a T y p e = " S t r i n g " > B i l l t o C u s t o m e r N o _ L b l < / B i l l t o C u s t o m e r N o _ L b l > + 
+         < B i l l t o C u s t u m e r N o   E l e m e n t T y p e = " C o l u m n "   E l e m e n t I d = " 2 8 0 4 7 3 0 5 8 "   D a t a T y p e = " C o d e " > B i l l t o C u s t u m e r N o < / B i l l t o C u s t u m e r N o > + 
+         < C o m p a n y A d d r e s s 1   E l e m e n t T y p e = " C o l u m n "   E l e m e n t I d = " 1 8 8 4 1 6 4 3 2 3 "   D a t a T y p e = " T e x t " > C o m p a n y A d d r e s s 1 < / C o m p a n y A d d r e s s 1 > + 
+         < C o m p a n y A d d r e s s 2   E l e m e n t T y p e = " C o l u m n "   E l e m e n t I d = " 1 2 4 6 4 6 7 7 0 6 "   D a t a T y p e = " T e x t " > C o m p a n y A d d r e s s 2 < / C o m p a n y A d d r e s s 2 > + 
+         < C o m p a n y A d d r e s s 3   E l e m e n t T y p e = " C o l u m n "   E l e m e n t I d = " 6 0 8 7 7 1 0 8 9 "   D a t a T y p e = " T e x t " > C o m p a n y A d d r e s s 3 < / C o m p a n y A d d r e s s 3 > + 
+         < C o m p a n y A d d r e s s 4   E l e m e n t T y p e = " C o l u m n "   E l e m e n t I d = " 7 7 7 6 8 0 1 1 2 "   D a t a T y p e = " T e x t " > C o m p a n y A d d r e s s 4 < / C o m p a n y A d d r e s s 4 > + 
+         < C o m p a n y A d d r e s s 5   E l e m e n t T y p e = " C o l u m n "   E l e m e n t I d = " 1 3 9 9 8 3 4 9 5 "   D a t a T y p e = " T e x t " > C o m p a n y A d d r e s s 5 < / C o m p a n y A d d r e s s 5 > + 
+         < C o m p a n y A d d r e s s 6   E l e m e n t T y p e = " C o l u m n "   E l e m e n t I d = " 4 9 7 7 1 3 1 2 2 "   D a t a T y p e = " T e x t " > C o m p a n y A d d r e s s 6 < / C o m p a n y A d d r e s s 6 > + 
+         < C o m p a n y A d d r e s s 7   E l e m e n t T y p e = " C o l u m n "   E l e m e n t I d = " 1 1 3 5 4 0 9 7 3 9 "   D a t a T y p e = " T e x t " > C o m p a n y A d d r e s s 7 < / C o m p a n y A d d r e s s 7 > + 
+         < C o m p a n y A d d r e s s 8   E l e m e n t T y p e = " C o l u m n "   E l e m e n t I d = " 1 7 1 5 2 5 5 3 0 0 "   D a t a T y p e = " T e x t " > C o m p a n y A d d r e s s 8 < / C o m p a n y A d d r e s s 8 > + 
+         < C o m p a n y B a n k A c c o u n t N o   E l e m e n t T y p e = " C o l u m n "   E l e m e n t I d = " 3 0 1 4 0 2 0 4 "   D a t a T y p e = " T e x t " > C o m p a n y B a n k A c c o u n t N o < / C o m p a n y B a n k A c c o u n t N o > + 
+         < C o m p a n y B a n k A c c o u n t N o _ L b l   E l e m e n t T y p e = " C o l u m n "   E l e m e n t I d = " 1 0 9 7 7 4 3 3 4 5 "   D a t a T y p e = " L a b e l " > C o m p a n y B a n k A c c o u n t N o _ L b l < / C o m p a n y B a n k A c c o u n t N o _ L b l > + 
+         < C o m p a n y B a n k B r a n c h N o   E l e m e n t T y p e = " C o l u m n "   E l e m e n t I d = " 7 9 3 1 3 3 0 5 7 "   D a t a T y p e = " T e x t " > C o m p a n y B a n k B r a n c h N o < / C o m p a n y B a n k B r a n c h N o > + 
+         < C o m p a n y B a n k B r a n c h N o _ L b l   E l e m e n t T y p e = " C o l u m n "   E l e m e n t I d = " 3 2 7 9 0 6 6 9 2 "   D a t a T y p e = " S t r i n g " > C o m p a n y B a n k B r a n c h N o _ L b l < / C o m p a n y B a n k B r a n c h N o _ L b l > + 
+         < C o m p a n y B a n k N a m e   E l e m e n t T y p e = " C o l u m n "   E l e m e n t I d = " 1 5 3 4 9 0 5 6 0 5 "   D a t a T y p e = " T e x t " > C o m p a n y B a n k N a m e < / C o m p a n y B a n k N a m e > + 
+         < C o m p a n y B a n k N a m e _ L b l   E l e m e n t T y p e = " C o l u m n "   E l e m e n t I d = " 1 2 0 4 3 0 7 0 1 4 "   D a t a T y p e = " L a b e l " > C o m p a n y B a n k N a m e _ L b l < / C o m p a n y B a n k N a m e _ L b l > + 
+         < C o m p a n y C u s t o m G i r o   E l e m e n t T y p e = " C o l u m n "   E l e m e n t I d = " 1 6 7 0 4 7 5 7 9 8 "   D a t a T y p e = " T e x t " > C o m p a n y C u s t o m G i r o < / C o m p a n y C u s t o m G i r o > + 
+         < C o m p a n y C u s t o m G i r o _ L b l   E l e m e n t T y p e = " C o l u m n "   E l e m e n t I d = " 8 9 1 4 3 9 6 2 5 "   D a t a T y p e = " T e x t " > C o m p a n y C u s t o m G i r o _ L b l < / C o m p a n y C u s t o m G i r o _ L b l > + 
+         < C o m p a n y E M a i l   E l e m e n t T y p e = " C o l u m n "   E l e m e n t I d = " 1 6 7 7 0 7 4 0 5 8 "   D a t a T y p e = " T e x t " > C o m p a n y E M a i l < / C o m p a n y E M a i l > + 
+         < C o m p a n y G i r o N o   E l e m e n t T y p e = " C o l u m n "   E l e m e n t I d = " 1 3 6 0 1 9 6 3 2 0 "   D a t a T y p e = " T e x t " > C o m p a n y G i r o N o < / C o m p a n y G i r o N o > + 
+         < C o m p a n y G i r o N o _ L b l   E l e m e n t T y p e = " C o l u m n "   E l e m e n t I d = " 8 6 1 6 0 2 1 1 5 "   D a t a T y p e = " L a b e l " > C o m p a n y G i r o N o _ L b l < / C o m p a n y G i r o N o _ L b l > + 
+         < C o m p a n y H o m e P a g e   E l e m e n t T y p e = " C o l u m n "   E l e m e n t I d = " 1 9 8 9 1 8 8 7 0 "   D a t a T y p e = " T e x t " > C o m p a n y H o m e P a g e < / C o m p a n y H o m e P a g e > + 
+         < C o m p a n y I B A N   E l e m e n t T y p e = " C o l u m n "   E l e m e n t I d = " 9 0 6 5 4 9 1 8 2 "   D a t a T y p e = " C o d e " > C o m p a n y I B A N < / C o m p a n y I B A N > + 
+         < C o m p a n y I B A N _ L b l   E l e m e n t T y p e = " C o l u m n "   E l e m e n t I d = " 1 2 6 7 9 5 2 2 2 7 "   D a t a T y p e = " S t r i n g " > C o m p a n y I B A N _ L b l < / C o m p a n y I B A N _ L b l > + 
+         < C o m p a n y L e g a l O f f i c e   E l e m e n t T y p e = " C o l u m n "   E l e m e n t I d = " 7 1 4 2 5 8 1 1 1 "   D a t a T y p e = " T e x t " > C o m p a n y L e g a l O f f i c e < / C o m p a n y L e g a l O f f i c e > + 
+         < C o m p a n y L e g a l O f f i c e _ L b l   E l e m e n t T y p e = " C o l u m n "   E l e m e n t I d = " 1 5 3 3 1 7 5 1 0 8 "   D a t a T y p e = " T e x t " > C o m p a n y L e g a l O f f i c e _ L b l < / C o m p a n y L e g a l O f f i c e _ L b l > + 
+         < C o m p a n y L e g a l S t a t e m e n t   E l e m e n t T y p e = " C o l u m n "   E l e m e n t I d = " 4 4 8 3 5 8 8 7 6 "   D a t a T y p e = " T e x t " > C o m p a n y L e g a l S t a t e m e n t < / C o m p a n y L e g a l S t a t e m e n t > + 
+         < C o m p a n y L o g o P o s i t i o n   E l e m e n t T y p e = " C o l u m n "   E l e m e n t I d = " 1 4 2 5 2 6 6 6 8 8 "   D a t a T y p e = " I n t e g e r " > C o m p a n y L o g o P o s i t i o n < / C o m p a n y L o g o P o s i t i o n > + 
+         < C o m p a n y P h o n e N o   E l e m e n t T y p e = " C o l u m n "   E l e m e n t I d = " 2 5 0 4 4 0 6 5 5 "   D a t a T y p e = " T e x t " > C o m p a n y P h o n e N o < / C o m p a n y P h o n e N o > + 
+         < C o m p a n y P h o n e N o _ L b l   E l e m e n t T y p e = " C o l u m n "   E l e m e n t I d = " 5 5 8 5 9 3 5 8 6 "   D a t a T y p e = " L a b e l " > C o m p a n y P h o n e N o _ L b l < / C o m p a n y P h o n e N o _ L b l > + 
+         < C o m p a n y P i c t u r e   E l e m e n t T y p e = " C o l u m n "   E l e m e n t I d = " 1 3 9 7 4 1 1 0 7 4 "   D a t a T y p e = " B l o b " / > + 
+         < C o m p a n y R e g i s t r a t i o n N u m b e r   E l e m e n t T y p e = " C o l u m n "   E l e m e n t I d = " 2 0 2 3 6 3 9 4 2 4 "   D a t a T y p e = " T e x t " > C o m p a n y R e g i s t r a t i o n N u m b e r < / C o m p a n y R e g i s t r a t i o n N u m b e r > + 
+         < C o m p a n y R e g i s t r a t i o n N u m b e r _ L b l   E l e m e n t T y p e = " C o l u m n "   E l e m e n t I d = " 1 8 3 3 1 0 6 6 5 3 "   D a t a T y p e = " T e x t " > C o m p a n y R e g i s t r a t i o n N u m b e r _ L b l < / C o m p a n y R e g i s t r a t i o n N u m b e r _ L b l > + 
+         < C o m p a n y S W I F T   E l e m e n t T y p e = " C o l u m n "   E l e m e n t I d = " 6 6 8 2 5 0 2 4 5 "   D a t a T y p e = " C o d e " > C o m p a n y S W I F T < / C o m p a n y S W I F T > + 
+         < C o m p a n y S W I F T _ L b l   E l e m e n t T y p e = " C o l u m n "   E l e m e n t I d = " 2 0 2 9 5 9 7 3 8 4 "   D a t a T y p e = " S t r i n g " > C o m p a n y S W I F T _ L b l < / C o m p a n y S W I F T _ L b l > + 
+         < C o m p a n y V A T R e g i s t r a t i o n N o   E l e m e n t T y p e = " C o l u m n "   E l e m e n t I d = " 1 9 1 4 0 1 3 6 4 9 "   D a t a T y p e = " T e x t " > C o m p a n y V A T R e g i s t r a t i o n N o < / C o m p a n y V A T R e g i s t r a t i o n N o > + 
+         < C o m p a n y V A T R e g i s t r a t i o n N o _ L b l   E l e m e n t T y p e = " C o l u m n "   E l e m e n t I d = " 9 2 4 5 0 3 1 2 4 "   D a t a T y p e = " T e x t " > C o m p a n y V A T R e g i s t r a t i o n N o _ L b l < / C o m p a n y V A T R e g i s t r a t i o n N o _ L b l > + 
+         < C o m p a n y V A T R e g N o   E l e m e n t T y p e = " C o l u m n "   E l e m e n t I d = " 1 7 1 4 3 1 9 3 6 "   D a t a T y p e = " T e x t " > C o m p a n y V A T R e g N o < / C o m p a n y V A T R e g N o > + 
+         < C o m p a n y V A T R e g N o _ L b l   E l e m e n t T y p e = " C o l u m n "   E l e m e n t I d = " 7 7 3 2 0 1 5 0 1 "   D a t a T y p e = " T e x t " > C o m p a n y V A T R e g N o _ L b l < / C o m p a n y V A T R e g N o _ L b l > + 
+         < C o n t a c t _ L b l   E l e m e n t T y p e = " C o l u m n "   E l e m e n t I d = " 1 1 5 5 0 9 4 7 5 2 "   D a t a T y p e = " T e x t " > C o n t a c t _ L b l < / C o n t a c t _ L b l > + 
+         < C o p y _ L b l   E l e m e n t T y p e = " C o l u m n "   E l e m e n t I d = " 6 0 4 7 8 2 7 8 1 "   D a t a T y p e = " L a b e l " > C o p y _ L b l < / C o p y _ L b l > + 
+         < C u s t o m e r A d d r e s s 1   E l e m e n t T y p e = " C o l u m n "   E l e m e n t I d = " 1 8 0 1 9 6 6 4 5 4 "   D a t a T y p e = " T e x t " > C u s t o m e r A d d r e s s 1 < / C u s t o m e r A d d r e s s 1 > + 
+         < C u s t o m e r A d d r e s s 2   E l e m e n t T y p e = " C o l u m n "   E l e m e n t I d = " 1 1 6 4 2 6 9 8 3 7 "   D a t a T y p e = " T e x t " > C u s t o m e r A d d r e s s 2 < / C u s t o m e r A d d r e s s 2 > + 
+         < C u s t o m e r A d d r e s s 3   E l e m e n t T y p e = " C o l u m n "   E l e m e n t I d = " 5 2 6 5 7 3 2 2 0 "   D a t a T y p e = " T e x t " > C u s t o m e r A d d r e s s 3 < / C u s t o m e r A d d r e s s 3 > + 
+         < C u s t o m e r A d d r e s s 4   E l e m e n t T y p e = " C o l u m n "   E l e m e n t I d = " 1 1 1 1 2 3 3 9 7 "   D a t a T y p e = " T e x t " > C u s t o m e r A d d r e s s 4 < / C u s t o m e r A d d r e s s 4 > + 
+         < C u s t o m e r A d d r e s s 5   E l e m e n t T y p e = " C o l u m n "   E l e m e n t I d = " 7 4 8 8 2 0 0 1 4 "   D a t a T y p e = " T e x t " > C u s t o m e r A d d r e s s 5 < / C u s t o m e r A d d r e s s 5 > + 
+         < C u s t o m e r A d d r e s s 6   E l e m e n t T y p e = " C o l u m n "   E l e m e n t I d = " 1 3 8 6 5 1 6 6 3 1 "   D a t a T y p e = " T e x t " > C u s t o m e r A d d r e s s 6 < / C u s t o m e r A d d r e s s 6 > + 
+         < C u s t o m e r A d d r e s s 7   E l e m e n t T y p e = " C o l u m n "   E l e m e n t I d = " 2 0 2 4 2 1 3 2 4 8 "   D a t a T y p e = " T e x t " > C u s t o m e r A d d r e s s 7 < / C u s t o m e r A d d r e s s 7 > + 
+         < C u s t o m e r A d d r e s s 8   E l e m e n t T y p e = " C o l u m n "   E l e m e n t I d = " 1 0 4 8 6 9 8 5 8 5 "   D a t a T y p e = " T e x t " > C u s t o m e r A d d r e s s 8 < / C u s t o m e r A d d r e s s 8 > + 
+         < C u s t o m e r P o s t a l B a r C o d e   E l e m e n t T y p e = " C o l u m n "   E l e m e n t I d = " 3 9 8 5 8 0 6 8 8 "   D a t a T y p e = " T e x t " > C u s t o m e r P o s t a l B a r C o d e < / C u s t o m e r P o s t a l B a r C o d e > + 
+         < D o c u m e n t D a t e   E l e m e n t T y p e = " C o l u m n "   E l e m e n t I d = " 5 5 2 8 7 1 9 1 4 "   D a t a T y p e = " S t r i n g " > D o c u m e n t D a t e < / D o c u m e n t D a t e > + 
+         < D o c u m e n t D a t e _ L b l   E l e m e n t T y p e = " C o l u m n "   E l e m e n t I d = " 1 0 2 6 4 9 4 8 3 "   D a t a T y p e = " S t r i n g " > D o c u m e n t D a t e _ L b l < / D o c u m e n t D a t e _ L b l > + 
+         < D o c u m e n t N o   E l e m e n t T y p e = " C o l u m n "   E l e m e n t I d = " 9 7 0 3 5 0 5 3 9 "   D a t a T y p e = " C o d e " > D o c u m e n t N o < / D o c u m e n t N o > + 
+         < D o c u m e n t N o _ L b l   E l e m e n t T y p e = " C o l u m n "   E l e m e n t I d = " 7 8 9 7 9 5 9 7 8 "   D a t a T y p e = " L a b e l " > D o c u m e n t N o _ L b l < / D o c u m e n t N o _ L b l > + 
+         < D o c u m e n t T i t l e _ L b l   E l e m e n t T y p e = " C o l u m n "   E l e m e n t I d = " 8 5 8 4 2 3 9 2 9 "   D a t a T y p e = " T e x t " > D o c u m e n t T i t l e _ L b l < / D o c u m e n t T i t l e _ L b l > + 
+         < D u e D a t e   E l e m e n t T y p e = " C o l u m n "   E l e m e n t I d = " 7 4 5 1 7 0 2 0 3 "   D a t a T y p e = " S t r i n g " > D u e D a t e < / D u e D a t e > + 
+         < D u e D a t e _ L b l   E l e m e n t T y p e = " C o l u m n "   E l e m e n t I d = " 1 6 4 8 2 8 4 6 4 8 "   D a t a T y p e = " S t r i n g " > D u e D a t e _ L b l < / D u e D a t e _ L b l > + 
+         < E M a i l _ H e a d e r _ L b l   E l e m e n t T y p e = " C o l u m n "   E l e m e n t I d = " 5 1 3 1 7 0 8 0 4 "   D a t a T y p e = " L a b e l " > E M a i l _ H e a d e r _ L b l < / E M a i l _ H e a d e r _ L b l > + 
+         < E x t e r n a l D o c u m e n t N o   E l e m e n t T y p e = " C o l u m n "   E l e m e n t I d = " 7 3 3 9 5 3 9 6 6 "   D a t a T y p e = " C o d e " > E x t e r n a l D o c u m e n t N o < / E x t e r n a l D o c u m e n t N o > + 
+         < E x t e r n a l D o c u m e n t N o _ L b l   E l e m e n t T y p e = " C o l u m n "   E l e m e n t I d = " 4 2 3 3 1 2 2 6 9 "   D a t a T y p e = " S t r i n g " > E x t e r n a l D o c u m e n t N o _ L b l < / E x t e r n a l D o c u m e n t N o _ L b l > + 
+         < F r o m _ L b l   E l e m e n t T y p e = " C o l u m n "   E l e m e n t I d = " 4 8 5 4 2 6 1 3 8 "   D a t a T y p e = " L a b e l " > F r o m _ L b l < / F r o m _ L b l > + 
+         < G l o b a l L o c a t i o n N u m b e r   E l e m e n t T y p e = " C o l u m n "   E l e m e n t I d = " 1 5 0 0 3 7 2 8 0 0 "   D a t a T y p e = " T e x t " > G l o b a l L o c a t i o n N u m b e r < / G l o b a l L o c a t i o n N u m b e r > + 
+         < G l o b a l L o c a t i o n N u m b e r _ L b l   E l e m e n t T y p e = " C o l u m n "   E l e m e n t I d = " 1 7 5 0 9 1 3 8 9 1 "   D a t a T y p e = " T e x t " > G l o b a l L o c a t i o n N u m b e r _ L b l < / G l o b a l L o c a t i o n N u m b e r _ L b l > + 
+         < H o m e P a g e _ H e a d e r _ L b l   E l e m e n t T y p e = " C o l u m n "   E l e m e n t I d = " 1 8 7 9 7 2 5 0 8 4 "   D a t a T y p e = " L a b e l " > H o m e P a g e _ H e a d e r _ L b l < / H o m e P a g e _ H e a d e r _ L b l > + 
+         < L e g a l E n t i t y T y p e   E l e m e n t T y p e = " C o l u m n "   E l e m e n t I d = " 2 0 5 1 8 7 3 5 6 3 "   D a t a T y p e = " T e x t " > L e g a l E n t i t y T y p e < / L e g a l E n t i t y T y p e > + 
+         < L e g a l E n t i t y T y p e _ L b l   E l e m e n t T y p e = " C o l u m n "   E l e m e n t I d = " 2 0 8 0 2 2 4 7 9 2 "   D a t a T y p e = " T e x t " > L e g a l E n t i t y T y p e _ L b l < / L e g a l E n t i t y T y p e _ L b l > + 
+         < P a c k a g e T r a c k i n g N o   E l e m e n t T y p e = " C o l u m n "   E l e m e n t I d = " 1 2 4 4 8 2 6 1 5 9 "   D a t a T y p e = " T e x t " > P a c k a g e T r a c k i n g N o < / P a c k a g e T r a c k i n g N o > + 
+         < P a c k a g e T r a c k i n g N o _ L b l   E l e m e n t T y p e = " C o l u m n "   E l e m e n t I d = " 2 1 9 3 5 6 7 5 6 "   D a t a T y p e = " S t r i n g " > P a c k a g e T r a c k i n g N o _ L b l < / P a c k a g e T r a c k i n g N o _ L b l > + 
+         < P a g e _ L b l   E l e m e n t T y p e = " C o l u m n "   E l e m e n t I d = " 6 8 0 6 4 8 0 9 1 "   D a t a T y p e = " L a b e l " > P a g e _ L b l < / P a g e _ L b l > + 
+         < P r i c e s I n c l u d i n g V A T   E l e m e n t T y p e = " C o l u m n "   E l e m e n t I d = " 5 1 8 8 1 7 1 6 7 "   D a t a T y p e = " B o o l e a n " > P r i c e s I n c l u d i n g V A T < / P r i c e s I n c l u d i n g V A T > + 
+         < P r i c e s I n c l u d i n g V A T Y e s N o   E l e m e n t T y p e = " C o l u m n "   E l e m e n t I d = " 1 4 1 1 1 4 7 5 9 9 "   D a t a T y p e = " S t r i n g " > P r i c e s I n c l u d i n g V A T Y e s N o < / P r i c e s I n c l u d i n g V A T Y e s N o > + 
+         < P r i c e s I n c l u d i n g V A T _ L b l   E l e m e n t T y p e = " C o l u m n "   E l e m e n t I d = " 1 3 7 7 9 7 9 4 4 4 "   D a t a T y p e = " S t r i n g " > P r i c e s I n c l u d i n g V A T _ L b l < / P r i c e s I n c l u d i n g V A T _ L b l > + 
+         < Q u e s t i o n s _ L b l   E l e m e n t T y p e = " C o l u m n "   E l e m e n t I d = " 2 0 7 0 8 9 0 0 1 9 "   D a t a T y p e = " L a b e l " > Q u e s t i o n s _ L b l < / Q u e s t i o n s _ L b l > + 
+         < R e t u r n O r d e r N o   E l e m e n t T y p e = " C o l u m n "   E l e m e n t I d = " 1 2 6 6 4 2 8 7 1 2 "   D a t a T y p e = " C o d e " > R e t u r n O r d e r N o < / R e t u r n O r d e r N o > + 
+         < R e t u r n O r d e r N o _ L b l   E l e m e n t T y p e = " C o l u m n "   E l e m e n t I d = " 1 1 6 3 3 8 1 0 1 "   D a t a T y p e = " S t r i n g " > R e t u r n O r d e r N o _ L b l < / R e t u r n O r d e r N o _ L b l > + 
+         < R e t u r n R e c e i p t _ L b l   E l e m e n t T y p e = " C o l u m n "   E l e m e n t I d = " 4 0 3 4 7 9 1 7 8 "   D a t a T y p e = " L a b e l " > R e t u r n R e c e i p t _ L b l < / R e t u r n R e c e i p t _ L b l > + 
+         < S a l e s P e r s o n B l a n k _ L b l   E l e m e n t T y p e = " C o l u m n "   E l e m e n t I d = " 6 5 4 6 2 4 6 0 1 "   D a t a T y p e = " T e x t " > S a l e s P e r s o n B l a n k _ L b l < / S a l e s P e r s o n B l a n k _ L b l > + 
+         < S a l e s P e r s o n N a m e   E l e m e n t T y p e = " C o l u m n "   E l e m e n t I d = " 8 7 1 4 9 2 9 8 3 "   D a t a T y p e = " T e x t " > S a l e s P e r s o n N a m e < / S a l e s P e r s o n N a m e > + 
+         < S a l e s P e r s o n _ L b l   E l e m e n t T y p e = " C o l u m n "   E l e m e n t I d = " 1 5 6 4 1 9 6 3 6 5 "   D a t a T y p e = " L a b e l " > S a l e s P e r s o n _ L b l < / S a l e s P e r s o n _ L b l > + 
+         < S e l l T o C o n t a c t E m a i l   E l e m e n t T y p e = " C o l u m n "   E l e m e n t I d = " 2 6 2 8 2 4 5 6 4 "   D a t a T y p e = " T e x t " > S e l l T o C o n t a c t E m a i l < / S e l l T o C o n t a c t E m a i l > + 
+         < S e l l T o C o n t a c t E m a i l L b l   E l e m e n t T y p e = " C o l u m n "   E l e m e n t I d = " 3 7 0 9 2 0 3 7 4 "   D a t a T y p e = " L a b e l " > S e l l T o C o n t a c t E m a i l L b l < / S e l l T o C o n t a c t E m a i l L b l > + 
+         < S e l l T o C o n t a c t M o b i l e P h o n e N o   E l e m e n t T y p e = " C o l u m n "   E l e m e n t I d = " 1 8 4 3 5 8 7 4 7 "   D a t a T y p e = " T e x t " > S e l l T o C o n t a c t M o b i l e P h o n e N o < / S e l l T o C o n t a c t M o b i l e P h o n e N o > + 
+         < S e l l T o C o n t a c t M o b i l e P h o n e N o L b l   E l e m e n t T y p e = " C o l u m n "   E l e m e n t I d = " 1 4 5 7 5 2 8 4 1 7 "   D a t a T y p e = " L a b e l " > S e l l T o C o n t a c t M o b i l e P h o n e N o L b l < / S e l l T o C o n t a c t M o b i l e P h o n e N o L b l > + 
+         < S e l l T o C o n t a c t P h o n e N o   E l e m e n t T y p e = " C o l u m n "   E l e m e n t I d = " 1 6 1 3 8 2 2 4 8 3 "   D a t a T y p e = " T e x t " > S e l l T o C o n t a c t P h o n e N o < / S e l l T o C o n t a c t P h o n e N o > + 
+         < S e l l T o C o n t a c t P h o n e N o L b l   E l e m e n t T y p e = " C o l u m n "   E l e m e n t I d = " 1 0 5 0 6 8 6 8 0 9 "   D a t a T y p e = " L a b e l " > S e l l T o C o n t a c t P h o n e N o L b l < / S e l l T o C o n t a c t P h o n e N o L b l > + 
+         < S e l l t o C u s t o m e r N o   E l e m e n t T y p e = " C o l u m n "   E l e m e n t I d = " 2 0 5 0 6 4 7 3 4 9 "   D a t a T y p e = " C o d e " > S e l l t o C u s t o m e r N o < / S e l l t o C u s t o m e r N o > + 
+         < S e l l t o C u s t o m e r N o _ L b l   E l e m e n t T y p e = " C o l u m n "   E l e m e n t I d = " 2 9 8 3 8 1 5 1 2 "   D a t a T y p e = " S t r i n g " > S e l l t o C u s t o m e r N o _ L b l < / S e l l t o C u s t o m e r N o _ L b l > + 
+         < S h i p m e n t D a t e   E l e m e n t T y p e = " C o l u m n "   E l e m e n t I d = " 9 3 1 1 1 1 4 6 5 "   D a t a T y p e = " S t r i n g " > S h i p m e n t D a t e < / S h i p m e n t D a t e > + 
+         < S h i p m e n t D a t e _ L b l   E l e m e n t T y p e = " C o l u m n "   E l e m e n t I d = " 6 1 4 4 0 0 3 6 4 "   D a t a T y p e = " S t r i n g " > S h i p m e n t D a t e _ L b l < / S h i p m e n t D a t e _ L b l > + 
+         < S h i p m e n t M e t h o d D e s c r i p t i o n   E l e m e n t T y p e = " C o l u m n "   E l e m e n t I d = " 2 0 5 9 4 0 3 2 6 0 "   D a t a T y p e = " T e x t " > S h i p m e n t M e t h o d D e s c r i p t i o n < / S h i p m e n t M e t h o d D e s c r i p t i o n > + 
+         < S h i p m e n t M e t h o d D e s c r i p t i o n _ L b l   E l e m e n t T y p e = " C o l u m n "   E l e m e n t I d = " 1 1 7 9 9 7 8 4 6 5 "   D a t a T y p e = " L a b e l " > S h i p m e n t M e t h o d D e s c r i p t i o n _ L b l < / S h i p m e n t M e t h o d D e s c r i p t i o n _ L b l > + 
+         < S h i p p i n g A g e n t C o d e   E l e m e n t T y p e = " C o l u m n "   E l e m e n t I d = " 1 6 7 0 1 5 5 2 6 9 "   D a t a T y p e = " C o d e " > S h i p p i n g A g e n t C o d e < / S h i p p i n g A g e n t C o d e > + 
+         < S h i p p i n g A g e n t C o d e _ L b l   E l e m e n t T y p e = " C o l u m n "   E l e m e n t I d = " 1 1 5 3 2 0 1 3 4 "   D a t a T y p e = " S t r i n g " > S h i p p i n g A g e n t C o d e _ L b l < / S h i p p i n g A g e n t C o d e _ L b l > + 
+         < S h i p T o A d d r e s s 1   E l e m e n t T y p e = " C o l u m n "   E l e m e n t I d = " 1 3 5 7 6 7 2 8 6 1 "   D a t a T y p e = " T e x t " > S h i p T o A d d r e s s 1 < / S h i p T o A d d r e s s 1 > + 
+         < S h i p T o A d d r e s s 2   E l e m e n t T y p e = " C o l u m n "   E l e m e n t I d = " 1 0 2 4 2 0 4 5 8 4 "   D a t a T y p e = " T e x t " > S h i p T o A d d r e s s 2 < / S h i p T o A d d r e s s 2 > + 
+         < S h i p T o A d d r e s s 3   E l e m e n t T y p e = " C o l u m n "   E l e m e n t I d = " 1 6 6 1 9 0 1 2 0 1 "   D a t a T y p e = " T e x t " > S h i p T o A d d r e s s 3 < / S h i p T o A d d r e s s 3 > + 
+         < S h i p T o A d d r e s s 4   E l e m e n t T y p e = " C o l u m n "   E l e m e n t I d = " 5 5 5 4 1 6 9 9 0 "   D a t a T y p e = " T e x t " > S h i p T o A d d r e s s 4 < / S h i p T o A d d r e s s 4 > + 
+         < S h i p T o A d d r e s s 5   E l e m e n t T y p e = " C o l u m n "   E l e m e n t I d = " 1 1 9 3 1 1 3 6 0 7 "   D a t a T y p e = " T e x t " > S h i p T o A d d r e s s 5 < / S h i p T o A d d r e s s 5 > + 
+         < S h i p T o A d d r e s s 6   E l e m e n t T y p e = " C o l u m n "   E l e m e n t I d = " 7 1 9 9 7 6 2 4 4 "   D a t a T y p e = " T e x t " > S h i p T o A d d r e s s 6 < / S h i p T o A d d r e s s 6 > + 
+         < S h i p T o A d d r e s s 7   E l e m e n t T y p e = " C o l u m n "   E l e m e n t I d = " 8 2 2 7 9 6 2 7 "   D a t a T y p e = " T e x t " > S h i p T o A d d r e s s 7 < / S h i p T o A d d r e s s 7 > + 
+         < S h i p T o A d d r e s s 8   E l e m e n t T y p e = " C o l u m n "   E l e m e n t I d = " 1 4 9 2 9 9 2 1 7 8 "   D a t a T y p e = " T e x t " > S h i p T o A d d r e s s 8 < / S h i p T o A d d r e s s 8 > + 
+         < S h i p T o A d d r e s s _ L b l   E l e m e n t T y p e = " C o l u m n "   E l e m e n t I d = " 1 6 5 0 5 0 5 0 1 7 "   D a t a T y p e = " L a b e l " > S h i p T o A d d r e s s _ L b l < / S h i p T o A d d r e s s _ L b l > + 
+         < S h i p T o P h o n e N o   E l e m e n t T y p e = " C o l u m n "   E l e m e n t I d = " 3 6 9 7 0 2 2 5 5 "   D a t a T y p e = " T e x t " > S h i p T o P h o n e N o < / S h i p T o P h o n e N o > + 
+         < S h o w C u s t A d d r e s s   E l e m e n t T y p e = " C o l u m n "   E l e m e n t I d = " 7 6 1 8 0 5 5 6 7 "   D a t a T y p e = " B o o l e a n " > S h o w C u s t A d d r e s s < / S h o w C u s t A d d r e s s > + 
+         < S u b t o t a l _ L b l   E l e m e n t T y p e = " C o l u m n "   E l e m e n t I d = " 1 9 6 7 7 9 5 1 4 2 "   D a t a T y p e = " L a b e l " > S u b t o t a l _ L b l < / S u b t o t a l _ L b l > + 
+         < T h a n k s _ L b l   E l e m e n t T y p e = " C o l u m n "   E l e m e n t I d = " 2 1 0 3 3 0 5 5 2 5 "   D a t a T y p e = " L a b e l " > T h a n k s _ L b l < / T h a n k s _ L b l > + 
+         < T o t a l _ L b l   E l e m e n t T y p e = " C o l u m n "   E l e m e n t I d = " 1 2 1 0 1 0 0 8 7 8 "   D a t a T y p e = " L a b e l " > T o t a l _ L b l < / T o t a l _ L b l > + 
+         < V A T R e g i s t r a t i o n N o   E l e m e n t T y p e = " C o l u m n "   E l e m e n t I d = " 1 8 8 9 1 9 5 4 0 2 "   D a t a T y p e = " T e x t " > V A T R e g i s t r a t i o n N o < / V A T R e g i s t r a t i o n N o > + 
+         < V A T R e g i s t r a t i o n N o _ L b l   E l e m e n t T y p e = " C o l u m n "   E l e m e n t I d = " 1 4 2 4 6 1 6 0 8 5 "   D a t a T y p e = " T e x t " > V A T R e g i s t r a t i o n N o _ L b l < / V A T R e g i s t r a t i o n N o _ L b l > + 
+         < Y o u r D o c u m e n t T i t l e _ L b l   E l e m e n t T y p e = " C o l u m n "   E l e m e n t I d = " 1 8 2 1 7 1 6 9 3 4 "   D a t a T y p e = " L a b e l " > Y o u r D o c u m e n t T i t l e _ L b l < / Y o u r D o c u m e n t T i t l e _ L b l > + 
+         < Y o u r R e f e r e n c e   E l e m e n t T y p e = " C o l u m n "   E l e m e n t I d = " 1 1 0 3 9 9 5 1 "   D a t a T y p e = " T e x t " > Y o u r R e f e r e n c e < / Y o u r R e f e r e n c e > + 
+         < Y o u r R e f e r e n c e _ L b l   E l e m e n t T y p e = " C o l u m n "   E l e m e n t I d = " 4 6 5 4 7 7 4 2 6 "   D a t a T y p e = " S t r i n g " > Y o u r R e f e r e n c e _ L b l < / Y o u r R e f e r e n c e _ L b l > + 
+         < L i n e   E l e m e n t T y p e = " D a t a I t e m "   E l e m e n t I d = " 4 1 1 9 7 6 1 3 3 " > + 
+             < D e s c r i p t i o n _ L i n e   E l e m e n t T y p e = " C o l u m n "   E l e m e n t I d = " 1 4 0 6 8 2 2 3 1 0 "   D a t a T y p e = " T e x t " > D e s c r i p t i o n _ L i n e < / D e s c r i p t i o n _ L i n e > + 
+             < D e s c r i p t i o n _ L i n e _ L b l   E l e m e n t T y p e = " C o l u m n "   E l e m e n t I d = " 2 1 1 8 9 5 1 4 9 5 "   D a t a T y p e = " S t r i n g " > D e s c r i p t i o n _ L i n e _ L b l < / D e s c r i p t i o n _ L i n e _ L b l > + 
+             < I t e m N o _ L i n e   E l e m e n t T y p e = " C o l u m n "   E l e m e n t I d = " 1 9 1 0 2 9 6 2 8 8 "   D a t a T y p e = " C o d e " > I t e m N o _ L i n e < / I t e m N o _ L i n e > + 
+             < I t e m N o _ L i n e _ L b l   E l e m e n t T y p e = " C o l u m n "   E l e m e n t I d = " 1 3 4 0 0 7 9 6 1 3 "   D a t a T y p e = " S t r i n g " > I t e m N o _ L i n e _ L b l < / I t e m N o _ L i n e _ L b l > + 
+             < I t e m R e f e r e n c e N o _ L i n e   E l e m e n t T y p e = " C o l u m n "   E l e m e n t I d = " 9 2 7 2 3 5 7 "   D a t a T y p e = " C o d e " > I t e m R e f e r e n c e N o _ L i n e < / I t e m R e f e r e n c e N o _ L i n e > + 
+             < I t e m R e f e r e n c e N o _ L i n e _ L b l   E l e m e n t T y p e = " C o l u m n "   E l e m e n t I d = " 1 9 8 0 6 3 1 1 3 0 "   D a t a T y p e = " S t r i n g " > I t e m R e f e r e n c e N o _ L i n e _ L b l < / I t e m R e f e r e n c e N o _ L i n e _ L b l > + 
+             < L i n e N o _ L i n e   E l e m e n t T y p e = " C o l u m n "   E l e m e n t I d = " 6 9 8 9 8 5 9 7 9 "   D a t a T y p e = " I n t e g e r " > L i n e N o _ L i n e < / L i n e N o _ L i n e > + 
+             < Q t y _ L b l   E l e m e n t T y p e = " C o l u m n "   E l e m e n t I d = " 2 6 3 6 7 3 7 6 4 "   D a t a T y p e = " L a b e l " > Q t y _ L b l < / Q t y _ L b l > + 
+             < Q u a n t i t y _ L i n e   E l e m e n t T y p e = " C o l u m n "   E l e m e n t I d = " 1 0 6 8 5 4 3 5 3 7 "   D a t a T y p e = " T e x t " > Q u a n t i t y _ L i n e < / Q u a n t i t y _ L i n e > + 
+             < Q u a n t i t y _ L i n e _ L b l   E l e m e n t T y p e = " C o l u m n "   E l e m e n t I d = " 2 0 3 4 5 0 6 8 0 2 "   D a t a T y p e = " S t r i n g " > Q u a n t i t y _ L i n e _ L b l < / Q u a n t i t y _ L i n e _ L b l > + 
+             < S h i p m e n t D a t e _ L i n e   E l e m e n t T y p e = " C o l u m n "   E l e m e n t I d = " 1 6 7 3 3 7 5 4 1 6 "   D a t a T y p e = " S t r i n g " > S h i p m e n t D a t e _ L i n e < / S h i p m e n t D a t e _ L i n e > + 
+             < S h i p m e n t D a t e _ L i n e _ L b l   E l e m e n t T y p e = " C o l u m n "   E l e m e n t I d = " 8 5 3 2 2 4 3 6 3 "   D a t a T y p e = " L a b e l " > S h i p m e n t D a t e _ L i n e _ L b l < / S h i p m e n t D a t e _ L i n e _ L b l > + 
+             < T y p e _ L i n e   E l e m e n t T y p e = " C o l u m n "   E l e m e n t I d = " 2 7 2 8 0 4 9 2 4 "   D a t a T y p e = " S t r i n g " > T y p e _ L i n e < / T y p e _ L i n e > + 
+             < U n i t O f M e a s u r e   E l e m e n t T y p e = " C o l u m n "   E l e m e n t I d = " 1 8 0 8 2 2 8 0 1 8 "   D a t a T y p e = " T e x t " > U n i t O f M e a s u r e < / U n i t O f M e a s u r e > + 
+             < U n i t O f M e a s u r e _ L b l   E l e m e n t T y p e = " C o l u m n "   E l e m e n t I d = " 9 8 1 9 5 1 2 4 9 "   D a t a T y p e = " S t r i n g " > U n i t O f M e a s u r e _ L b l < / U n i t O f M e a s u r e _ L b l > + 
+             < U n i t _ L b l   E l e m e n t T y p e = " C o l u m n "   E l e m e n t I d = " 8 1 4 3 6 4 3 1 8 "   D a t a T y p e = " L a b e l " > U n i t _ L b l < / U n i t _ L b l >   
          < / L i n e >   
-         < L e f t H e a d e r > - 
-             < L e f t H e a d e r N a m e > L e f t H e a d e r N a m e < / L e f t H e a d e r N a m e > - 
-             < L e f t H e a d e r V a l u e > L e f t H e a d e r V a l u e < / L e f t H e a d e r V a l u e > +         < L e f t H e a d e r   E l e m e n t T y p e = " D a t a I t e m "   E l e m e n t I d = " 7 3 4 6 8 0 8 3 3 " > + 
+             < L e f t H e a d e r N a m e   E l e m e n t T y p e = " C o l u m n "   E l e m e n t I d = " 4 3 7 4 2 2 1 8 2 "   D a t a T y p e = " T e x t " > L e f t H e a d e r N a m e < / L e f t H e a d e r N a m e > + 
+             < L e f t H e a d e r V a l u e   E l e m e n t T y p e = " C o l u m n "   E l e m e n t I d = " 2 4 2 1 2 6 3 1 0 "   D a t a T y p e = " T e x t " > L e f t H e a d e r V a l u e < / L e f t H e a d e r V a l u e >   
          < / L e f t H e a d e r >   
-         < R i g h t H e a d e r > - 
-             < R i g h t H e a d e r N a m e > R i g h t H e a d e r N a m e < / R i g h t H e a d e r N a m e > - 
-             < R i g h t H e a d e r V a l u e > R i g h t H e a d e r V a l u e < / R i g h t H e a d e r V a l u e > +         < R i g h t H e a d e r   E l e m e n t T y p e = " D a t a I t e m "   E l e m e n t I d = " 2 5 4 5 4 4 9 4 6 " > + 
+             < R i g h t H e a d e r N a m e   E l e m e n t T y p e = " C o l u m n "   E l e m e n t I d = " 8 9 8 2 8 7 5 7 "   D a t a T y p e = " T e x t " > R i g h t H e a d e r N a m e < / R i g h t H e a d e r N a m e > + 
+             < R i g h t H e a d e r V a l u e   E l e m e n t T y p e = " C o l u m n "   E l e m e n t I d = " 7 0 6 9 3 8 5 5 9 "   D a t a T y p e = " T e x t " > R i g h t H e a d e r V a l u e < / R i g h t H e a d e r V a l u e >   
          < / R i g h t H e a d e r >   
-         < L e t t e r T e x t > - 
-             < B o d y T e x t > B o d y T e x t < / B o d y T e x t > - 
-             < C l o s i n g T e x t > C l o s i n g T e x t < / C l o s i n g T e x t > - 
-             < G r e e t i n g T e x t > G r e e t i n g T e x t < / G r e e t i n g T e x t > +         < L e t t e r T e x t   E l e m e n t T y p e = " D a t a I t e m "   E l e m e n t I d = " 1 5 1 0 3 5 3 8 3 4 " > + 
+             < B o d y T e x t   E l e m e n t T y p e = " C o l u m n "   E l e m e n t I d = " 1 4 9 7 5 9 8 0 8 "   D a t a T y p e = " L a b e l " > B o d y T e x t < / B o d y T e x t > + 
+             < C l o s i n g T e x t   E l e m e n t T y p e = " C o l u m n "   E l e m e n t I d = " 5 1 2 1 3 5 9 0 9 "   D a t a T y p e = " L a b e l " > C l o s i n g T e x t < / C l o s i n g T e x t > + 
+             < G r e e t i n g T e x t   E l e m e n t T y p e = " C o l u m n "   E l e m e n t I d = " 1 1 7 5 2 7 9 2 8 9 "   D a t a T y p e = " L a b e l " > G r e e t i n g T e x t < / G r e e t i n g T e x t >   
          < / L e t t e r T e x t >   
@@ -4162,9 +4709,7 @@
  < / N a v W o r d R e p o r t X m l P a r t > 
 </file>
 
-<file path=customXml/item4.xml>��< ? x m l   v e r s i o n = " 1 . 0 "   e n c o d i n g = " u t f - 1 6 " ? > - 
- < N a v W o r d R e p o r t X m l P a r t   x m l n s = " u r n : m i c r o s o f t - d y n a m i c s - b u s i n e s s c e n t r a l / i n t e r n a l / e x t e n d e d / r e p o r t s / S t a n d a r d _ S a l e s _ R e t u r n _ R c p t / 1 3 0 9 / " > +<file path=customXml/item2.xml>��< ? x m l   v e r s i o n = " 1 . 0 "   e n c o d i n g = " u t f - 1 6 " ? > < N a v W o r d R e p o r t X m l P a r t   x m l n s = " u r n : m i c r o s o f t - d y n a m i c s - n a v / r e p o r t s / S t a n d a r d _ S a l e s _ R e t u r n _ R c p t / 1 3 0 9 / " >   
      < B C R e p o r t I n f o r m a t i o n >   
@@ -4308,519 +4853,333 @@
  
      < / B C R e p o r t I n f o r m a t i o n >   
-     < T o o l t i p s > - 
-         < T o o l t i p   c o l u m n = " C o m p a n y H o m e P a g e "   E l e m e n t I d = " 1 9 8 9 1 8 8 7 0 " > - 
-             < T o o l t i p T e x t   l a n g = " e n - U S " > S p e c i f i e s   y o u r   c o m p a n y ' s   w e b   s i t e . < / T o o l t i p T e x t > - 
-         < / T o o l t i p > - 
-         < T o o l t i p   c o l u m n = " C o m p a n y E M a i l "   E l e m e n t I d = " 1 6 7 7 0 7 4 0 5 8 " > - 
-             < T o o l t i p T e x t   l a n g = " e n - U S " > S p e c i f i e s   t h e   c o m p a n y ' s   e m a i l   a d d r e s s . < / T o o l t i p T e x t > - 
-         < / T o o l t i p > - 
-         < T o o l t i p   c o l u m n = " C o m p a n y P i c t u r e "   E l e m e n t I d = " 1 3 9 7 4 1 1 0 7 4 " > - 
-             < T o o l t i p T e x t   l a n g = " e n - U S " > S p e c i f i e s   t h e   p i c t u r e   t h a t   h a s   b e e n   s e t   u p   f o r   t h e   c o m p a n y ,   s u c h   a s   a   c o m p a n y   l o g o . < / T o o l t i p T e x t > - 
-         < / T o o l t i p > - 
-         < T o o l t i p   c o l u m n = " C o m p a n y P h o n e N o "   E l e m e n t I d = " 2 5 0 4 4 0 6 5 5 " > - 
-             < T o o l t i p T e x t   l a n g = " e n - U S " > S p e c i f i e s   t h e   c o m p a n y ' s   t e l e p h o n e   n u m b e r . < / T o o l t i p T e x t > - 
-         < / T o o l t i p > - 
-         < T o o l t i p   c o l u m n = " C o m p a n y G i r o N o "   E l e m e n t I d = " 1 3 6 0 1 9 6 3 2 0 " > - 
-             < T o o l t i p T e x t   l a n g = " e n - U S " > S p e c i f i e s   t h e   c o m p a n y ' s   g i r o   n u m b e r . < / T o o l t i p T e x t > - 
-         < / T o o l t i p > - 
-         < T o o l t i p   c o l u m n = " C o m p a n y B a n k N a m e "   E l e m e n t I d = " 1 5 3 4 9 0 5 6 0 5 " > - 
-             < T o o l t i p T e x t   l a n g = " e n - U S " > S p e c i f i e s   t h e   n a m e   o f   t h e   b a n k   t h e   c o m p a n y   u s e s . < / T o o l t i p T e x t > - 
-         < / T o o l t i p > - 
-         < T o o l t i p   c o l u m n = " C o m p a n y B a n k B r a n c h N o "   E l e m e n t I d = " 7 9 3 1 3 3 0 5 7 " > - 
-             < T o o l t i p T e x t   l a n g = " e n - U S " > S p e c i f i e s   t h e   b a n k ' s   b r a n c h   n u m b e r . < / T o o l t i p T e x t > - 
-         < / T o o l t i p > - 
-         < T o o l t i p   c o l u m n = " C o m p a n y B a n k A c c o u n t N o "   E l e m e n t I d = " 3 0 1 4 0 2 0 4 " > - 
-             < T o o l t i p T e x t   l a n g = " e n - U S " > S p e c i f i e s   t h e   c o m p a n y ' s   b a n k   a c c o u n t   n u m b e r . < / T o o l t i p T e x t > - 
-         < / T o o l t i p > - 
-         < T o o l t i p   c o l u m n = " C o m p a n y I B A N "   E l e m e n t I d = " 9 0 6 5 4 9 1 8 2 " > - 
-             < T o o l t i p T e x t   l a n g = " e n - U S " > S p e c i f i e s   t h e   i n t e r n a t i o n a l   b a n k   a c c o u n t   n u m b e r   o f   y o u r   p r i m a r y   b a n k   a c c o u n t . < / T o o l t i p T e x t > - 
-         < / T o o l t i p > - 
-         < T o o l t i p   c o l u m n = " C o m p a n y S W I F T "   E l e m e n t I d = " 6 6 8 2 5 0 2 4 5 " > - 
-             < T o o l t i p T e x t   l a n g = " e n - U S " > S p e c i f i e s   t h e   S W I F T   c o d e   ( i n t e r n a t i o n a l   b a n k   i d e n t i f i e r   c o d e )   o f   y o u r   p r i m a r y   b a n k . < / T o o l t i p T e x t > - 
-         < / T o o l t i p > - 
-         < T o o l t i p   c o l u m n = " S h i p m e n t M e t h o d D e s c r i p t i o n "   E l e m e n t I d = " 2 0 5 9 4 0 3 2 6 0 " > - 
-             < T o o l t i p T e x t   l a n g = " e n - U S " > S p e c i f i e s   a   d e s c r i p t i o n   o f   t h e   s h i p m e n t   m e t h o d . < / T o o l t i p T e x t > - 
-         < / T o o l t i p > - 
-         < T o o l t i p   c o l u m n = " S h i p T o P h o n e N o "   E l e m e n t I d = " 3 6 9 7 0 2 2 5 5 " > - 
-             < T o o l t i p T e x t   l a n g = " e n - U S " > S p e c i f i e s   t h e   t e l e p h o n e   n u m b e r   o f   t h e   c o m p a n y ' s   s h i p p i n g   a d d r e s s . < / T o o l t i p T e x t > - 
-         < / T o o l t i p > - 
-         < T o o l t i p   c o l u m n = " S e l l T o C o n t a c t P h o n e N o "   E l e m e n t I d = " 1 6 1 3 8 2 2 4 8 3 " > - 
-             < T o o l t i p T e x t   l a n g = " e n - U S " > S p e c i f i e s   t h e   c o n t a c t ' s   p h o n e   n u m b e r . < / T o o l t i p T e x t > - 
-         < / T o o l t i p > - 
-         < T o o l t i p   c o l u m n = " S e l l T o C o n t a c t M o b i l e P h o n e N o "   E l e m e n t I d = " 1 8 4 3 5 8 7 4 7 " > - 
-             < T o o l t i p T e x t   l a n g = " e n - U S " > S p e c i f i e s   t h e   c o n t a c t ' s   m o b i l e   t e l e p h o n e   n u m b e r . < / T o o l t i p T e x t > - 
-         < / T o o l t i p > - 
-         < T o o l t i p   c o l u m n = " S e l l T o C o n t a c t E m a i l "   E l e m e n t I d = " 2 6 2 8 2 4 5 6 4 " > - 
-             < T o o l t i p T e x t   l a n g = " e n - U S " > S p e c i f i e s   t h e   e m a i l   a d d r e s s   o f   t h e   c o n t a c t . < / T o o l t i p T e x t > - 
-         < / T o o l t i p > - 
-         < T o o l t i p   c o l u m n = " B i l l T o C o n t a c t P h o n e N o "   E l e m e n t I d = " 3 6 2 4 7 7 4 8 8 " > - 
-             < T o o l t i p T e x t   l a n g = " e n - U S " > S p e c i f i e s   t h e   c o n t a c t ' s   p h o n e   n u m b e r . < / T o o l t i p T e x t > - 
-         < / T o o l t i p > - 
-         < T o o l t i p   c o l u m n = " B i l l T o C o n t a c t M o b i l e P h o n e N o "   E l e m e n t I d = " 2 4 8 4 8 8 6 9 6 " > - 
-             < T o o l t i p T e x t   l a n g = " e n - U S " > S p e c i f i e s   t h e   c o n t a c t ' s   m o b i l e   t e l e p h o n e   n u m b e r . < / T o o l t i p T e x t > - 
-         < / T o o l t i p > - 
-         < T o o l t i p   c o l u m n = " B i l l T o C o n t a c t E m a i l "   E l e m e n t I d = " 3 3 5 8 2 7 8 9 5 " > - 
-             < T o o l t i p T e x t   l a n g = " e n - U S " > S p e c i f i e s   t h e   e m a i l   a d d r e s s   o f   t h e   c o n t a c t . < / T o o l t i p T e x t > - 
-         < / T o o l t i p > - 
-         < T o o l t i p   c o l u m n = " B i l l t o C u s t u m e r N o "   E l e m e n t I d = " 2 8 0 4 7 3 0 5 8 " > - 
-             < T o o l t i p T e x t   l a n g = " e n - U S " > S p e c i f i e s   t h e   n u m b e r   o f   t h e   c u s t o m e r   t h a t   y o u   s e n d   o r   s e n t   t h e   c r e d i t   m e m o   t o . < / T o o l t i p T e x t > - 
-         < / T o o l t i p > - 
-         < T o o l t i p   c o l u m n = " D o c u m e n t N o "   E l e m e n t I d = " 9 7 0 3 5 0 5 3 9 " > - 
-             < T o o l t i p T e x t   l a n g = " e n - U S " > S p e c i f i e s   t h e   n u m b e r   o f   t h e   i n v o l v e d   e n t r y   o r   r e c o r d ,   a c c o r d i n g   t o   t h e   s p e c i f i e d   n u m b e r   s e r i e s . < / T o o l t i p T e x t > - 
-         < / T o o l t i p > - 
-         < T o o l t i p   c o l u m n = " R e t u r n O r d e r N o "   E l e m e n t I d = " 1 2 6 6 4 2 8 7 1 2 " > - 
-             < T o o l t i p T e x t   l a n g = " e n - U S " > S p e c i f i e s   t h e   n u m b e r   o f   t h e   r e t u r n   o r d e r   t h a t   w i l l   p o s t   a   r e t u r n   r e c e i p t . < / T o o l t i p T e x t > - 
-         < / T o o l t i p > - 
-         < T o o l t i p   c o l u m n = " S a l e s P e r s o n N a m e "   E l e m e n t I d = " 8 7 1 4 9 2 9 8 3 " > - 
-             < T o o l t i p T e x t   l a n g = " e n - U S " > S p e c i f i e s   t h e   n a m e   o f   t h e   s a l e s p e r s o n   o r   p u r c h a s e r . < / T o o l t i p T e x t > - 
-         < / T o o l t i p > - 
-         < T o o l t i p   c o l u m n = " S e l l t o C u s t o m e r N o "   E l e m e n t I d = " 2 0 5 0 6 4 7 3 4 9 " > - 
-             < T o o l t i p T e x t   l a n g = " e n - U S " > S p e c i f i e s   t h e   n u m b e r   o f   t h e   c u s t o m e r   w h o   r e t u r n e d   t h e   p r o d u c t s . < / T o o l t i p T e x t > - 
-         < / T o o l t i p > - 
-         < T o o l t i p   c o l u m n = " P a c k a g e T r a c k i n g N o "   E l e m e n t I d = " 1 2 4 4 8 2 6 1 5 9 " > - 
-             < T o o l t i p T e x t   l a n g = " e n - U S " > S p e c i f i e s   t h e   s h i p p i n g   a g e n t ' s   p a c k a g e   n u m b e r . < / T o o l t i p T e x t > - 
-         < / T o o l t i p > - 
-         < T o o l t i p   c o l u m n = " S h i p p i n g A g e n t C o d e "   E l e m e n t I d = " 1 6 7 0 1 5 5 2 6 9 " > - 
-             < T o o l t i p T e x t   l a n g = " e n - U S " > S p e c i f i e s   w h i c h   s h i p p i n g   a g e n t   i s   u s e d   t o   t r a n s p o r t   t h e   i t e m s   o n   t h e   s a l e s   d o c u m e n t   t o   t h e   c u s t o m e r . < / T o o l t i p T e x t > - 
-         < / T o o l t i p > - 
-         < T o o l t i p   c o l u m n = " E x t e r n a l D o c u m e n t N o "   E l e m e n t I d = " 7 3 3 9 5 3 9 6 6 " > - 
-             < T o o l t i p T e x t   l a n g = " e n - U S " > S p e c i f i e s   a   d o c u m e n t   n u m b e r   t h a t   r e f e r s   t o   t h e   c u s t o m e r ' s   o r   v e n d o r ' s   n u m b e r i n g   s y s t e m . < / T o o l t i p T e x t > - 
-         < / T o o l t i p > - 
-         < T o o l t i p   c o l u m n = " D e s c r i p t i o n _ L i n e "   E l e m e n t I d = " 1 4 0 6 8 2 2 3 1 0 " > - 
-             < T o o l t i p T e x t   l a n g = " e n - U S " > S p e c i f i e s   e i t h e r   t h e   n a m e   o f   o r   t h e   d e s c r i p t i o n   o f   t h e   i t e m ,   g e n e r a l   l e d g e r   a c c o u n t   o r   i t e m   c h a r g e . < / T o o l t i p T e x t > - 
-         < / T o o l t i p > - 
-         < T o o l t i p   c o l u m n = " I t e m N o _ L i n e "   E l e m e n t I d = " 1 9 1 0 2 9 6 2 8 8 " > - 
-             < T o o l t i p T e x t   l a n g = " e n - U S " > S p e c i f i e s   t h e   n u m b e r   o f   t h e   i n v o l v e d   e n t r y   o r   r e c o r d ,   a c c o r d i n g   t o   t h e   s p e c i f i e d   n u m b e r   s e r i e s . < / T o o l t i p T e x t > - 
-         < / T o o l t i p > - 
-         < T o o l t i p   c o l u m n = " I t e m R e f e r e n c e N o _ L i n e "   E l e m e n t I d = " 9 2 7 2 3 5 7 " > - 
-             < T o o l t i p T e x t   l a n g = " e n - U S " > S p e c i f i e s   t h e   r e f e r e n c e d   i t e m   n u m b e r . < / T o o l t i p T e x t > - 
-         < / T o o l t i p > - 
-         < T o o l t i p   c o l u m n = " U n i t O f M e a s u r e "   E l e m e n t I d = " 1 8 0 8 2 2 8 0 1 8 " > - 
-             < T o o l t i p T e x t   l a n g = " e n - U S " > S p e c i f i e s   t h e   n a m e   o f   t h e   i t e m   o r   r e s o u r c e ' s   u n i t   o f   m e a s u r e ,   s u c h   a s   p i e c e   o r   h o u r . < / T o o l t i p T e x t > - 
-         < / T o o l t i p > - 
-         < T o o l t i p   c o l u m n = " L e f t H e a d e r N a m e "   E l e m e n t I d = " 4 3 7 4 2 2 1 8 2 " > - 
-             < T o o l t i p T e x t   l a n g = " e n - U S " > S p e c i f i e s   t h e   n a m e . < / T o o l t i p T e x t > - 
-         < / T o o l t i p > - 
-         < T o o l t i p   c o l u m n = " L e f t H e a d e r V a l u e "   E l e m e n t I d = " 2 4 2 1 2 6 3 1 0 " > - 
-             < T o o l t i p T e x t   l a n g = " e n - U S " > S p e c i f i e s   t h e   v a l u e . < / T o o l t i p T e x t > - 
-         < / T o o l t i p > - 
-         < T o o l t i p   c o l u m n = " R i g h t H e a d e r N a m e "   E l e m e n t I d = " 8 9 8 2 8 7 5 7 " > - 
-             < T o o l t i p T e x t   l a n g = " e n - U S " > S p e c i f i e s   t h e   n a m e . < / T o o l t i p T e x t > - 
-         < / T o o l t i p > - 
-         < T o o l t i p   c o l u m n = " R i g h t H e a d e r V a l u e "   E l e m e n t I d = " 7 0 6 9 3 8 5 5 9 " > - 
-             < T o o l t i p T e x t   l a n g = " e n - U S " > S p e c i f i e s   t h e   v a l u e . < / T o o l t i p T e x t > - 
-         < / T o o l t i p > - 
-     < / T o o l t i p s > - 
-     < H e a d e r   E l e m e n t T y p e = " D a t a I t e m "   E l e m e n t I d = " 1 2 4 0 3 7 3 8 8 6 " > - 
-         < B i l l e d T o _ L b l   E l e m e n t T y p e = " C o l u m n "   E l e m e n t I d = " 1 7 4 5 4 4 9 0 7 9 "   D a t a T y p e = " L a b e l " > B i l l e d T o _ L b l < / B i l l e d T o _ L b l > - 
-         < B i l l t o A d d r e s s C a p t i o n   E l e m e n t T y p e = " C o l u m n "   E l e m e n t I d = " 8 7 9 5 9 7 4 9 "   D a t a T y p e = " L a b e l " > B i l l t o A d d r e s s C a p t i o n < / B i l l t o A d d r e s s C a p t i o n > - 
-         < B i l l T o C o n t a c t E m a i l   E l e m e n t T y p e = " C o l u m n "   E l e m e n t I d = " 3 3 5 8 2 7 8 9 5 "   D a t a T y p e = " T e x t " > B i l l T o C o n t a c t E m a i l < / B i l l T o C o n t a c t E m a i l > - 
-         < B i l l T o C o n t a c t E m a i l L b l   E l e m e n t T y p e = " C o l u m n "   E l e m e n t I d = " 2 9 6 4 7 8 3 6 5 "   D a t a T y p e = " L a b e l " > B i l l T o C o n t a c t E m a i l L b l < / B i l l T o C o n t a c t E m a i l L b l > - 
-         < B i l l T o C o n t a c t M o b i l e P h o n e N o   E l e m e n t T y p e = " C o l u m n "   E l e m e n t I d = " 2 4 8 4 8 8 6 9 6 "   D a t a T y p e = " T e x t " > B i l l T o C o n t a c t M o b i l e P h o n e N o < / B i l l T o C o n t a c t M o b i l e P h o n e N o > - 
-         < B i l l T o C o n t a c t M o b i l e P h o n e N o L b l   E l e m e n t T y p e = " C o l u m n "   E l e m e n t I d = " 2 7 6 3 1 1 3 3 8 "   D a t a T y p e = " L a b e l " > B i l l T o C o n t a c t M o b i l e P h o n e N o L b l < / B i l l T o C o n t a c t M o b i l e P h o n e N o L b l > - 
-         < B i l l T o C o n t a c t P h o n e N o   E l e m e n t T y p e = " C o l u m n "   E l e m e n t I d = " 3 6 2 4 7 7 4 8 8 "   D a t a T y p e = " T e x t " > B i l l T o C o n t a c t P h o n e N o < / B i l l T o C o n t a c t P h o n e N o > - 
-         < B i l l T o C o n t a c t P h o n e N o L b l   E l e m e n t T y p e = " C o l u m n "   E l e m e n t I d = " 2 1 2 3 3 4 5 9 6 6 "   D a t a T y p e = " L a b e l " > B i l l T o C o n t a c t P h o n e N o L b l < / B i l l T o C o n t a c t P h o n e N o L b l > - 
-         < B i l l t o C u s t o m e r N o _ L b l   E l e m e n t T y p e = " C o l u m n "   E l e m e n t I d = " 3 6 9 3 0 7 8 1 3 "   D a t a T y p e = " S t r i n g " > B i l l t o C u s t o m e r N o _ L b l < / B i l l t o C u s t o m e r N o _ L b l > - 
-         < B i l l t o C u s t u m e r N o   E l e m e n t T y p e = " C o l u m n "   E l e m e n t I d = " 2 8 0 4 7 3 0 5 8 "   D a t a T y p e = " C o d e " > B i l l t o C u s t u m e r N o < / B i l l t o C u s t u m e r N o > - 
-         < C o m p a n y A d d r e s s 1   E l e m e n t T y p e = " C o l u m n "   E l e m e n t I d = " 1 8 8 4 1 6 4 3 2 3 "   D a t a T y p e = " T e x t " > C o m p a n y A d d r e s s 1 < / C o m p a n y A d d r e s s 1 > - 
-         < C o m p a n y A d d r e s s 2   E l e m e n t T y p e = " C o l u m n "   E l e m e n t I d = " 1 2 4 6 4 6 7 7 0 6 "   D a t a T y p e = " T e x t " > C o m p a n y A d d r e s s 2 < / C o m p a n y A d d r e s s 2 > - 
-         < C o m p a n y A d d r e s s 3   E l e m e n t T y p e = " C o l u m n "   E l e m e n t I d = " 6 0 8 7 7 1 0 8 9 "   D a t a T y p e = " T e x t " > C o m p a n y A d d r e s s 3 < / C o m p a n y A d d r e s s 3 > - 
-         < C o m p a n y A d d r e s s 4   E l e m e n t T y p e = " C o l u m n "   E l e m e n t I d = " 7 7 7 6 8 0 1 1 2 "   D a t a T y p e = " T e x t " > C o m p a n y A d d r e s s 4 < / C o m p a n y A d d r e s s 4 > - 
-         < C o m p a n y A d d r e s s 5   E l e m e n t T y p e = " C o l u m n "   E l e m e n t I d = " 1 3 9 9 8 3 4 9 5 "   D a t a T y p e = " T e x t " > C o m p a n y A d d r e s s 5 < / C o m p a n y A d d r e s s 5 > - 
-         < C o m p a n y A d d r e s s 6   E l e m e n t T y p e = " C o l u m n "   E l e m e n t I d = " 4 9 7 7 1 3 1 2 2 "   D a t a T y p e = " T e x t " > C o m p a n y A d d r e s s 6 < / C o m p a n y A d d r e s s 6 > - 
-         < C o m p a n y A d d r e s s 7   E l e m e n t T y p e = " C o l u m n "   E l e m e n t I d = " 1 1 3 5 4 0 9 7 3 9 "   D a t a T y p e = " T e x t " > C o m p a n y A d d r e s s 7 < / C o m p a n y A d d r e s s 7 > - 
-         < C o m p a n y A d d r e s s 8   E l e m e n t T y p e = " C o l u m n "   E l e m e n t I d = " 1 7 1 5 2 5 5 3 0 0 "   D a t a T y p e = " T e x t " > C o m p a n y A d d r e s s 8 < / C o m p a n y A d d r e s s 8 > - 
-         < C o m p a n y B a n k A c c o u n t N o   E l e m e n t T y p e = " C o l u m n "   E l e m e n t I d = " 3 0 1 4 0 2 0 4 "   D a t a T y p e = " T e x t " > C o m p a n y B a n k A c c o u n t N o < / C o m p a n y B a n k A c c o u n t N o > - 
-         < C o m p a n y B a n k A c c o u n t N o _ L b l   E l e m e n t T y p e = " C o l u m n "   E l e m e n t I d = " 1 0 9 7 7 4 3 3 4 5 "   D a t a T y p e = " L a b e l " > C o m p a n y B a n k A c c o u n t N o _ L b l < / C o m p a n y B a n k A c c o u n t N o _ L b l > - 
-         < C o m p a n y B a n k B r a n c h N o   E l e m e n t T y p e = " C o l u m n "   E l e m e n t I d = " 7 9 3 1 3 3 0 5 7 "   D a t a T y p e = " T e x t " > C o m p a n y B a n k B r a n c h N o < / C o m p a n y B a n k B r a n c h N o > - 
-         < C o m p a n y B a n k B r a n c h N o _ L b l   E l e m e n t T y p e = " C o l u m n "   E l e m e n t I d = " 3 2 7 9 0 6 6 9 2 "   D a t a T y p e = " S t r i n g " > C o m p a n y B a n k B r a n c h N o _ L b l < / C o m p a n y B a n k B r a n c h N o _ L b l > - 
-         < C o m p a n y B a n k N a m e   E l e m e n t T y p e = " C o l u m n "   E l e m e n t I d = " 1 5 3 4 9 0 5 6 0 5 "   D a t a T y p e = " T e x t " > C o m p a n y B a n k N a m e < / C o m p a n y B a n k N a m e > - 
-         < C o m p a n y B a n k N a m e _ L b l   E l e m e n t T y p e = " C o l u m n "   E l e m e n t I d = " 1 2 0 4 3 0 7 0 1 4 "   D a t a T y p e = " L a b e l " > C o m p a n y B a n k N a m e _ L b l < / C o m p a n y B a n k N a m e _ L b l > - 
-         < C o m p a n y C u s t o m G i r o   E l e m e n t T y p e = " C o l u m n "   E l e m e n t I d = " 1 6 7 0 4 7 5 7 9 8 "   D a t a T y p e = " T e x t " > C o m p a n y C u s t o m G i r o < / C o m p a n y C u s t o m G i r o > - 
-         < C o m p a n y C u s t o m G i r o _ L b l   E l e m e n t T y p e = " C o l u m n "   E l e m e n t I d = " 8 9 1 4 3 9 6 2 5 "   D a t a T y p e = " T e x t " > C o m p a n y C u s t o m G i r o _ L b l < / C o m p a n y C u s t o m G i r o _ L b l > - 
-         < C o m p a n y E M a i l   E l e m e n t T y p e = " C o l u m n "   E l e m e n t I d = " 1 6 7 7 0 7 4 0 5 8 "   D a t a T y p e = " T e x t " > C o m p a n y E M a i l < / C o m p a n y E M a i l > - 
-         < C o m p a n y G i r o N o   E l e m e n t T y p e = " C o l u m n "   E l e m e n t I d = " 1 3 6 0 1 9 6 3 2 0 "   D a t a T y p e = " T e x t " > C o m p a n y G i r o N o < / C o m p a n y G i r o N o > - 
-         < C o m p a n y G i r o N o _ L b l   E l e m e n t T y p e = " C o l u m n "   E l e m e n t I d = " 8 6 1 6 0 2 1 1 5 "   D a t a T y p e = " L a b e l " > C o m p a n y G i r o N o _ L b l < / C o m p a n y G i r o N o _ L b l > - 
-         < C o m p a n y H o m e P a g e   E l e m e n t T y p e = " C o l u m n "   E l e m e n t I d = " 1 9 8 9 1 8 8 7 0 "   D a t a T y p e = " T e x t " > C o m p a n y H o m e P a g e < / C o m p a n y H o m e P a g e > - 
-         < C o m p a n y I B A N   E l e m e n t T y p e = " C o l u m n "   E l e m e n t I d = " 9 0 6 5 4 9 1 8 2 "   D a t a T y p e = " C o d e " > C o m p a n y I B A N < / C o m p a n y I B A N > - 
-         < C o m p a n y I B A N _ L b l   E l e m e n t T y p e = " C o l u m n "   E l e m e n t I d = " 1 2 6 7 9 5 2 2 2 7 "   D a t a T y p e = " S t r i n g " > C o m p a n y I B A N _ L b l < / C o m p a n y I B A N _ L b l > - 
-         < C o m p a n y L e g a l O f f i c e   E l e m e n t T y p e = " C o l u m n "   E l e m e n t I d = " 7 1 4 2 5 8 1 1 1 "   D a t a T y p e = " T e x t " > C o m p a n y L e g a l O f f i c e < / C o m p a n y L e g a l O f f i c e > - 
-         < C o m p a n y L e g a l O f f i c e _ L b l   E l e m e n t T y p e = " C o l u m n "   E l e m e n t I d = " 1 5 3 3 1 7 5 1 0 8 "   D a t a T y p e = " T e x t " > C o m p a n y L e g a l O f f i c e _ L b l < / C o m p a n y L e g a l O f f i c e _ L b l > - 
-         < C o m p a n y L e g a l S t a t e m e n t   E l e m e n t T y p e = " C o l u m n "   E l e m e n t I d = " 4 4 8 3 5 8 8 7 6 "   D a t a T y p e = " T e x t " > C o m p a n y L e g a l S t a t e m e n t < / C o m p a n y L e g a l S t a t e m e n t > - 
-         < C o m p a n y L o g o P o s i t i o n   E l e m e n t T y p e = " C o l u m n "   E l e m e n t I d = " 1 4 2 5 2 6 6 6 8 8 "   D a t a T y p e = " I n t e g e r " > C o m p a n y L o g o P o s i t i o n < / C o m p a n y L o g o P o s i t i o n > - 
-         < C o m p a n y P h o n e N o   E l e m e n t T y p e = " C o l u m n "   E l e m e n t I d = " 2 5 0 4 4 0 6 5 5 "   D a t a T y p e = " T e x t " > C o m p a n y P h o n e N o < / C o m p a n y P h o n e N o > - 
-         < C o m p a n y P h o n e N o _ L b l   E l e m e n t T y p e = " C o l u m n "   E l e m e n t I d = " 5 5 8 5 9 3 5 8 6 "   D a t a T y p e = " L a b e l " > C o m p a n y P h o n e N o _ L b l < / C o m p a n y P h o n e N o _ L b l > - 
-         < C o m p a n y P i c t u r e   E l e m e n t T y p e = " C o l u m n "   E l e m e n t I d = " 1 3 9 7 4 1 1 0 7 4 "   D a t a T y p e = " B l o b "   / > - 
-         < C o m p a n y R e g i s t r a t i o n N u m b e r   E l e m e n t T y p e = " C o l u m n "   E l e m e n t I d = " 2 0 2 3 6 3 9 4 2 4 "   D a t a T y p e = " T e x t " > C o m p a n y R e g i s t r a t i o n N u m b e r < / C o m p a n y R e g i s t r a t i o n N u m b e r > - 
-         < C o m p a n y R e g i s t r a t i o n N u m b e r _ L b l   E l e m e n t T y p e = " C o l u m n "   E l e m e n t I d = " 1 8 3 3 1 0 6 6 5 3 "   D a t a T y p e = " T e x t " > C o m p a n y R e g i s t r a t i o n N u m b e r _ L b l < / C o m p a n y R e g i s t r a t i o n N u m b e r _ L b l > - 
-         < C o m p a n y S W I F T   E l e m e n t T y p e = " C o l u m n "   E l e m e n t I d = " 6 6 8 2 5 0 2 4 5 "   D a t a T y p e = " C o d e " > C o m p a n y S W I F T < / C o m p a n y S W I F T > - 
-         < C o m p a n y S W I F T _ L b l   E l e m e n t T y p e = " C o l u m n "   E l e m e n t I d = " 2 0 2 9 5 9 7 3 8 4 "   D a t a T y p e = " S t r i n g " > C o m p a n y S W I F T _ L b l < / C o m p a n y S W I F T _ L b l > - 
-         < C o m p a n y V A T R e g i s t r a t i o n N o   E l e m e n t T y p e = " C o l u m n "   E l e m e n t I d = " 1 9 1 4 0 1 3 6 4 9 "   D a t a T y p e = " T e x t " > C o m p a n y V A T R e g i s t r a t i o n N o < / C o m p a n y V A T R e g i s t r a t i o n N o > - 
-         < C o m p a n y V A T R e g i s t r a t i o n N o _ L b l   E l e m e n t T y p e = " C o l u m n "   E l e m e n t I d = " 9 2 4 5 0 3 1 2 4 "   D a t a T y p e = " T e x t " > C o m p a n y V A T R e g i s t r a t i o n N o _ L b l < / C o m p a n y V A T R e g i s t r a t i o n N o _ L b l > - 
-         < C o m p a n y V A T R e g N o   E l e m e n t T y p e = " C o l u m n "   E l e m e n t I d = " 1 7 1 4 3 1 9 3 6 "   D a t a T y p e = " T e x t " > C o m p a n y V A T R e g N o < / C o m p a n y V A T R e g N o > - 
-         < C o m p a n y V A T R e g N o _ L b l   E l e m e n t T y p e = " C o l u m n "   E l e m e n t I d = " 7 7 3 2 0 1 5 0 1 "   D a t a T y p e = " T e x t " > C o m p a n y V A T R e g N o _ L b l < / C o m p a n y V A T R e g N o _ L b l > - 
-         < C o n t a c t _ L b l   E l e m e n t T y p e = " C o l u m n "   E l e m e n t I d = " 1 1 5 5 0 9 4 7 5 2 "   D a t a T y p e = " T e x t " > C o n t a c t _ L b l < / C o n t a c t _ L b l > - 
-         < C o p y _ L b l   E l e m e n t T y p e = " C o l u m n "   E l e m e n t I d = " 6 0 4 7 8 2 7 8 1 "   D a t a T y p e = " L a b e l " > C o p y _ L b l < / C o p y _ L b l > - 
-         < C u s t o m e r A d d r e s s 1   E l e m e n t T y p e = " C o l u m n "   E l e m e n t I d = " 1 8 0 1 9 6 6 4 5 4 "   D a t a T y p e = " T e x t " > C u s t o m e r A d d r e s s 1 < / C u s t o m e r A d d r e s s 1 > - 
-         < C u s t o m e r A d d r e s s 2   E l e m e n t T y p e = " C o l u m n "   E l e m e n t I d = " 1 1 6 4 2 6 9 8 3 7 "   D a t a T y p e = " T e x t " > C u s t o m e r A d d r e s s 2 < / C u s t o m e r A d d r e s s 2 > - 
-         < C u s t o m e r A d d r e s s 3   E l e m e n t T y p e = " C o l u m n "   E l e m e n t I d = " 5 2 6 5 7 3 2 2 0 "   D a t a T y p e = " T e x t " > C u s t o m e r A d d r e s s 3 < / C u s t o m e r A d d r e s s 3 > - 
-         < C u s t o m e r A d d r e s s 4   E l e m e n t T y p e = " C o l u m n "   E l e m e n t I d = " 1 1 1 1 2 3 3 9 7 "   D a t a T y p e = " T e x t " > C u s t o m e r A d d r e s s 4 < / C u s t o m e r A d d r e s s 4 > - 
-         < C u s t o m e r A d d r e s s 5   E l e m e n t T y p e = " C o l u m n "   E l e m e n t I d = " 7 4 8 8 2 0 0 1 4 "   D a t a T y p e = " T e x t " > C u s t o m e r A d d r e s s 5 < / C u s t o m e r A d d r e s s 5 > - 
-         < C u s t o m e r A d d r e s s 6   E l e m e n t T y p e = " C o l u m n "   E l e m e n t I d = " 1 3 8 6 5 1 6 6 3 1 "   D a t a T y p e = " T e x t " > C u s t o m e r A d d r e s s 6 < / C u s t o m e r A d d r e s s 6 > - 
-         < C u s t o m e r A d d r e s s 7   E l e m e n t T y p e = " C o l u m n "   E l e m e n t I d = " 2 0 2 4 2 1 3 2 4 8 "   D a t a T y p e = " T e x t " > C u s t o m e r A d d r e s s 7 < / C u s t o m e r A d d r e s s 7 > - 
-         < C u s t o m e r A d d r e s s 8   E l e m e n t T y p e = " C o l u m n "   E l e m e n t I d = " 1 0 4 8 6 9 8 5 8 5 "   D a t a T y p e = " T e x t " > C u s t o m e r A d d r e s s 8 < / C u s t o m e r A d d r e s s 8 > - 
-         < C u s t o m e r P o s t a l B a r C o d e   E l e m e n t T y p e = " C o l u m n "   E l e m e n t I d = " 3 9 8 5 8 0 6 8 8 "   D a t a T y p e = " T e x t " > C u s t o m e r P o s t a l B a r C o d e < / C u s t o m e r P o s t a l B a r C o d e > - 
-         < D o c u m e n t D a t e   E l e m e n t T y p e = " C o l u m n "   E l e m e n t I d = " 5 5 2 8 7 1 9 1 4 "   D a t a T y p e = " S t r i n g " > D o c u m e n t D a t e < / D o c u m e n t D a t e > - 
-         < D o c u m e n t D a t e _ L b l   E l e m e n t T y p e = " C o l u m n "   E l e m e n t I d = " 1 0 2 6 4 9 4 8 3 "   D a t a T y p e = " S t r i n g " > D o c u m e n t D a t e _ L b l < / D o c u m e n t D a t e _ L b l > - 
-         < D o c u m e n t N o   E l e m e n t T y p e = " C o l u m n "   E l e m e n t I d = " 9 7 0 3 5 0 5 3 9 "   D a t a T y p e = " C o d e " > D o c u m e n t N o < / D o c u m e n t N o > - 
-         < D o c u m e n t N o _ L b l   E l e m e n t T y p e = " C o l u m n "   E l e m e n t I d = " 7 8 9 7 9 5 9 7 8 "   D a t a T y p e = " L a b e l " > D o c u m e n t N o _ L b l < / D o c u m e n t N o _ L b l > - 
-         < D o c u m e n t T i t l e _ L b l   E l e m e n t T y p e = " C o l u m n "   E l e m e n t I d = " 8 5 8 4 2 3 9 2 9 "   D a t a T y p e = " T e x t " > D o c u m e n t T i t l e _ L b l < / D o c u m e n t T i t l e _ L b l > - 
-         < D u e D a t e   E l e m e n t T y p e = " C o l u m n "   E l e m e n t I d = " 7 4 5 1 7 0 2 0 3 "   D a t a T y p e = " S t r i n g " > D u e D a t e < / D u e D a t e > - 
-         < D u e D a t e _ L b l   E l e m e n t T y p e = " C o l u m n "   E l e m e n t I d = " 1 6 4 8 2 8 4 6 4 8 "   D a t a T y p e = " S t r i n g " > D u e D a t e _ L b l < / D u e D a t e _ L b l > - 
-         < E M a i l _ H e a d e r _ L b l   E l e m e n t T y p e = " C o l u m n "   E l e m e n t I d = " 5 1 3 1 7 0 8 0 4 "   D a t a T y p e = " L a b e l " > E M a i l _ H e a d e r _ L b l < / E M a i l _ H e a d e r _ L b l > - 
-         < E x t e r n a l D o c u m e n t N o   E l e m e n t T y p e = " C o l u m n "   E l e m e n t I d = " 7 3 3 9 5 3 9 6 6 "   D a t a T y p e = " C o d e " > E x t e r n a l D o c u m e n t N o < / E x t e r n a l D o c u m e n t N o > - 
-         < E x t e r n a l D o c u m e n t N o _ L b l   E l e m e n t T y p e = " C o l u m n "   E l e m e n t I d = " 4 2 3 3 1 2 2 6 9 "   D a t a T y p e = " S t r i n g " > E x t e r n a l D o c u m e n t N o _ L b l < / E x t e r n a l D o c u m e n t N o _ L b l > - 
-         < F r o m _ L b l   E l e m e n t T y p e = " C o l u m n "   E l e m e n t I d = " 4 8 5 4 2 6 1 3 8 "   D a t a T y p e = " L a b e l " > F r o m _ L b l < / F r o m _ L b l > - 
-         < G l o b a l L o c a t i o n N u m b e r   E l e m e n t T y p e = " C o l u m n "   E l e m e n t I d = " 1 5 0 0 3 7 2 8 0 0 "   D a t a T y p e = " T e x t " > G l o b a l L o c a t i o n N u m b e r < / G l o b a l L o c a t i o n N u m b e r > - 
-         < G l o b a l L o c a t i o n N u m b e r _ L b l   E l e m e n t T y p e = " C o l u m n "   E l e m e n t I d = " 1 7 5 0 9 1 3 8 9 1 "   D a t a T y p e = " T e x t " > G l o b a l L o c a t i o n N u m b e r _ L b l < / G l o b a l L o c a t i o n N u m b e r _ L b l > - 
-         < H o m e P a g e _ H e a d e r _ L b l   E l e m e n t T y p e = " C o l u m n "   E l e m e n t I d = " 1 8 7 9 7 2 5 0 8 4 "   D a t a T y p e = " L a b e l " > H o m e P a g e _ H e a d e r _ L b l < / H o m e P a g e _ H e a d e r _ L b l > - 
-         < L e g a l E n t i t y T y p e   E l e m e n t T y p e = " C o l u m n "   E l e m e n t I d = " 2 0 5 1 8 7 3 5 6 3 "   D a t a T y p e = " T e x t " > L e g a l E n t i t y T y p e < / L e g a l E n t i t y T y p e > - 
-         < L e g a l E n t i t y T y p e _ L b l   E l e m e n t T y p e = " C o l u m n "   E l e m e n t I d = " 2 0 8 0 2 2 4 7 9 2 "   D a t a T y p e = " T e x t " > L e g a l E n t i t y T y p e _ L b l < / L e g a l E n t i t y T y p e _ L b l > - 
-         < P a c k a g e T r a c k i n g N o   E l e m e n t T y p e = " C o l u m n "   E l e m e n t I d = " 1 2 4 4 8 2 6 1 5 9 "   D a t a T y p e = " T e x t " > P a c k a g e T r a c k i n g N o < / P a c k a g e T r a c k i n g N o > - 
-         < P a c k a g e T r a c k i n g N o _ L b l   E l e m e n t T y p e = " C o l u m n "   E l e m e n t I d = " 2 1 9 3 5 6 7 5 6 "   D a t a T y p e = " S t r i n g " > P a c k a g e T r a c k i n g N o _ L b l < / P a c k a g e T r a c k i n g N o _ L b l > - 
-         < P a g e _ L b l   E l e m e n t T y p e = " C o l u m n "   E l e m e n t I d = " 6 8 0 6 4 8 0 9 1 "   D a t a T y p e = " L a b e l " > P a g e _ L b l < / P a g e _ L b l > - 
-         < P r i c e s I n c l u d i n g V A T   E l e m e n t T y p e = " C o l u m n "   E l e m e n t I d = " 5 1 8 8 1 7 1 6 7 "   D a t a T y p e = " B o o l e a n " > P r i c e s I n c l u d i n g V A T < / P r i c e s I n c l u d i n g V A T > - 
-         < P r i c e s I n c l u d i n g V A T Y e s N o   E l e m e n t T y p e = " C o l u m n "   E l e m e n t I d = " 1 4 1 1 1 4 7 5 9 9 "   D a t a T y p e = " S t r i n g " > P r i c e s I n c l u d i n g V A T Y e s N o < / P r i c e s I n c l u d i n g V A T Y e s N o > - 
-         < P r i c e s I n c l u d i n g V A T _ L b l   E l e m e n t T y p e = " C o l u m n "   E l e m e n t I d = " 1 3 7 7 9 7 9 4 4 4 "   D a t a T y p e = " S t r i n g " > P r i c e s I n c l u d i n g V A T _ L b l < / P r i c e s I n c l u d i n g V A T _ L b l > - 
-         < Q u e s t i o n s _ L b l   E l e m e n t T y p e = " C o l u m n "   E l e m e n t I d = " 2 0 7 0 8 9 0 0 1 9 "   D a t a T y p e = " L a b e l " > Q u e s t i o n s _ L b l < / Q u e s t i o n s _ L b l > - 
-         < R e t u r n O r d e r N o   E l e m e n t T y p e = " C o l u m n "   E l e m e n t I d = " 1 2 6 6 4 2 8 7 1 2 "   D a t a T y p e = " C o d e " > R e t u r n O r d e r N o < / R e t u r n O r d e r N o > - 
-         < R e t u r n O r d e r N o _ L b l   E l e m e n t T y p e = " C o l u m n "   E l e m e n t I d = " 1 1 6 3 3 8 1 0 1 "   D a t a T y p e = " S t r i n g " > R e t u r n O r d e r N o _ L b l < / R e t u r n O r d e r N o _ L b l > - 
-         < R e t u r n R e c e i p t _ L b l   E l e m e n t T y p e = " C o l u m n "   E l e m e n t I d = " 4 0 3 4 7 9 1 7 8 "   D a t a T y p e = " L a b e l " > R e t u r n R e c e i p t _ L b l < / R e t u r n R e c e i p t _ L b l > - 
-         < S a l e s P e r s o n B l a n k _ L b l   E l e m e n t T y p e = " C o l u m n "   E l e m e n t I d = " 6 5 4 6 2 4 6 0 1 "   D a t a T y p e = " T e x t " > S a l e s P e r s o n B l a n k _ L b l < / S a l e s P e r s o n B l a n k _ L b l > - 
-         < S a l e s P e r s o n N a m e   E l e m e n t T y p e = " C o l u m n "   E l e m e n t I d = " 8 7 1 4 9 2 9 8 3 "   D a t a T y p e = " T e x t " > S a l e s P e r s o n N a m e < / S a l e s P e r s o n N a m e > - 
-         < S a l e s P e r s o n _ L b l   E l e m e n t T y p e = " C o l u m n "   E l e m e n t I d = " 1 5 6 4 1 9 6 3 6 5 "   D a t a T y p e = " L a b e l " > S a l e s P e r s o n _ L b l < / S a l e s P e r s o n _ L b l > - 
-         < S e l l T o C o n t a c t E m a i l   E l e m e n t T y p e = " C o l u m n "   E l e m e n t I d = " 2 6 2 8 2 4 5 6 4 "   D a t a T y p e = " T e x t " > S e l l T o C o n t a c t E m a i l < / S e l l T o C o n t a c t E m a i l > - 
-         < S e l l T o C o n t a c t E m a i l L b l   E l e m e n t T y p e = " C o l u m n "   E l e m e n t I d = " 3 7 0 9 2 0 3 7 4 "   D a t a T y p e = " L a b e l " > S e l l T o C o n t a c t E m a i l L b l < / S e l l T o C o n t a c t E m a i l L b l > - 
-         < S e l l T o C o n t a c t M o b i l e P h o n e N o   E l e m e n t T y p e = " C o l u m n "   E l e m e n t I d = " 1 8 4 3 5 8 7 4 7 "   D a t a T y p e = " T e x t " > S e l l T o C o n t a c t M o b i l e P h o n e N o < / S e l l T o C o n t a c t M o b i l e P h o n e N o > - 
-         < S e l l T o C o n t a c t M o b i l e P h o n e N o L b l   E l e m e n t T y p e = " C o l u m n "   E l e m e n t I d = " 1 4 5 7 5 2 8 4 1 7 "   D a t a T y p e = " L a b e l " > S e l l T o C o n t a c t M o b i l e P h o n e N o L b l < / S e l l T o C o n t a c t M o b i l e P h o n e N o L b l > - 
-         < S e l l T o C o n t a c t P h o n e N o   E l e m e n t T y p e = " C o l u m n "   E l e m e n t I d = " 1 6 1 3 8 2 2 4 8 3 "   D a t a T y p e = " T e x t " > S e l l T o C o n t a c t P h o n e N o < / S e l l T o C o n t a c t P h o n e N o > - 
-         < S e l l T o C o n t a c t P h o n e N o L b l   E l e m e n t T y p e = " C o l u m n "   E l e m e n t I d = " 1 0 5 0 6 8 6 8 0 9 "   D a t a T y p e = " L a b e l " > S e l l T o C o n t a c t P h o n e N o L b l < / S e l l T o C o n t a c t P h o n e N o L b l > - 
-         < S e l l t o C u s t o m e r N o   E l e m e n t T y p e = " C o l u m n "   E l e m e n t I d = " 2 0 5 0 6 4 7 3 4 9 "   D a t a T y p e = " C o d e " > S e l l t o C u s t o m e r N o < / S e l l t o C u s t o m e r N o > - 
-         < S e l l t o C u s t o m e r N o _ L b l   E l e m e n t T y p e = " C o l u m n "   E l e m e n t I d = " 2 9 8 3 8 1 5 1 2 "   D a t a T y p e = " S t r i n g " > S e l l t o C u s t o m e r N o _ L b l < / S e l l t o C u s t o m e r N o _ L b l > - 
-         < S h i p m e n t D a t e   E l e m e n t T y p e = " C o l u m n "   E l e m e n t I d = " 9 3 1 1 1 1 4 6 5 "   D a t a T y p e = " S t r i n g " > S h i p m e n t D a t e < / S h i p m e n t D a t e > - 
-         < S h i p m e n t D a t e _ L b l   E l e m e n t T y p e = " C o l u m n "   E l e m e n t I d = " 6 1 4 4 0 0 3 6 4 "   D a t a T y p e = " S t r i n g " > S h i p m e n t D a t e _ L b l < / S h i p m e n t D a t e _ L b l > - 
-         < S h i p m e n t M e t h o d D e s c r i p t i o n   E l e m e n t T y p e = " C o l u m n "   E l e m e n t I d = " 2 0 5 9 4 0 3 2 6 0 "   D a t a T y p e = " T e x t " > S h i p m e n t M e t h o d D e s c r i p t i o n < / S h i p m e n t M e t h o d D e s c r i p t i o n > - 
-         < S h i p m e n t M e t h o d D e s c r i p t i o n _ L b l   E l e m e n t T y p e = " C o l u m n "   E l e m e n t I d = " 1 1 7 9 9 7 8 4 6 5 "   D a t a T y p e = " L a b e l " > S h i p m e n t M e t h o d D e s c r i p t i o n _ L b l < / S h i p m e n t M e t h o d D e s c r i p t i o n _ L b l > - 
-         < S h i p p i n g A g e n t C o d e   E l e m e n t T y p e = " C o l u m n "   E l e m e n t I d = " 1 6 7 0 1 5 5 2 6 9 "   D a t a T y p e = " C o d e " > S h i p p i n g A g e n t C o d e < / S h i p p i n g A g e n t C o d e > - 
-         < S h i p p i n g A g e n t C o d e _ L b l   E l e m e n t T y p e = " C o l u m n "   E l e m e n t I d = " 1 1 5 3 2 0 1 3 4 "   D a t a T y p e = " S t r i n g " > S h i p p i n g A g e n t C o d e _ L b l < / S h i p p i n g A g e n t C o d e _ L b l > - 
-         < S h i p T o A d d r e s s 1   E l e m e n t T y p e = " C o l u m n "   E l e m e n t I d = " 1 3 5 7 6 7 2 8 6 1 "   D a t a T y p e = " T e x t " > S h i p T o A d d r e s s 1 < / S h i p T o A d d r e s s 1 > - 
-         < S h i p T o A d d r e s s 2   E l e m e n t T y p e = " C o l u m n "   E l e m e n t I d = " 1 0 2 4 2 0 4 5 8 4 "   D a t a T y p e = " T e x t " > S h i p T o A d d r e s s 2 < / S h i p T o A d d r e s s 2 > - 
-         < S h i p T o A d d r e s s 3   E l e m e n t T y p e = " C o l u m n "   E l e m e n t I d = " 1 6 6 1 9 0 1 2 0 1 "   D a t a T y p e = " T e x t " > S h i p T o A d d r e s s 3 < / S h i p T o A d d r e s s 3 > - 
-         < S h i p T o A d d r e s s 4   E l e m e n t T y p e = " C o l u m n "   E l e m e n t I d = " 5 5 5 4 1 6 9 9 0 "   D a t a T y p e = " T e x t " > S h i p T o A d d r e s s 4 < / S h i p T o A d d r e s s 4 > - 
-         < S h i p T o A d d r e s s 5   E l e m e n t T y p e = " C o l u m n "   E l e m e n t I d = " 1 1 9 3 1 1 3 6 0 7 "   D a t a T y p e = " T e x t " > S h i p T o A d d r e s s 5 < / S h i p T o A d d r e s s 5 > - 
-         < S h i p T o A d d r e s s 6   E l e m e n t T y p e = " C o l u m n "   E l e m e n t I d = " 7 1 9 9 7 6 2 4 4 "   D a t a T y p e = " T e x t " > S h i p T o A d d r e s s 6 < / S h i p T o A d d r e s s 6 > - 
-         < S h i p T o A d d r e s s 7   E l e m e n t T y p e = " C o l u m n "   E l e m e n t I d = " 8 2 2 7 9 6 2 7 "   D a t a T y p e = " T e x t " > S h i p T o A d d r e s s 7 < / S h i p T o A d d r e s s 7 > - 
-         < S h i p T o A d d r e s s 8   E l e m e n t T y p e = " C o l u m n "   E l e m e n t I d = " 1 4 9 2 9 9 2 1 7 8 "   D a t a T y p e = " T e x t " > S h i p T o A d d r e s s 8 < / S h i p T o A d d r e s s 8 > - 
-         < S h i p T o A d d r e s s _ L b l   E l e m e n t T y p e = " C o l u m n "   E l e m e n t I d = " 1 6 5 0 5 0 5 0 1 7 "   D a t a T y p e = " L a b e l " > S h i p T o A d d r e s s _ L b l < / S h i p T o A d d r e s s _ L b l > - 
-         < S h i p T o P h o n e N o   E l e m e n t T y p e = " C o l u m n "   E l e m e n t I d = " 3 6 9 7 0 2 2 5 5 "   D a t a T y p e = " T e x t " > S h i p T o P h o n e N o < / S h i p T o P h o n e N o > - 
-         < S h o w C u s t A d d r e s s   E l e m e n t T y p e = " C o l u m n "   E l e m e n t I d = " 7 6 1 8 0 5 5 6 7 "   D a t a T y p e = " B o o l e a n " > S h o w C u s t A d d r e s s < / S h o w C u s t A d d r e s s > - 
-         < S u b t o t a l _ L b l   E l e m e n t T y p e = " C o l u m n "   E l e m e n t I d = " 1 9 6 7 7 9 5 1 4 2 "   D a t a T y p e = " L a b e l " > S u b t o t a l _ L b l < / S u b t o t a l _ L b l > - 
-         < T h a n k s _ L b l   E l e m e n t T y p e = " C o l u m n "   E l e m e n t I d = " 2 1 0 3 3 0 5 5 2 5 "   D a t a T y p e = " L a b e l " > T h a n k s _ L b l < / T h a n k s _ L b l > - 
-         < T o t a l _ L b l   E l e m e n t T y p e = " C o l u m n "   E l e m e n t I d = " 1 2 1 0 1 0 0 8 7 8 "   D a t a T y p e = " L a b e l " > T o t a l _ L b l < / T o t a l _ L b l > - 
-         < V A T R e g i s t r a t i o n N o   E l e m e n t T y p e = " C o l u m n "   E l e m e n t I d = " 1 8 8 9 1 9 5 4 0 2 "   D a t a T y p e = " T e x t " > V A T R e g i s t r a t i o n N o < / V A T R e g i s t r a t i o n N o > - 
-         < V A T R e g i s t r a t i o n N o _ L b l   E l e m e n t T y p e = " C o l u m n "   E l e m e n t I d = " 1 4 2 4 6 1 6 0 8 5 "   D a t a T y p e = " T e x t " > V A T R e g i s t r a t i o n N o _ L b l < / V A T R e g i s t r a t i o n N o _ L b l > - 
-         < Y o u r D o c u m e n t T i t l e _ L b l   E l e m e n t T y p e = " C o l u m n "   E l e m e n t I d = " 1 8 2 1 7 1 6 9 3 4 "   D a t a T y p e = " L a b e l " > Y o u r D o c u m e n t T i t l e _ L b l < / Y o u r D o c u m e n t T i t l e _ L b l > - 
-         < Y o u r R e f e r e n c e   E l e m e n t T y p e = " C o l u m n "   E l e m e n t I d = " 1 1 0 3 9 9 5 1 "   D a t a T y p e = " T e x t " > Y o u r R e f e r e n c e < / Y o u r R e f e r e n c e > - 
-         < Y o u r R e f e r e n c e _ L b l   E l e m e n t T y p e = " C o l u m n "   E l e m e n t I d = " 4 6 5 4 7 7 4 2 6 "   D a t a T y p e = " S t r i n g " > Y o u r R e f e r e n c e _ L b l < / Y o u r R e f e r e n c e _ L b l > - 
-         < L i n e   E l e m e n t T y p e = " D a t a I t e m "   E l e m e n t I d = " 4 1 1 9 7 6 1 3 3 " > - 
-             < D e s c r i p t i o n _ L i n e   E l e m e n t T y p e = " C o l u m n "   E l e m e n t I d = " 1 4 0 6 8 2 2 3 1 0 "   D a t a T y p e = " T e x t " > D e s c r i p t i o n _ L i n e < / D e s c r i p t i o n _ L i n e > - 
-             < D e s c r i p t i o n _ L i n e _ L b l   E l e m e n t T y p e = " C o l u m n "   E l e m e n t I d = " 2 1 1 8 9 5 1 4 9 5 "   D a t a T y p e = " S t r i n g " > D e s c r i p t i o n _ L i n e _ L b l < / D e s c r i p t i o n _ L i n e _ L b l > - 
-             < I t e m N o _ L i n e   E l e m e n t T y p e = " C o l u m n "   E l e m e n t I d = " 1 9 1 0 2 9 6 2 8 8 "   D a t a T y p e = " C o d e " > I t e m N o _ L i n e < / I t e m N o _ L i n e > - 
-             < I t e m N o _ L i n e _ L b l   E l e m e n t T y p e = " C o l u m n "   E l e m e n t I d = " 1 3 4 0 0 7 9 6 1 3 "   D a t a T y p e = " S t r i n g " > I t e m N o _ L i n e _ L b l < / I t e m N o _ L i n e _ L b l > - 
-             < I t e m R e f e r e n c e N o _ L i n e   E l e m e n t T y p e = " C o l u m n "   E l e m e n t I d = " 9 2 7 2 3 5 7 "   D a t a T y p e = " C o d e " > I t e m R e f e r e n c e N o _ L i n e < / I t e m R e f e r e n c e N o _ L i n e > - 
-             < I t e m R e f e r e n c e N o _ L i n e _ L b l   E l e m e n t T y p e = " C o l u m n "   E l e m e n t I d = " 1 9 8 0 6 3 1 1 3 0 "   D a t a T y p e = " S t r i n g " > I t e m R e f e r e n c e N o _ L i n e _ L b l < / I t e m R e f e r e n c e N o _ L i n e _ L b l > - 
-             < L i n e N o _ L i n e   E l e m e n t T y p e = " C o l u m n "   E l e m e n t I d = " 6 9 8 9 8 5 9 7 9 "   D a t a T y p e = " I n t e g e r " > L i n e N o _ L i n e < / L i n e N o _ L i n e > - 
-             < Q t y _ L b l   E l e m e n t T y p e = " C o l u m n "   E l e m e n t I d = " 2 6 3 6 7 3 7 6 4 "   D a t a T y p e = " L a b e l " > Q t y _ L b l < / Q t y _ L b l > - 
-             < Q u a n t i t y _ L i n e   E l e m e n t T y p e = " C o l u m n "   E l e m e n t I d = " 1 0 6 8 5 4 3 5 3 7 "   D a t a T y p e = " T e x t " > Q u a n t i t y _ L i n e < / Q u a n t i t y _ L i n e > - 
-             < Q u a n t i t y _ L i n e _ L b l   E l e m e n t T y p e = " C o l u m n "   E l e m e n t I d = " 2 0 3 4 5 0 6 8 0 2 "   D a t a T y p e = " S t r i n g " > Q u a n t i t y _ L i n e _ L b l < / Q u a n t i t y _ L i n e _ L b l > - 
-             < S h i p m e n t D a t e _ L i n e   E l e m e n t T y p e = " C o l u m n "   E l e m e n t I d = " 1 6 7 3 3 7 5 4 1 6 "   D a t a T y p e = " S t r i n g " > S h i p m e n t D a t e _ L i n e < / S h i p m e n t D a t e _ L i n e > - 
-             < S h i p m e n t D a t e _ L i n e _ L b l   E l e m e n t T y p e = " C o l u m n "   E l e m e n t I d = " 8 5 3 2 2 4 3 6 3 "   D a t a T y p e = " L a b e l " > S h i p m e n t D a t e _ L i n e _ L b l < / S h i p m e n t D a t e _ L i n e _ L b l > - 
-             < T y p e _ L i n e   E l e m e n t T y p e = " C o l u m n "   E l e m e n t I d = " 2 7 2 8 0 4 9 2 4 "   D a t a T y p e = " S t r i n g " > T y p e _ L i n e < / T y p e _ L i n e > - 
-             < U n i t O f M e a s u r e   E l e m e n t T y p e = " C o l u m n "   E l e m e n t I d = " 1 8 0 8 2 2 8 0 1 8 "   D a t a T y p e = " T e x t " > U n i t O f M e a s u r e < / U n i t O f M e a s u r e > - 
-             < U n i t O f M e a s u r e _ L b l   E l e m e n t T y p e = " C o l u m n "   E l e m e n t I d = " 9 8 1 9 5 1 2 4 9 "   D a t a T y p e = " S t r i n g " > U n i t O f M e a s u r e _ L b l < / U n i t O f M e a s u r e _ L b l > - 
-             < U n i t _ L b l   E l e m e n t T y p e = " C o l u m n "   E l e m e n t I d = " 8 1 4 3 6 4 3 1 8 "   D a t a T y p e = " L a b e l " > U n i t _ L b l < / U n i t _ L b l > +     < H e a d e r > + 
+         < B i l l e d T o _ L b l > B i l l e d T o _ L b l < / B i l l e d T o _ L b l > + 
+         < B i l l t o A d d r e s s C a p t i o n > B i l l t o A d d r e s s C a p t i o n < / B i l l t o A d d r e s s C a p t i o n > + 
+         < B i l l T o C o n t a c t E m a i l > B i l l T o C o n t a c t E m a i l < / B i l l T o C o n t a c t E m a i l > + 
+         < B i l l T o C o n t a c t E m a i l L b l > B i l l T o C o n t a c t E m a i l L b l < / B i l l T o C o n t a c t E m a i l L b l > + 
+         < B i l l T o C o n t a c t M o b i l e P h o n e N o > B i l l T o C o n t a c t M o b i l e P h o n e N o < / B i l l T o C o n t a c t M o b i l e P h o n e N o > + 
+         < B i l l T o C o n t a c t M o b i l e P h o n e N o L b l > B i l l T o C o n t a c t M o b i l e P h o n e N o L b l < / B i l l T o C o n t a c t M o b i l e P h o n e N o L b l > + 
+         < B i l l T o C o n t a c t P h o n e N o > B i l l T o C o n t a c t P h o n e N o < / B i l l T o C o n t a c t P h o n e N o > + 
+         < B i l l T o C o n t a c t P h o n e N o L b l > B i l l T o C o n t a c t P h o n e N o L b l < / B i l l T o C o n t a c t P h o n e N o L b l > + 
+         < B i l l t o C u s t o m e r N o _ L b l > B i l l t o C u s t o m e r N o _ L b l < / B i l l t o C u s t o m e r N o _ L b l > + 
+         < B i l l t o C u s t u m e r N o > B i l l t o C u s t u m e r N o < / B i l l t o C u s t u m e r N o > + 
+         < C o m p a n y A d d r e s s 1 > C o m p a n y A d d r e s s 1 < / C o m p a n y A d d r e s s 1 > + 
+         < C o m p a n y A d d r e s s 2 > C o m p a n y A d d r e s s 2 < / C o m p a n y A d d r e s s 2 > + 
+         < C o m p a n y A d d r e s s 3 > C o m p a n y A d d r e s s 3 < / C o m p a n y A d d r e s s 3 > + 
+         < C o m p a n y A d d r e s s 4 > C o m p a n y A d d r e s s 4 < / C o m p a n y A d d r e s s 4 > + 
+         < C o m p a n y A d d r e s s 5 > C o m p a n y A d d r e s s 5 < / C o m p a n y A d d r e s s 5 > + 
+         < C o m p a n y A d d r e s s 6 > C o m p a n y A d d r e s s 6 < / C o m p a n y A d d r e s s 6 > + 
+         < C o m p a n y A d d r e s s 7 > C o m p a n y A d d r e s s 7 < / C o m p a n y A d d r e s s 7 > + 
+         < C o m p a n y A d d r e s s 8 > C o m p a n y A d d r e s s 8 < / C o m p a n y A d d r e s s 8 > + 
+         < C o m p a n y B a n k A c c o u n t N o > C o m p a n y B a n k A c c o u n t N o < / C o m p a n y B a n k A c c o u n t N o > + 
+         < C o m p a n y B a n k A c c o u n t N o _ L b l > C o m p a n y B a n k A c c o u n t N o _ L b l < / C o m p a n y B a n k A c c o u n t N o _ L b l > + 
+         < C o m p a n y B a n k B r a n c h N o > C o m p a n y B a n k B r a n c h N o < / C o m p a n y B a n k B r a n c h N o > + 
+         < C o m p a n y B a n k B r a n c h N o _ L b l > C o m p a n y B a n k B r a n c h N o _ L b l < / C o m p a n y B a n k B r a n c h N o _ L b l > + 
+         < C o m p a n y B a n k N a m e > C o m p a n y B a n k N a m e < / C o m p a n y B a n k N a m e > + 
+         < C o m p a n y B a n k N a m e _ L b l > C o m p a n y B a n k N a m e _ L b l < / C o m p a n y B a n k N a m e _ L b l > + 
+         < C o m p a n y C u s t o m G i r o > C o m p a n y C u s t o m G i r o < / C o m p a n y C u s t o m G i r o > + 
+         < C o m p a n y C u s t o m G i r o _ L b l > C o m p a n y C u s t o m G i r o _ L b l < / C o m p a n y C u s t o m G i r o _ L b l > + 
+         < C o m p a n y E M a i l > C o m p a n y E M a i l < / C o m p a n y E M a i l > + 
+         < C o m p a n y G i r o N o > C o m p a n y G i r o N o < / C o m p a n y G i r o N o > + 
+         < C o m p a n y G i r o N o _ L b l > C o m p a n y G i r o N o _ L b l < / C o m p a n y G i r o N o _ L b l > + 
+         < C o m p a n y H o m e P a g e > C o m p a n y H o m e P a g e < / C o m p a n y H o m e P a g e > + 
+         < C o m p a n y I B A N > C o m p a n y I B A N < / C o m p a n y I B A N > + 
+         < C o m p a n y I B A N _ L b l > C o m p a n y I B A N _ L b l < / C o m p a n y I B A N _ L b l > + 
+         < C o m p a n y L e g a l O f f i c e > C o m p a n y L e g a l O f f i c e < / C o m p a n y L e g a l O f f i c e > + 
+         < C o m p a n y L e g a l O f f i c e _ L b l > C o m p a n y L e g a l O f f i c e _ L b l < / C o m p a n y L e g a l O f f i c e _ L b l > + 
+         < C o m p a n y L e g a l S t a t e m e n t > C o m p a n y L e g a l S t a t e m e n t < / C o m p a n y L e g a l S t a t e m e n t > + 
+         < C o m p a n y L o g o P o s i t i o n > C o m p a n y L o g o P o s i t i o n < / C o m p a n y L o g o P o s i t i o n > + 
+         < C o m p a n y P h o n e N o > C o m p a n y P h o n e N o < / C o m p a n y P h o n e N o > + 
+         < C o m p a n y P h o n e N o _ L b l > C o m p a n y P h o n e N o _ L b l < / C o m p a n y P h o n e N o _ L b l > + 
+         < C o m p a n y P i c t u r e / > + 
+         < C o m p a n y R e g i s t r a t i o n N u m b e r > C o m p a n y R e g i s t r a t i o n N u m b e r < / C o m p a n y R e g i s t r a t i o n N u m b e r > + 
+         < C o m p a n y R e g i s t r a t i o n N u m b e r _ L b l > C o m p a n y R e g i s t r a t i o n N u m b e r _ L b l < / C o m p a n y R e g i s t r a t i o n N u m b e r _ L b l > + 
+         < C o m p a n y S W I F T > C o m p a n y S W I F T < / C o m p a n y S W I F T > + 
+         < C o m p a n y S W I F T _ L b l > C o m p a n y S W I F T _ L b l < / C o m p a n y S W I F T _ L b l > + 
+         < C o m p a n y V A T R e g i s t r a t i o n N o > C o m p a n y V A T R e g i s t r a t i o n N o < / C o m p a n y V A T R e g i s t r a t i o n N o > + 
+         < C o m p a n y V A T R e g i s t r a t i o n N o _ L b l > C o m p a n y V A T R e g i s t r a t i o n N o _ L b l < / C o m p a n y V A T R e g i s t r a t i o n N o _ L b l > + 
+         < C o m p a n y V A T R e g N o > C o m p a n y V A T R e g N o < / C o m p a n y V A T R e g N o > + 
+         < C o m p a n y V A T R e g N o _ L b l > C o m p a n y V A T R e g N o _ L b l < / C o m p a n y V A T R e g N o _ L b l > + 
+         < C o n t a c t _ L b l > C o n t a c t _ L b l < / C o n t a c t _ L b l > + 
+         < C o p y _ L b l > C o p y _ L b l < / C o p y _ L b l > + 
+         < C u s t o m e r A d d r e s s 1 > C u s t o m e r A d d r e s s 1 < / C u s t o m e r A d d r e s s 1 > + 
+         < C u s t o m e r A d d r e s s 2 > C u s t o m e r A d d r e s s 2 < / C u s t o m e r A d d r e s s 2 > + 
+         < C u s t o m e r A d d r e s s 3 > C u s t o m e r A d d r e s s 3 < / C u s t o m e r A d d r e s s 3 > + 
+         < C u s t o m e r A d d r e s s 4 > C u s t o m e r A d d r e s s 4 < / C u s t o m e r A d d r e s s 4 > + 
+         < C u s t o m e r A d d r e s s 5 > C u s t o m e r A d d r e s s 5 < / C u s t o m e r A d d r e s s 5 > + 
+         < C u s t o m e r A d d r e s s 6 > C u s t o m e r A d d r e s s 6 < / C u s t o m e r A d d r e s s 6 > + 
+         < C u s t o m e r A d d r e s s 7 > C u s t o m e r A d d r e s s 7 < / C u s t o m e r A d d r e s s 7 > + 
+         < C u s t o m e r A d d r e s s 8 > C u s t o m e r A d d r e s s 8 < / C u s t o m e r A d d r e s s 8 > + 
+         < C u s t o m e r P o s t a l B a r C o d e > C u s t o m e r P o s t a l B a r C o d e < / C u s t o m e r P o s t a l B a r C o d e > + 
+         < D o c u m e n t D a t e > D o c u m e n t D a t e < / D o c u m e n t D a t e > + 
+         < D o c u m e n t D a t e _ L b l > D o c u m e n t D a t e _ L b l < / D o c u m e n t D a t e _ L b l > + 
+         < D o c u m e n t N o > D o c u m e n t N o < / D o c u m e n t N o > + 
+         < D o c u m e n t N o _ L b l > D o c u m e n t N o _ L b l < / D o c u m e n t N o _ L b l > + 
+         < D o c u m e n t T i t l e _ L b l > D o c u m e n t T i t l e _ L b l < / D o c u m e n t T i t l e _ L b l > + 
+         < D u e D a t e > D u e D a t e < / D u e D a t e > + 
+         < D u e D a t e _ L b l > D u e D a t e _ L b l < / D u e D a t e _ L b l > + 
+         < E M a i l _ H e a d e r _ L b l > E M a i l _ H e a d e r _ L b l < / E M a i l _ H e a d e r _ L b l > + 
+         < E x t e r n a l D o c u m e n t N o > E x t e r n a l D o c u m e n t N o < / E x t e r n a l D o c u m e n t N o > + 
+         < E x t e r n a l D o c u m e n t N o _ L b l > E x t e r n a l D o c u m e n t N o _ L b l < / E x t e r n a l D o c u m e n t N o _ L b l > + 
+         < F r o m _ L b l > F r o m _ L b l < / F r o m _ L b l > + 
+         < G l o b a l L o c a t i o n N u m b e r > G l o b a l L o c a t i o n N u m b e r < / G l o b a l L o c a t i o n N u m b e r > + 
+         < G l o b a l L o c a t i o n N u m b e r _ L b l > G l o b a l L o c a t i o n N u m b e r _ L b l < / G l o b a l L o c a t i o n N u m b e r _ L b l > + 
+         < H o m e P a g e _ H e a d e r _ L b l > H o m e P a g e _ H e a d e r _ L b l < / H o m e P a g e _ H e a d e r _ L b l > + 
+         < L e g a l E n t i t y T y p e > L e g a l E n t i t y T y p e < / L e g a l E n t i t y T y p e > + 
+         < L e g a l E n t i t y T y p e _ L b l > L e g a l E n t i t y T y p e _ L b l < / L e g a l E n t i t y T y p e _ L b l > + 
+         < P a c k a g e T r a c k i n g N o > P a c k a g e T r a c k i n g N o < / P a c k a g e T r a c k i n g N o > + 
+         < P a c k a g e T r a c k i n g N o _ L b l > P a c k a g e T r a c k i n g N o _ L b l < / P a c k a g e T r a c k i n g N o _ L b l > + 
+         < P a g e _ L b l > P a g e _ L b l < / P a g e _ L b l > + 
+         < P r i c e s I n c l u d i n g V A T > P r i c e s I n c l u d i n g V A T < / P r i c e s I n c l u d i n g V A T > + 
+         < P r i c e s I n c l u d i n g V A T Y e s N o > P r i c e s I n c l u d i n g V A T Y e s N o < / P r i c e s I n c l u d i n g V A T Y e s N o > + 
+         < P r i c e s I n c l u d i n g V A T _ L b l > P r i c e s I n c l u d i n g V A T _ L b l < / P r i c e s I n c l u d i n g V A T _ L b l > + 
+         < Q u e s t i o n s _ L b l > Q u e s t i o n s _ L b l < / Q u e s t i o n s _ L b l > + 
+         < R e t u r n O r d e r N o > R e t u r n O r d e r N o < / R e t u r n O r d e r N o > + 
+         < R e t u r n O r d e r N o _ L b l > R e t u r n O r d e r N o _ L b l < / R e t u r n O r d e r N o _ L b l > + 
+         < R e t u r n R e c e i p t _ L b l > R e t u r n R e c e i p t _ L b l < / R e t u r n R e c e i p t _ L b l > + 
+         < S a l e s P e r s o n B l a n k _ L b l > S a l e s P e r s o n B l a n k _ L b l < / S a l e s P e r s o n B l a n k _ L b l > + 
+         < S a l e s P e r s o n N a m e > S a l e s P e r s o n N a m e < / S a l e s P e r s o n N a m e > + 
+         < S a l e s P e r s o n _ L b l > S a l e s P e r s o n _ L b l < / S a l e s P e r s o n _ L b l > + 
+         < S e l l T o C o n t a c t E m a i l > S e l l T o C o n t a c t E m a i l < / S e l l T o C o n t a c t E m a i l > + 
+         < S e l l T o C o n t a c t E m a i l L b l > S e l l T o C o n t a c t E m a i l L b l < / S e l l T o C o n t a c t E m a i l L b l > + 
+         < S e l l T o C o n t a c t M o b i l e P h o n e N o > S e l l T o C o n t a c t M o b i l e P h o n e N o < / S e l l T o C o n t a c t M o b i l e P h o n e N o > + 
+         < S e l l T o C o n t a c t M o b i l e P h o n e N o L b l > S e l l T o C o n t a c t M o b i l e P h o n e N o L b l < / S e l l T o C o n t a c t M o b i l e P h o n e N o L b l > + 
+         < S e l l T o C o n t a c t P h o n e N o > S e l l T o C o n t a c t P h o n e N o < / S e l l T o C o n t a c t P h o n e N o > + 
+         < S e l l T o C o n t a c t P h o n e N o L b l > S e l l T o C o n t a c t P h o n e N o L b l < / S e l l T o C o n t a c t P h o n e N o L b l > + 
+         < S e l l t o C u s t o m e r N o > S e l l t o C u s t o m e r N o < / S e l l t o C u s t o m e r N o > + 
+         < S e l l t o C u s t o m e r N o _ L b l > S e l l t o C u s t o m e r N o _ L b l < / S e l l t o C u s t o m e r N o _ L b l > + 
+         < S h i p m e n t D a t e > S h i p m e n t D a t e < / S h i p m e n t D a t e > + 
+         < S h i p m e n t D a t e _ L b l > S h i p m e n t D a t e _ L b l < / S h i p m e n t D a t e _ L b l > + 
+         < S h i p m e n t M e t h o d D e s c r i p t i o n > S h i p m e n t M e t h o d D e s c r i p t i o n < / S h i p m e n t M e t h o d D e s c r i p t i o n > + 
+         < S h i p m e n t M e t h o d D e s c r i p t i o n _ L b l > S h i p m e n t M e t h o d D e s c r i p t i o n _ L b l < / S h i p m e n t M e t h o d D e s c r i p t i o n _ L b l > + 
+         < S h i p p i n g A g e n t C o d e > S h i p p i n g A g e n t C o d e < / S h i p p i n g A g e n t C o d e > + 
+         < S h i p p i n g A g e n t C o d e _ L b l > S h i p p i n g A g e n t C o d e _ L b l < / S h i p p i n g A g e n t C o d e _ L b l > + 
+         < S h i p T o A d d r e s s 1 > S h i p T o A d d r e s s 1 < / S h i p T o A d d r e s s 1 > + 
+         < S h i p T o A d d r e s s 2 > S h i p T o A d d r e s s 2 < / S h i p T o A d d r e s s 2 > + 
+         < S h i p T o A d d r e s s 3 > S h i p T o A d d r e s s 3 < / S h i p T o A d d r e s s 3 > + 
+         < S h i p T o A d d r e s s 4 > S h i p T o A d d r e s s 4 < / S h i p T o A d d r e s s 4 > + 
+         < S h i p T o A d d r e s s 5 > S h i p T o A d d r e s s 5 < / S h i p T o A d d r e s s 5 > + 
+         < S h i p T o A d d r e s s 6 > S h i p T o A d d r e s s 6 < / S h i p T o A d d r e s s 6 > + 
+         < S h i p T o A d d r e s s 7 > S h i p T o A d d r e s s 7 < / S h i p T o A d d r e s s 7 > + 
+         < S h i p T o A d d r e s s 8 > S h i p T o A d d r e s s 8 < / S h i p T o A d d r e s s 8 > + 
+         < S h i p T o A d d r e s s _ L b l > S h i p T o A d d r e s s _ L b l < / S h i p T o A d d r e s s _ L b l > + 
+         < S h i p T o P h o n e N o > S h i p T o P h o n e N o < / S h i p T o P h o n e N o > + 
+         < S h o w C u s t A d d r e s s > S h o w C u s t A d d r e s s < / S h o w C u s t A d d r e s s > + 
+         < S u b t o t a l _ L b l > S u b t o t a l _ L b l < / S u b t o t a l _ L b l > + 
+         < T h a n k s _ L b l > T h a n k s _ L b l < / T h a n k s _ L b l > + 
+         < T o t a l _ L b l > T o t a l _ L b l < / T o t a l _ L b l > + 
+         < V A T R e g i s t r a t i o n N o > V A T R e g i s t r a t i o n N o < / V A T R e g i s t r a t i o n N o > + 
+         < V A T R e g i s t r a t i o n N o _ L b l > V A T R e g i s t r a t i o n N o _ L b l < / V A T R e g i s t r a t i o n N o _ L b l > + 
+         < Y o u r D o c u m e n t T i t l e _ L b l > Y o u r D o c u m e n t T i t l e _ L b l < / Y o u r D o c u m e n t T i t l e _ L b l > + 
+         < Y o u r R e f e r e n c e > Y o u r R e f e r e n c e < / Y o u r R e f e r e n c e > + 
+         < Y o u r R e f e r e n c e _ L b l > Y o u r R e f e r e n c e _ L b l < / Y o u r R e f e r e n c e _ L b l > + 
+         < L i n e > + 
+             < D e s c r i p t i o n _ L i n e > D e s c r i p t i o n _ L i n e < / D e s c r i p t i o n _ L i n e > + 
+             < D e s c r i p t i o n _ L i n e _ L b l > D e s c r i p t i o n _ L i n e _ L b l < / D e s c r i p t i o n _ L i n e _ L b l > + 
+             < I t e m N o _ L i n e > I t e m N o _ L i n e < / I t e m N o _ L i n e > + 
+             < I t e m N o _ L i n e _ L b l > I t e m N o _ L i n e _ L b l < / I t e m N o _ L i n e _ L b l > + 
+             < I t e m R e f e r e n c e N o _ L i n e > I t e m R e f e r e n c e N o _ L i n e < / I t e m R e f e r e n c e N o _ L i n e > + 
+             < I t e m R e f e r e n c e N o _ L i n e _ L b l > I t e m R e f e r e n c e N o _ L i n e _ L b l < / I t e m R e f e r e n c e N o _ L i n e _ L b l > + 
+             < L i n e N o _ L i n e > L i n e N o _ L i n e < / L i n e N o _ L i n e > + 
+             < Q t y _ L b l > Q t y _ L b l < / Q t y _ L b l > + 
+             < Q u a n t i t y _ L i n e > Q u a n t i t y _ L i n e < / Q u a n t i t y _ L i n e > + 
+             < Q u a n t i t y _ L i n e _ L b l > Q u a n t i t y _ L i n e _ L b l < / Q u a n t i t y _ L i n e _ L b l > + 
+             < S h i p m e n t D a t e _ L i n e > S h i p m e n t D a t e _ L i n e < / S h i p m e n t D a t e _ L i n e > + 
+             < S h i p m e n t D a t e _ L i n e _ L b l > S h i p m e n t D a t e _ L i n e _ L b l < / S h i p m e n t D a t e _ L i n e _ L b l > + 
+             < T y p e _ L i n e > T y p e _ L i n e < / T y p e _ L i n e > + 
+             < U n i t O f M e a s u r e > U n i t O f M e a s u r e < / U n i t O f M e a s u r e > + 
+             < U n i t O f M e a s u r e _ L b l > U n i t O f M e a s u r e _ L b l < / U n i t O f M e a s u r e _ L b l > + 
+             < U n i t _ L b l > U n i t _ L b l < / U n i t _ L b l >   
          < / L i n e >   
-         < L e f t H e a d e r   E l e m e n t T y p e = " D a t a I t e m "   E l e m e n t I d = " 7 3 4 6 8 0 8 3 3 " > - 
-             < L e f t H e a d e r N a m e   E l e m e n t T y p e = " C o l u m n "   E l e m e n t I d = " 4 3 7 4 2 2 1 8 2 "   D a t a T y p e = " T e x t " > L e f t H e a d e r N a m e < / L e f t H e a d e r N a m e > - 
-             < L e f t H e a d e r V a l u e   E l e m e n t T y p e = " C o l u m n "   E l e m e n t I d = " 2 4 2 1 2 6 3 1 0 "   D a t a T y p e = " T e x t " > L e f t H e a d e r V a l u e < / L e f t H e a d e r V a l u e > +         < L e f t H e a d e r > + 
+             < L e f t H e a d e r N a m e > L e f t H e a d e r N a m e < / L e f t H e a d e r N a m e > + 
+             < L e f t H e a d e r V a l u e > L e f t H e a d e r V a l u e < / L e f t H e a d e r V a l u e >   
          < / L e f t H e a d e r >   
-         < R i g h t H e a d e r   E l e m e n t T y p e = " D a t a I t e m "   E l e m e n t I d = " 2 5 4 5 4 4 9 4 6 " > - 
-             < R i g h t H e a d e r N a m e   E l e m e n t T y p e = " C o l u m n "   E l e m e n t I d = " 8 9 8 2 8 7 5 7 "   D a t a T y p e = " T e x t " > R i g h t H e a d e r N a m e < / R i g h t H e a d e r N a m e > - 
-             < R i g h t H e a d e r V a l u e   E l e m e n t T y p e = " C o l u m n "   E l e m e n t I d = " 7 0 6 9 3 8 5 5 9 "   D a t a T y p e = " T e x t " > R i g h t H e a d e r V a l u e < / R i g h t H e a d e r V a l u e > +         < R i g h t H e a d e r > + 
+             < R i g h t H e a d e r N a m e > R i g h t H e a d e r N a m e < / R i g h t H e a d e r N a m e > + 
+             < R i g h t H e a d e r V a l u e > R i g h t H e a d e r V a l u e < / R i g h t H e a d e r V a l u e >   
          < / R i g h t H e a d e r >   
-         < L e t t e r T e x t   E l e m e n t T y p e = " D a t a I t e m "   E l e m e n t I d = " 1 5 1 0 3 5 3 8 3 4 " > - 
-             < B o d y T e x t   E l e m e n t T y p e = " C o l u m n "   E l e m e n t I d = " 1 4 9 7 5 9 8 0 8 "   D a t a T y p e = " L a b e l " > B o d y T e x t < / B o d y T e x t > - 
-             < C l o s i n g T e x t   E l e m e n t T y p e = " C o l u m n "   E l e m e n t I d = " 5 1 2 1 3 5 9 0 9 "   D a t a T y p e = " L a b e l " > C l o s i n g T e x t < / C l o s i n g T e x t > - 
-             < G r e e t i n g T e x t   E l e m e n t T y p e = " C o l u m n "   E l e m e n t I d = " 1 1 7 5 2 7 9 2 8 9 "   D a t a T y p e = " L a b e l " > G r e e t i n g T e x t < / G r e e t i n g T e x t > +         < L e t t e r T e x t > + 
+             < B o d y T e x t > B o d y T e x t < / B o d y T e x t > + 
+             < C l o s i n g T e x t > C l o s i n g T e x t < / C l o s i n g T e x t > + 
+             < G r e e t i n g T e x t > G r e e t i n g T e x t < / G r e e t i n g T e x t >   
          < / L e t t e r T e x t >   
      < / H e a d e r >   
  < / N a v W o r d R e p o r t X m l P a r t > 
+</file>
+
+<file path=customXml/itemProps1.xml><?xml version="1.0" encoding="utf-8"?>
+<ds:datastoreItem xmlns:ds="http://schemas.openxmlformats.org/officeDocument/2006/customXml" ds:itemID="{78A64D1E-64EF-40E4-9F12-41CE1671F7F9}">
+  <ds:schemaRefs>
+    <ds:schemaRef ds:uri="urn:microsoft-dynamics-businesscentral/internal/extended/reports/Standard_Sales_Return_Rcpt/1309/"/>
+  </ds:schemaRefs>
+</ds:datastoreItem>
+</file>
+
+<file path=customXml/itemProps2.xml><?xml version="1.0" encoding="utf-8"?>
+<ds:datastoreItem xmlns:ds="http://schemas.openxmlformats.org/officeDocument/2006/customXml" ds:itemID="{ED582AB7-D2FD-40DB-AA33-A9E5E0B8B111}">
+  <ds:schemaRefs>
+    <ds:schemaRef ds:uri="urn:microsoft-dynamics-nav/reports/Standard_Sales_Return_Rcpt/1309/"/>
+  </ds:schemaRefs>
+</ds:datastoreItem>
+</file>
+
+<file path=docMetadata/LabelInfo.xml><?xml version="1.0" encoding="utf-8"?>
+<clbl:labelList xmlns:clbl="http://schemas.microsoft.com/office/2020/mipLabelMetadata">
+  <clbl:label id="{f42aa342-8706-4288-bd11-ebb85995028c}" enabled="1" method="Standard" siteId="{72f988bf-86f1-41af-91ab-2d7cd011db47}" contentBits="0" removed="0"/>
+</clbl:labelList>
 </file>
</xml_diff>